<commit_message>
docs: record the Day 3 re-measurement and refresh the report/PPT drafts
- Dual first query (gold 20 questions, OpenAI, off vs on, 1 run each): Scene
  Success@1 16/18 both, same two misses, search calls 80 -> 98, LLM calls and
  tokens unchanged. The flag stays off (ADR-0011).
- Chunk length (A/B only, Korean first query): 10/5 and 20/10 tie at 11/18,
  30/15 = 9, 40/20 = 5, so 20s/10s stays the default (ADR-0006).
- Report: fill the 3.3 latency/tool-call table, add the re-measurement to 3.4,
  appendix D (per-question results only) and E (chunk comparison), rewrite 5.1
  from the author's experience, move the 2.9 screenshots into appendix A.
- PPT: update slides 3 and 8 and backup B3 with the measured results.
- Generator scripts now resolve paths relative to docs/exec.

Co-Authored-By: Claude Sonnet 5.5 <noreply@anthropic.com>
</commit_message>
<xml_diff>
--- a/docs/exec/G078_문희주_최종보고서_초안.docx
+++ b/docs/exec/G078_문희주_최종보고서_초안.docx
@@ -363,7 +363,7 @@
           <w:color w:val="5A5A5A"/>
           <w:sz w:val="18"/>
         </w:rPr>
-        <w:t>측정한 값과 측정하지 못한 값을 구분해서 적었다. 노란 표시는 제출 전에 채울 부분이다.</w:t>
+        <w:t>측정한 값과 측정하지 못한 값을 구분해서 적었다.</w:t>
       </w:r>
     </w:p>
     <w:p>
@@ -2216,7 +2216,7 @@
           <w:color w:val="3C3C3C"/>
           <w:sz w:val="18"/>
         </w:rPr>
-        <w:t>표 5. 서버·화면이 쓰는 MCP 도구 2개 (Agent는 쓰지 않음)</w:t>
+        <w:t>표 5. MCP 서버가 제공하지만 Agent가 아니라 API 서버(화면)가 호출하는 도구 2개</w:t>
       </w:r>
     </w:p>
     <w:tbl>
@@ -2544,7 +2544,7 @@
           <w:b/>
           <w:sz w:val="20"/>
         </w:rPr>
-        <w:t>이 값은 설계 때 정한 가정이며, 다른 길이와 비교하는 실험은 하지 않았다.</w:t>
+        <w:t>이 값은 설계 때 정한 가정이었고, 10/5·30/15·40/20초와 비교한 결과 20초/10초를 유지했다(부록 E).</w:t>
       </w:r>
     </w:p>
     <w:p>
@@ -3982,186 +3982,6 @@
     </w:p>
     <w:p>
       <w:pPr>
-        <w:pStyle w:val="Heading2"/>
-      </w:pPr>
-      <w:r>
-        <w:rPr>
-          <w:rFonts w:ascii="맑은 고딕" w:hAnsi="맑은 고딕" w:eastAsia="맑은 고딕" w:cs="맑은 고딕"/>
-          <w:b/>
-        </w:rPr>
-        <w:t>2.9 구현한 기능과 최종 실행 화면</w:t>
-      </w:r>
-    </w:p>
-    <w:p>
-      <w:pPr>
-        <w:keepNext/>
-        <w:spacing w:after="40"/>
-        <w:jc w:val="center"/>
-      </w:pPr>
-      <w:r>
-        <w:drawing>
-          <wp:inline xmlns:a="http://schemas.openxmlformats.org/drawingml/2006/main" xmlns:pic="http://schemas.openxmlformats.org/drawingml/2006/picture">
-            <wp:extent cx="4860000" cy="3037500"/>
-            <wp:docPr id="6" name="Picture 6"/>
-            <wp:cNvGraphicFramePr>
-              <a:graphicFrameLocks noChangeAspect="1"/>
-            </wp:cNvGraphicFramePr>
-            <a:graphic>
-              <a:graphicData uri="http://schemas.openxmlformats.org/drawingml/2006/picture">
-                <pic:pic>
-                  <pic:nvPicPr>
-                    <pic:cNvPr id="0" name="03_result_detail.png"/>
-                    <pic:cNvPicPr/>
-                  </pic:nvPicPr>
-                  <pic:blipFill>
-                    <a:blip r:embed="rId16"/>
-                    <a:stretch>
-                      <a:fillRect/>
-                    </a:stretch>
-                  </pic:blipFill>
-                  <pic:spPr>
-                    <a:xfrm>
-                      <a:off x="0" y="0"/>
-                      <a:ext cx="4860000" cy="3037500"/>
-                    </a:xfrm>
-                    <a:prstGeom prst="rect"/>
-                  </pic:spPr>
-                </pic:pic>
-              </a:graphicData>
-            </a:graphic>
-          </wp:inline>
-        </w:drawing>
-      </w:r>
-    </w:p>
-    <w:p>
-      <w:pPr>
-        <w:spacing w:after="160"/>
-        <w:jc w:val="center"/>
-      </w:pPr>
-      <w:r>
-        <w:rPr>
-          <w:rFonts w:ascii="맑은 고딕" w:hAnsi="맑은 고딕" w:eastAsia="맑은 고딕" w:cs="맑은 고딕"/>
-          <w:b w:val="0"/>
-          <w:color w:val="3C3C3C"/>
-          <w:sz w:val="18"/>
-        </w:rPr>
-        <w:t>그림 6. 결과 화면. 검증을 통과한 장면 카드(원본 자막 인용), 선택한 장면의 영상, 원본 앞뒤 자막(강조된 줄이 근거). 화자는 "확인할 수 없음"으로 안내한다.</w:t>
-      </w:r>
-    </w:p>
-    <w:p>
-      <w:pPr>
-        <w:keepNext/>
-        <w:spacing w:after="40"/>
-        <w:jc w:val="center"/>
-      </w:pPr>
-      <w:r>
-        <w:drawing>
-          <wp:inline xmlns:a="http://schemas.openxmlformats.org/drawingml/2006/main" xmlns:pic="http://schemas.openxmlformats.org/drawingml/2006/picture">
-            <wp:extent cx="4860000" cy="3037500"/>
-            <wp:docPr id="7" name="Picture 7"/>
-            <wp:cNvGraphicFramePr>
-              <a:graphicFrameLocks noChangeAspect="1"/>
-            </wp:cNvGraphicFramePr>
-            <a:graphic>
-              <a:graphicData uri="http://schemas.openxmlformats.org/drawingml/2006/picture">
-                <pic:pic>
-                  <pic:nvPicPr>
-                    <pic:cNvPr id="0" name="03b_progress_expanded.png"/>
-                    <pic:cNvPicPr/>
-                  </pic:nvPicPr>
-                  <pic:blipFill>
-                    <a:blip r:embed="rId17"/>
-                    <a:stretch>
-                      <a:fillRect/>
-                    </a:stretch>
-                  </pic:blipFill>
-                  <pic:spPr>
-                    <a:xfrm>
-                      <a:off x="0" y="0"/>
-                      <a:ext cx="4860000" cy="3037500"/>
-                    </a:xfrm>
-                    <a:prstGeom prst="rect"/>
-                  </pic:spPr>
-                </pic:pic>
-              </a:graphicData>
-            </a:graphic>
-          </wp:inline>
-        </w:drawing>
-      </w:r>
-    </w:p>
-    <w:p>
-      <w:pPr>
-        <w:spacing w:after="160"/>
-        <w:jc w:val="center"/>
-      </w:pPr>
-      <w:r>
-        <w:rPr>
-          <w:rFonts w:ascii="맑은 고딕" w:hAnsi="맑은 고딕" w:eastAsia="맑은 고딕" w:cs="맑은 고딕"/>
-          <w:b w:val="0"/>
-          <w:color w:val="3C3C3C"/>
-          <w:sz w:val="18"/>
-        </w:rPr>
-        <w:t>그림 7. Agent 진행 단계: 질문 유형 파악 1.4초 → 장면 검색 0.4초 → 원문·시점 확인 1.3초, 총 3.0초. 검증 전 결과는 화면에 나타나지 않는다.</w:t>
-      </w:r>
-    </w:p>
-    <w:p>
-      <w:pPr>
-        <w:keepNext/>
-        <w:spacing w:after="40"/>
-        <w:jc w:val="center"/>
-      </w:pPr>
-      <w:r>
-        <w:drawing>
-          <wp:inline xmlns:a="http://schemas.openxmlformats.org/drawingml/2006/main" xmlns:pic="http://schemas.openxmlformats.org/drawingml/2006/picture">
-            <wp:extent cx="4860000" cy="3037500"/>
-            <wp:docPr id="8" name="Picture 8"/>
-            <wp:cNvGraphicFramePr>
-              <a:graphicFrameLocks noChangeAspect="1"/>
-            </wp:cNvGraphicFramePr>
-            <a:graphic>
-              <a:graphicData uri="http://schemas.openxmlformats.org/drawingml/2006/picture">
-                <pic:pic>
-                  <pic:nvPicPr>
-                    <pic:cNvPr id="0" name="05_speaker_unknown.png"/>
-                    <pic:cNvPicPr/>
-                  </pic:nvPicPr>
-                  <pic:blipFill>
-                    <a:blip r:embed="rId18"/>
-                    <a:stretch>
-                      <a:fillRect/>
-                    </a:stretch>
-                  </pic:blipFill>
-                  <pic:spPr>
-                    <a:xfrm>
-                      <a:off x="0" y="0"/>
-                      <a:ext cx="4860000" cy="3037500"/>
-                    </a:xfrm>
-                    <a:prstGeom prst="rect"/>
-                  </pic:spPr>
-                </pic:pic>
-              </a:graphicData>
-            </a:graphic>
-          </wp:inline>
-        </w:drawing>
-      </w:r>
-    </w:p>
-    <w:p>
-      <w:pPr>
-        <w:spacing w:after="160"/>
-        <w:jc w:val="center"/>
-      </w:pPr>
-      <w:r>
-        <w:rPr>
-          <w:rFonts w:ascii="맑은 고딕" w:hAnsi="맑은 고딕" w:eastAsia="맑은 고딕" w:cs="맑은 고딕"/>
-          <w:b w:val="0"/>
-          <w:color w:val="3C3C3C"/>
-          <w:sz w:val="18"/>
-        </w:rPr>
-        <w:t>그림 8. 화자 질문("곰이 물고기 물고 있다고 말한 사람이 누구야?"). 장면(58:04)은 찾되 "자막만으로 화자를 확인할 수 없습니다"라고 안내하고 말한 사람을 단정하지 않는다(총 5.0초).</w:t>
-      </w:r>
-    </w:p>
-    <w:p>
-      <w:pPr>
         <w:pStyle w:val="Heading1"/>
       </w:pPr>
       <w:r>
@@ -6133,7 +5953,7 @@
           <w:color w:val="3C3C3C"/>
           <w:sz w:val="18"/>
         </w:rPr>
-        <w:t>표 11. 지연과 호출 수 비교 (C는 OpenAI 평가 실행 기준)</w:t>
+        <w:t>표 11. 지연과 호출 수 비교 (v3 평가 실행 기준, OpenAI)</w:t>
       </w:r>
     </w:p>
     <w:tbl>
@@ -6163,7 +5983,7 @@
         </w:trPr>
         <w:tc>
           <w:tcPr>
-            <w:tcW w:type="dxa" w:w="2381"/>
+            <w:tcW w:type="dxa" w:w="2041"/>
             <w:shd w:val="clear" w:color="auto" w:fill="D9E2F3"/>
           </w:tcPr>
           <w:p>
@@ -6184,7 +6004,7 @@
         </w:tc>
         <w:tc>
           <w:tcPr>
-            <w:tcW w:type="dxa" w:w="2154"/>
+            <w:tcW w:type="dxa" w:w="2041"/>
             <w:shd w:val="clear" w:color="auto" w:fill="D9E2F3"/>
           </w:tcPr>
           <w:p>
@@ -6205,7 +6025,7 @@
         </w:tc>
         <w:tc>
           <w:tcPr>
-            <w:tcW w:type="dxa" w:w="2494"/>
+            <w:tcW w:type="dxa" w:w="2268"/>
             <w:shd w:val="clear" w:color="auto" w:fill="D9E2F3"/>
           </w:tcPr>
           <w:p>
@@ -6226,7 +6046,7 @@
         </w:tc>
         <w:tc>
           <w:tcPr>
-            <w:tcW w:type="dxa" w:w="2608"/>
+            <w:tcW w:type="dxa" w:w="3288"/>
             <w:shd w:val="clear" w:color="auto" w:fill="D9E2F3"/>
           </w:tcPr>
           <w:p>
@@ -6252,7 +6072,7 @@
         </w:trPr>
         <w:tc>
           <w:tcPr>
-            <w:tcW w:type="dxa" w:w="2381"/>
+            <w:tcW w:type="dxa" w:w="2041"/>
           </w:tcPr>
           <w:p>
             <w:pPr>
@@ -6270,7 +6090,7 @@
         </w:tc>
         <w:tc>
           <w:tcPr>
-            <w:tcW w:type="dxa" w:w="2154"/>
+            <w:tcW w:type="dxa" w:w="2041"/>
           </w:tcPr>
           <w:p>
             <w:pPr>
@@ -6282,13 +6102,13 @@
                 <w:b w:val="0"/>
                 <w:sz w:val="17"/>
               </w:rPr>
-              <w:t>0.002–0.003초</w:t>
-            </w:r>
-          </w:p>
-        </w:tc>
-        <w:tc>
-          <w:tcPr>
-            <w:tcW w:type="dxa" w:w="2494"/>
+              <w:t>0.002–0.005초</w:t>
+            </w:r>
+          </w:p>
+        </w:tc>
+        <w:tc>
+          <w:tcPr>
+            <w:tcW w:type="dxa" w:w="2268"/>
           </w:tcPr>
           <w:p>
             <w:pPr>
@@ -6300,13 +6120,13 @@
                 <w:b w:val="0"/>
                 <w:sz w:val="17"/>
               </w:rPr>
-              <w:t>1.0–1.75 / 0</w:t>
-            </w:r>
-          </w:p>
-        </w:tc>
-        <w:tc>
-          <w:tcPr>
-            <w:tcW w:type="dxa" w:w="2608"/>
+              <w:t>1.0–3.7 / 0</w:t>
+            </w:r>
+          </w:p>
+        </w:tc>
+        <w:tc>
+          <w:tcPr>
+            <w:tcW w:type="dxa" w:w="3288"/>
           </w:tcPr>
           <w:p>
             <w:pPr>
@@ -6318,16 +6138,7 @@
                 <w:b w:val="0"/>
                 <w:sz w:val="17"/>
               </w:rPr>
-              <w:t xml:space="preserve">LLM을 쓰지 않아 모델과 무관한 검색 지연. </w:t>
-            </w:r>
-            <w:r>
-              <w:rPr>
-                <w:rFonts w:ascii="맑은 고딕" w:hAnsi="맑은 고딕" w:eastAsia="맑은 고딕" w:cs="맑은 고딕"/>
-                <w:b/>
-                <w:sz w:val="17"/>
-                <w:highlight w:val="yellow"/>
-              </w:rPr>
-              <w:t>[맥북의 OpenAI 평가 결과 파일에서 같은 실행의 값으로 확인]</w:t>
+              <w:t>LLM 없음. 조건 ①은 Tool 1.0회, 조건 ②는 3.7회</w:t>
             </w:r>
           </w:p>
         </w:tc>
@@ -6338,7 +6149,7 @@
         </w:trPr>
         <w:tc>
           <w:tcPr>
-            <w:tcW w:type="dxa" w:w="2381"/>
+            <w:tcW w:type="dxa" w:w="2041"/>
           </w:tcPr>
           <w:p>
             <w:pPr>
@@ -6356,7 +6167,7 @@
         </w:tc>
         <w:tc>
           <w:tcPr>
-            <w:tcW w:type="dxa" w:w="2154"/>
+            <w:tcW w:type="dxa" w:w="2041"/>
           </w:tcPr>
           <w:p>
             <w:pPr>
@@ -6368,13 +6179,13 @@
                 <w:b w:val="0"/>
                 <w:sz w:val="17"/>
               </w:rPr>
-              <w:t>0.17–0.25초</w:t>
-            </w:r>
-          </w:p>
-        </w:tc>
-        <w:tc>
-          <w:tcPr>
-            <w:tcW w:type="dxa" w:w="2494"/>
+              <w:t>0.05–0.17초</w:t>
+            </w:r>
+          </w:p>
+        </w:tc>
+        <w:tc>
+          <w:tcPr>
+            <w:tcW w:type="dxa" w:w="2268"/>
           </w:tcPr>
           <w:p>
             <w:pPr>
@@ -6392,7 +6203,7 @@
         </w:tc>
         <w:tc>
           <w:tcPr>
-            <w:tcW w:type="dxa" w:w="2608"/>
+            <w:tcW w:type="dxa" w:w="3288"/>
           </w:tcPr>
           <w:p>
             <w:pPr>
@@ -6404,7 +6215,7 @@
                 <w:b w:val="0"/>
                 <w:sz w:val="17"/>
               </w:rPr>
-              <w:t>위와 같음</w:t>
+              <w:t>LLM 없음. 조건 ① 0.17초, 조건 ② 0.05초(캐시 영향 가능)</w:t>
             </w:r>
           </w:p>
         </w:tc>
@@ -6415,7 +6226,7 @@
         </w:trPr>
         <w:tc>
           <w:tcPr>
-            <w:tcW w:type="dxa" w:w="2381"/>
+            <w:tcW w:type="dxa" w:w="2041"/>
           </w:tcPr>
           <w:p>
             <w:pPr>
@@ -6433,7 +6244,7 @@
         </w:tc>
         <w:tc>
           <w:tcPr>
-            <w:tcW w:type="dxa" w:w="2154"/>
+            <w:tcW w:type="dxa" w:w="2041"/>
           </w:tcPr>
           <w:p>
             <w:pPr>
@@ -6459,34 +6270,25 @@
         </w:tc>
         <w:tc>
           <w:tcPr>
-            <w:tcW w:type="dxa" w:w="2494"/>
-          </w:tcPr>
-          <w:p>
-            <w:pPr>
-              <w:spacing w:after="0" w:line="264" w:lineRule="auto"/>
-            </w:pPr>
-            <w:r>
-              <w:rPr>
-                <w:rFonts w:ascii="맑은 고딕" w:hAnsi="맑은 고딕" w:eastAsia="맑은 고딕" w:cs="맑은 고딕"/>
-                <w:b/>
+            <w:tcW w:type="dxa" w:w="2268"/>
+          </w:tcPr>
+          <w:p>
+            <w:pPr>
+              <w:spacing w:after="0" w:line="264" w:lineRule="auto"/>
+            </w:pPr>
+            <w:r>
+              <w:rPr>
+                <w:rFonts w:ascii="맑은 고딕" w:hAnsi="맑은 고딕" w:eastAsia="맑은 고딕" w:cs="맑은 고딕"/>
+                <w:b w:val="0"/>
                 <w:sz w:val="17"/>
-                <w:highlight w:val="yellow"/>
-              </w:rPr>
-              <w:t>[맥북 결과 파일에서 집계]</w:t>
-            </w:r>
-            <w:r>
-              <w:rPr>
-                <w:rFonts w:ascii="맑은 고딕" w:hAnsi="맑은 고딕" w:eastAsia="맑은 고딕" w:cs="맑은 고딕"/>
-                <w:b w:val="0"/>
-                <w:sz w:val="17"/>
-              </w:rPr>
-              <w:t xml:space="preserve"> / 약 2.1</w:t>
-            </w:r>
-          </w:p>
-        </w:tc>
-        <w:tc>
-          <w:tcPr>
-            <w:tcW w:type="dxa" w:w="2608"/>
+              </w:rPr>
+              <w:t>4.0 / 2.1</w:t>
+            </w:r>
+          </w:p>
+        </w:tc>
+        <w:tc>
+          <w:tcPr>
+            <w:tcW w:type="dxa" w:w="3288"/>
           </w:tcPr>
           <w:p>
             <w:pPr>
@@ -6845,7 +6647,7 @@
           <w:b w:val="0"/>
           <w:sz w:val="20"/>
         </w:rPr>
-        <w:t>: 마니또는 기존에 못 찾던 사례이고, 오징어·4월 20일·한우는 이미 찾던 질문이 계속 찾아지는지 보려고 골랐다. 질문을 체계적으로 선정한 것이 아니라서 정확도 판단은 정답 평가셋 재측정으로 한다.</w:t>
+        <w:t>: 마니또는 기존에 못 찾던 사례이고, 오징어·4월 20일·한우는 이미 찾던 질문이 계속 찾아지는지 보려고 골랐다. 질문을 체계적으로 선정한 것이 아니라서 정확도 판단은 아래 정답 평가셋 재측정으로 했다.</w:t>
       </w:r>
     </w:p>
     <w:p>
@@ -6941,7 +6743,7 @@
           <w:b/>
           <w:sz w:val="20"/>
         </w:rPr>
-        <w:t>측정하지 못한 것</w:t>
+        <w:t>평가셋 결과</w:t>
       </w:r>
       <w:r>
         <w:rPr>
@@ -6949,7 +6751,7 @@
           <w:b w:val="0"/>
           <w:sz w:val="20"/>
         </w:rPr>
-        <w:t xml:space="preserve">: 정답 평가셋 20문항에서의 정확도와 틀린 장면 증가 여부. 그래서 이 기능은 </w:t>
+        <w:t xml:space="preserve">: 아래 재측정에서 정답 평가셋 20문항의 1위 적중 수와 틀린 장면 수는 켜도 달라지지 않았다. 그래서 이 기능은 </w:t>
       </w:r>
       <w:r>
         <w:rPr>
@@ -6965,7 +6767,44 @@
           <w:b w:val="0"/>
           <w:sz w:val="20"/>
         </w:rPr>
-        <w:t>이며, 재측정 결과에 따라 켤지 철회할지 정한다.</w:t>
+        <w:t>로 남기고 기본값은 꺼 둔다.</w:t>
+      </w:r>
+    </w:p>
+    <w:p>
+      <w:pPr>
+        <w:pStyle w:val="Heading3"/>
+      </w:pPr>
+      <w:r>
+        <w:rPr>
+          <w:rFonts w:ascii="맑은 고딕" w:hAnsi="맑은 고딕" w:eastAsia="맑은 고딕" w:cs="맑은 고딕"/>
+          <w:b/>
+        </w:rPr>
+        <w:t>이중 첫 검색 평가셋 재측정 (2026-10-22)</w:t>
+      </w:r>
+    </w:p>
+    <w:p>
+      <w:r>
+        <w:rPr>
+          <w:rFonts w:ascii="맑은 고딕" w:hAnsi="맑은 고딕" w:eastAsia="맑은 고딕" w:cs="맑은 고딕"/>
+          <w:b w:val="0"/>
+          <w:sz w:val="20"/>
+        </w:rPr>
+        <w:t>같은 정답 평가셋 20문항, 같은 모델(OpenAI), 같은 명령에서 이중 첫 검색만 끈 실행(v3)과 켠 실행(v4)을 각각 1회 다시 측정했다. 두 실행 모두 20문항을 끝까지 실행했고 오류는 0건이다. 현재 main 코드로 둘 다 새로 실행했으므로 3.2절의 v3 수치와는 별도의 실행이다.</w:t>
+      </w:r>
+    </w:p>
+    <w:p>
+      <w:pPr>
+        <w:keepNext/>
+        <w:spacing w:after="40"/>
+      </w:pPr>
+      <w:r>
+        <w:rPr>
+          <w:rFonts w:ascii="맑은 고딕" w:hAnsi="맑은 고딕" w:eastAsia="맑은 고딕" w:cs="맑은 고딕"/>
+          <w:b/>
+          <w:color w:val="3C3C3C"/>
+          <w:sz w:val="18"/>
+        </w:rPr>
+        <w:t>표 13. 이중 첫 검색 끔 대 켬 (OpenAI, 같은 평가셋, 질문당 1회 실행)</w:t>
       </w:r>
     </w:p>
     <w:tbl>
@@ -6973,35 +6812,987 @@
         <w:tblStyle w:val="TableGrid"/>
         <w:tblW w:type="auto" w:w="0"/>
         <w:jc w:val="center"/>
+        <w:tblLayout w:type="fixed"/>
         <w:tblLook w:firstColumn="1" w:firstRow="1" w:lastColumn="0" w:lastRow="0" w:noHBand="0" w:noVBand="1" w:val="04A0"/>
         <w:tblCellMar>
-          <w:top w:w="90" w:type="dxa"/>
-          <w:left w:w="140" w:type="dxa"/>
-          <w:bottom w:w="90" w:type="dxa"/>
-          <w:right w:w="140" w:type="dxa"/>
+          <w:top w:w="50" w:type="dxa"/>
+          <w:left w:w="90" w:type="dxa"/>
+          <w:bottom w:w="50" w:type="dxa"/>
+          <w:right w:w="90" w:type="dxa"/>
         </w:tblCellMar>
       </w:tblPr>
       <w:tblGrid>
-        <w:gridCol w:w="9638"/>
+        <w:gridCol w:w="2409"/>
+        <w:gridCol w:w="2409"/>
+        <w:gridCol w:w="2409"/>
+        <w:gridCol w:w="2409"/>
       </w:tblGrid>
       <w:tr>
-        <w:tc>
-          <w:tcPr>
-            <w:tcW w:type="dxa" w:w="9638"/>
-            <w:shd w:val="clear" w:color="auto" w:fill="FFFBE0"/>
-          </w:tcPr>
-          <w:p>
-            <w:pPr>
-              <w:spacing w:after="40"/>
+        <w:trPr>
+          <w:cantSplit/>
+          <w:tblHeader/>
+        </w:trPr>
+        <w:tc>
+          <w:tcPr>
+            <w:tcW w:type="dxa" w:w="3288"/>
+            <w:shd w:val="clear" w:color="auto" w:fill="D9E2F3"/>
+          </w:tcPr>
+          <w:p>
+            <w:pPr>
+              <w:keepNext/>
+              <w:spacing w:after="0" w:line="264" w:lineRule="auto"/>
+              <w:jc w:val="center"/>
             </w:pPr>
             <w:r>
               <w:rPr>
                 <w:rFonts w:ascii="맑은 고딕" w:hAnsi="맑은 고딕" w:eastAsia="맑은 고딕" w:cs="맑은 고딕"/>
                 <w:b/>
-                <w:sz w:val="19"/>
-                <w:highlight w:val="yellow"/>
-              </w:rPr>
-              <w:t>[내일(Day 3) 맥북에서 정답 평가셋 20문항 A/B/C를 이중 첫 검색 미적용(v3)과 적용(v4)으로 재측정한 결과표와 실행 화면 캡처를 이 절에 삽입. 정답 평가셋 승인 파일이 맥북에만 있어 오늘은 기존 측정값(v2·v3)과 위의 직접 실행만 사용. (선택) 청크 길이 20초/10초를 바꿔 비교한 결과가 있으면 4.3절의 "비교하지 않았다" 문장을 결과로 바꾼다]</w:t>
+                <w:sz w:val="17"/>
+              </w:rPr>
+              <w:t>지표</w:t>
+            </w:r>
+          </w:p>
+        </w:tc>
+        <w:tc>
+          <w:tcPr>
+            <w:tcW w:type="dxa" w:w="2381"/>
+            <w:shd w:val="clear" w:color="auto" w:fill="D9E2F3"/>
+          </w:tcPr>
+          <w:p>
+            <w:pPr>
+              <w:keepNext/>
+              <w:spacing w:after="0" w:line="264" w:lineRule="auto"/>
+              <w:jc w:val="center"/>
+            </w:pPr>
+            <w:r>
+              <w:rPr>
+                <w:rFonts w:ascii="맑은 고딕" w:hAnsi="맑은 고딕" w:eastAsia="맑은 고딕" w:cs="맑은 고딕"/>
+                <w:b/>
+                <w:sz w:val="17"/>
+              </w:rPr>
+              <w:t>끔 (v3)</w:t>
+            </w:r>
+          </w:p>
+        </w:tc>
+        <w:tc>
+          <w:tcPr>
+            <w:tcW w:type="dxa" w:w="2041"/>
+            <w:shd w:val="clear" w:color="auto" w:fill="D9E2F3"/>
+          </w:tcPr>
+          <w:p>
+            <w:pPr>
+              <w:keepNext/>
+              <w:spacing w:after="0" w:line="264" w:lineRule="auto"/>
+              <w:jc w:val="center"/>
+            </w:pPr>
+            <w:r>
+              <w:rPr>
+                <w:rFonts w:ascii="맑은 고딕" w:hAnsi="맑은 고딕" w:eastAsia="맑은 고딕" w:cs="맑은 고딕"/>
+                <w:b/>
+                <w:sz w:val="17"/>
+              </w:rPr>
+              <w:t>켬 (v4)</w:t>
+            </w:r>
+          </w:p>
+        </w:tc>
+        <w:tc>
+          <w:tcPr>
+            <w:tcW w:type="dxa" w:w="1928"/>
+            <w:shd w:val="clear" w:color="auto" w:fill="D9E2F3"/>
+          </w:tcPr>
+          <w:p>
+            <w:pPr>
+              <w:keepNext/>
+              <w:spacing w:after="0" w:line="264" w:lineRule="auto"/>
+              <w:jc w:val="center"/>
+            </w:pPr>
+            <w:r>
+              <w:rPr>
+                <w:rFonts w:ascii="맑은 고딕" w:hAnsi="맑은 고딕" w:eastAsia="맑은 고딕" w:cs="맑은 고딕"/>
+                <w:b/>
+                <w:sz w:val="17"/>
+              </w:rPr>
+              <w:t>변화</w:t>
+            </w:r>
+          </w:p>
+        </w:tc>
+      </w:tr>
+      <w:tr>
+        <w:trPr>
+          <w:cantSplit/>
+        </w:trPr>
+        <w:tc>
+          <w:tcPr>
+            <w:tcW w:type="dxa" w:w="3288"/>
+          </w:tcPr>
+          <w:p>
+            <w:pPr>
+              <w:spacing w:after="0" w:line="264" w:lineRule="auto"/>
+            </w:pPr>
+            <w:r>
+              <w:rPr>
+                <w:rFonts w:ascii="맑은 고딕" w:hAnsi="맑은 고딕" w:eastAsia="맑은 고딕" w:cs="맑은 고딕"/>
+                <w:b w:val="0"/>
+                <w:sz w:val="17"/>
+              </w:rPr>
+              <w:t>Agent 1위 적중 수 (장면 질문 18개)</w:t>
+            </w:r>
+          </w:p>
+        </w:tc>
+        <w:tc>
+          <w:tcPr>
+            <w:tcW w:type="dxa" w:w="2381"/>
+          </w:tcPr>
+          <w:p>
+            <w:pPr>
+              <w:spacing w:after="0" w:line="264" w:lineRule="auto"/>
+              <w:jc w:val="center"/>
+            </w:pPr>
+            <w:r>
+              <w:rPr>
+                <w:rFonts w:ascii="맑은 고딕" w:hAnsi="맑은 고딕" w:eastAsia="맑은 고딕" w:cs="맑은 고딕"/>
+                <w:b w:val="0"/>
+                <w:sz w:val="17"/>
+              </w:rPr>
+              <w:t>16</w:t>
+            </w:r>
+          </w:p>
+        </w:tc>
+        <w:tc>
+          <w:tcPr>
+            <w:tcW w:type="dxa" w:w="2041"/>
+          </w:tcPr>
+          <w:p>
+            <w:pPr>
+              <w:spacing w:after="0" w:line="264" w:lineRule="auto"/>
+              <w:jc w:val="center"/>
+            </w:pPr>
+            <w:r>
+              <w:rPr>
+                <w:rFonts w:ascii="맑은 고딕" w:hAnsi="맑은 고딕" w:eastAsia="맑은 고딕" w:cs="맑은 고딕"/>
+                <w:b w:val="0"/>
+                <w:sz w:val="17"/>
+              </w:rPr>
+              <w:t>16</w:t>
+            </w:r>
+          </w:p>
+        </w:tc>
+        <w:tc>
+          <w:tcPr>
+            <w:tcW w:type="dxa" w:w="1928"/>
+          </w:tcPr>
+          <w:p>
+            <w:pPr>
+              <w:spacing w:after="0" w:line="264" w:lineRule="auto"/>
+              <w:jc w:val="center"/>
+            </w:pPr>
+            <w:r>
+              <w:rPr>
+                <w:rFonts w:ascii="맑은 고딕" w:hAnsi="맑은 고딕" w:eastAsia="맑은 고딕" w:cs="맑은 고딕"/>
+                <w:b w:val="0"/>
+                <w:sz w:val="17"/>
+              </w:rPr>
+              <w:t>같음</w:t>
+            </w:r>
+          </w:p>
+        </w:tc>
+      </w:tr>
+      <w:tr>
+        <w:trPr>
+          <w:cantSplit/>
+        </w:trPr>
+        <w:tc>
+          <w:tcPr>
+            <w:tcW w:type="dxa" w:w="3288"/>
+          </w:tcPr>
+          <w:p>
+            <w:pPr>
+              <w:spacing w:after="0" w:line="264" w:lineRule="auto"/>
+            </w:pPr>
+            <w:r>
+              <w:rPr>
+                <w:rFonts w:ascii="맑은 고딕" w:hAnsi="맑은 고딕" w:eastAsia="맑은 고딕" w:cs="맑은 고딕"/>
+                <w:b w:val="0"/>
+                <w:sz w:val="17"/>
+              </w:rPr>
+              <w:t>Agent 상위 3개 적중 수 (18개)</w:t>
+            </w:r>
+          </w:p>
+        </w:tc>
+        <w:tc>
+          <w:tcPr>
+            <w:tcW w:type="dxa" w:w="2381"/>
+          </w:tcPr>
+          <w:p>
+            <w:pPr>
+              <w:spacing w:after="0" w:line="264" w:lineRule="auto"/>
+              <w:jc w:val="center"/>
+            </w:pPr>
+            <w:r>
+              <w:rPr>
+                <w:rFonts w:ascii="맑은 고딕" w:hAnsi="맑은 고딕" w:eastAsia="맑은 고딕" w:cs="맑은 고딕"/>
+                <w:b w:val="0"/>
+                <w:sz w:val="17"/>
+              </w:rPr>
+              <w:t>16</w:t>
+            </w:r>
+          </w:p>
+        </w:tc>
+        <w:tc>
+          <w:tcPr>
+            <w:tcW w:type="dxa" w:w="2041"/>
+          </w:tcPr>
+          <w:p>
+            <w:pPr>
+              <w:spacing w:after="0" w:line="264" w:lineRule="auto"/>
+              <w:jc w:val="center"/>
+            </w:pPr>
+            <w:r>
+              <w:rPr>
+                <w:rFonts w:ascii="맑은 고딕" w:hAnsi="맑은 고딕" w:eastAsia="맑은 고딕" w:cs="맑은 고딕"/>
+                <w:b w:val="0"/>
+                <w:sz w:val="17"/>
+              </w:rPr>
+              <w:t>16</w:t>
+            </w:r>
+          </w:p>
+        </w:tc>
+        <w:tc>
+          <w:tcPr>
+            <w:tcW w:type="dxa" w:w="1928"/>
+          </w:tcPr>
+          <w:p>
+            <w:pPr>
+              <w:spacing w:after="0" w:line="264" w:lineRule="auto"/>
+              <w:jc w:val="center"/>
+            </w:pPr>
+            <w:r>
+              <w:rPr>
+                <w:rFonts w:ascii="맑은 고딕" w:hAnsi="맑은 고딕" w:eastAsia="맑은 고딕" w:cs="맑은 고딕"/>
+                <w:b w:val="0"/>
+                <w:sz w:val="17"/>
+              </w:rPr>
+              <w:t>같음</w:t>
+            </w:r>
+          </w:p>
+        </w:tc>
+      </w:tr>
+      <w:tr>
+        <w:trPr>
+          <w:cantSplit/>
+        </w:trPr>
+        <w:tc>
+          <w:tcPr>
+            <w:tcW w:type="dxa" w:w="3288"/>
+          </w:tcPr>
+          <w:p>
+            <w:pPr>
+              <w:spacing w:after="0" w:line="264" w:lineRule="auto"/>
+            </w:pPr>
+            <w:r>
+              <w:rPr>
+                <w:rFonts w:ascii="맑은 고딕" w:hAnsi="맑은 고딕" w:eastAsia="맑은 고딕" w:cs="맑은 고딕"/>
+                <w:b w:val="0"/>
+                <w:sz w:val="17"/>
+              </w:rPr>
+              <w:t>화자 질문 처리 성공 수 (4개)</w:t>
+            </w:r>
+          </w:p>
+        </w:tc>
+        <w:tc>
+          <w:tcPr>
+            <w:tcW w:type="dxa" w:w="2381"/>
+          </w:tcPr>
+          <w:p>
+            <w:pPr>
+              <w:spacing w:after="0" w:line="264" w:lineRule="auto"/>
+              <w:jc w:val="center"/>
+            </w:pPr>
+            <w:r>
+              <w:rPr>
+                <w:rFonts w:ascii="맑은 고딕" w:hAnsi="맑은 고딕" w:eastAsia="맑은 고딕" w:cs="맑은 고딕"/>
+                <w:b w:val="0"/>
+                <w:sz w:val="17"/>
+              </w:rPr>
+              <w:t>3</w:t>
+            </w:r>
+          </w:p>
+        </w:tc>
+        <w:tc>
+          <w:tcPr>
+            <w:tcW w:type="dxa" w:w="2041"/>
+          </w:tcPr>
+          <w:p>
+            <w:pPr>
+              <w:spacing w:after="0" w:line="264" w:lineRule="auto"/>
+              <w:jc w:val="center"/>
+            </w:pPr>
+            <w:r>
+              <w:rPr>
+                <w:rFonts w:ascii="맑은 고딕" w:hAnsi="맑은 고딕" w:eastAsia="맑은 고딕" w:cs="맑은 고딕"/>
+                <w:b w:val="0"/>
+                <w:sz w:val="17"/>
+              </w:rPr>
+              <w:t>3</w:t>
+            </w:r>
+          </w:p>
+        </w:tc>
+        <w:tc>
+          <w:tcPr>
+            <w:tcW w:type="dxa" w:w="1928"/>
+          </w:tcPr>
+          <w:p>
+            <w:pPr>
+              <w:spacing w:after="0" w:line="264" w:lineRule="auto"/>
+              <w:jc w:val="center"/>
+            </w:pPr>
+            <w:r>
+              <w:rPr>
+                <w:rFonts w:ascii="맑은 고딕" w:hAnsi="맑은 고딕" w:eastAsia="맑은 고딕" w:cs="맑은 고딕"/>
+                <w:b w:val="0"/>
+                <w:sz w:val="17"/>
+              </w:rPr>
+              <w:t>같음</w:t>
+            </w:r>
+          </w:p>
+        </w:tc>
+      </w:tr>
+      <w:tr>
+        <w:trPr>
+          <w:cantSplit/>
+        </w:trPr>
+        <w:tc>
+          <w:tcPr>
+            <w:tcW w:type="dxa" w:w="3288"/>
+          </w:tcPr>
+          <w:p>
+            <w:pPr>
+              <w:spacing w:after="0" w:line="264" w:lineRule="auto"/>
+            </w:pPr>
+            <w:r>
+              <w:rPr>
+                <w:rFonts w:ascii="맑은 고딕" w:hAnsi="맑은 고딕" w:eastAsia="맑은 고딕" w:cs="맑은 고딕"/>
+                <w:b w:val="0"/>
+                <w:sz w:val="17"/>
+              </w:rPr>
+              <w:t>자막으로 알 수 없는 요청 거부 수 (2개)</w:t>
+            </w:r>
+          </w:p>
+        </w:tc>
+        <w:tc>
+          <w:tcPr>
+            <w:tcW w:type="dxa" w:w="2381"/>
+          </w:tcPr>
+          <w:p>
+            <w:pPr>
+              <w:spacing w:after="0" w:line="264" w:lineRule="auto"/>
+              <w:jc w:val="center"/>
+            </w:pPr>
+            <w:r>
+              <w:rPr>
+                <w:rFonts w:ascii="맑은 고딕" w:hAnsi="맑은 고딕" w:eastAsia="맑은 고딕" w:cs="맑은 고딕"/>
+                <w:b w:val="0"/>
+                <w:sz w:val="17"/>
+              </w:rPr>
+              <w:t>2</w:t>
+            </w:r>
+          </w:p>
+        </w:tc>
+        <w:tc>
+          <w:tcPr>
+            <w:tcW w:type="dxa" w:w="2041"/>
+          </w:tcPr>
+          <w:p>
+            <w:pPr>
+              <w:spacing w:after="0" w:line="264" w:lineRule="auto"/>
+              <w:jc w:val="center"/>
+            </w:pPr>
+            <w:r>
+              <w:rPr>
+                <w:rFonts w:ascii="맑은 고딕" w:hAnsi="맑은 고딕" w:eastAsia="맑은 고딕" w:cs="맑은 고딕"/>
+                <w:b w:val="0"/>
+                <w:sz w:val="17"/>
+              </w:rPr>
+              <w:t>2</w:t>
+            </w:r>
+          </w:p>
+        </w:tc>
+        <w:tc>
+          <w:tcPr>
+            <w:tcW w:type="dxa" w:w="1928"/>
+          </w:tcPr>
+          <w:p>
+            <w:pPr>
+              <w:spacing w:after="0" w:line="264" w:lineRule="auto"/>
+              <w:jc w:val="center"/>
+            </w:pPr>
+            <w:r>
+              <w:rPr>
+                <w:rFonts w:ascii="맑은 고딕" w:hAnsi="맑은 고딕" w:eastAsia="맑은 고딕" w:cs="맑은 고딕"/>
+                <w:b w:val="0"/>
+                <w:sz w:val="17"/>
+              </w:rPr>
+              <w:t>같음</w:t>
+            </w:r>
+          </w:p>
+        </w:tc>
+      </w:tr>
+      <w:tr>
+        <w:trPr>
+          <w:cantSplit/>
+        </w:trPr>
+        <w:tc>
+          <w:tcPr>
+            <w:tcW w:type="dxa" w:w="3288"/>
+          </w:tcPr>
+          <w:p>
+            <w:pPr>
+              <w:spacing w:after="0" w:line="264" w:lineRule="auto"/>
+            </w:pPr>
+            <w:r>
+              <w:rPr>
+                <w:rFonts w:ascii="맑은 고딕" w:hAnsi="맑은 고딕" w:eastAsia="맑은 고딕" w:cs="맑은 고딕"/>
+                <w:b w:val="0"/>
+                <w:sz w:val="17"/>
+              </w:rPr>
+              <w:t>틀린 장면을 "찾음"으로 답한 수</w:t>
+            </w:r>
+          </w:p>
+        </w:tc>
+        <w:tc>
+          <w:tcPr>
+            <w:tcW w:type="dxa" w:w="2381"/>
+          </w:tcPr>
+          <w:p>
+            <w:pPr>
+              <w:spacing w:after="0" w:line="264" w:lineRule="auto"/>
+              <w:jc w:val="center"/>
+            </w:pPr>
+            <w:r>
+              <w:rPr>
+                <w:rFonts w:ascii="맑은 고딕" w:hAnsi="맑은 고딕" w:eastAsia="맑은 고딕" w:cs="맑은 고딕"/>
+                <w:b w:val="0"/>
+                <w:sz w:val="17"/>
+              </w:rPr>
+              <w:t>1</w:t>
+            </w:r>
+          </w:p>
+        </w:tc>
+        <w:tc>
+          <w:tcPr>
+            <w:tcW w:type="dxa" w:w="2041"/>
+          </w:tcPr>
+          <w:p>
+            <w:pPr>
+              <w:spacing w:after="0" w:line="264" w:lineRule="auto"/>
+              <w:jc w:val="center"/>
+            </w:pPr>
+            <w:r>
+              <w:rPr>
+                <w:rFonts w:ascii="맑은 고딕" w:hAnsi="맑은 고딕" w:eastAsia="맑은 고딕" w:cs="맑은 고딕"/>
+                <w:b w:val="0"/>
+                <w:sz w:val="17"/>
+              </w:rPr>
+              <w:t>1</w:t>
+            </w:r>
+          </w:p>
+        </w:tc>
+        <w:tc>
+          <w:tcPr>
+            <w:tcW w:type="dxa" w:w="1928"/>
+          </w:tcPr>
+          <w:p>
+            <w:pPr>
+              <w:spacing w:after="0" w:line="264" w:lineRule="auto"/>
+              <w:jc w:val="center"/>
+            </w:pPr>
+            <w:r>
+              <w:rPr>
+                <w:rFonts w:ascii="맑은 고딕" w:hAnsi="맑은 고딕" w:eastAsia="맑은 고딕" w:cs="맑은 고딕"/>
+                <w:b w:val="0"/>
+                <w:sz w:val="17"/>
+              </w:rPr>
+              <w:t>같음 (같은 문항)</w:t>
+            </w:r>
+          </w:p>
+        </w:tc>
+      </w:tr>
+      <w:tr>
+        <w:trPr>
+          <w:cantSplit/>
+        </w:trPr>
+        <w:tc>
+          <w:tcPr>
+            <w:tcW w:type="dxa" w:w="3288"/>
+          </w:tcPr>
+          <w:p>
+            <w:pPr>
+              <w:spacing w:after="0" w:line="264" w:lineRule="auto"/>
+            </w:pPr>
+            <w:r>
+              <w:rPr>
+                <w:rFonts w:ascii="맑은 고딕" w:hAnsi="맑은 고딕" w:eastAsia="맑은 고딕" w:cs="맑은 고딕"/>
+                <w:b w:val="0"/>
+                <w:sz w:val="17"/>
+              </w:rPr>
+              <w:t>근거 없이 화자를 단정한 수</w:t>
+            </w:r>
+          </w:p>
+        </w:tc>
+        <w:tc>
+          <w:tcPr>
+            <w:tcW w:type="dxa" w:w="2381"/>
+          </w:tcPr>
+          <w:p>
+            <w:pPr>
+              <w:spacing w:after="0" w:line="264" w:lineRule="auto"/>
+              <w:jc w:val="center"/>
+            </w:pPr>
+            <w:r>
+              <w:rPr>
+                <w:rFonts w:ascii="맑은 고딕" w:hAnsi="맑은 고딕" w:eastAsia="맑은 고딕" w:cs="맑은 고딕"/>
+                <w:b w:val="0"/>
+                <w:sz w:val="17"/>
+              </w:rPr>
+              <w:t>0</w:t>
+            </w:r>
+          </w:p>
+        </w:tc>
+        <w:tc>
+          <w:tcPr>
+            <w:tcW w:type="dxa" w:w="2041"/>
+          </w:tcPr>
+          <w:p>
+            <w:pPr>
+              <w:spacing w:after="0" w:line="264" w:lineRule="auto"/>
+              <w:jc w:val="center"/>
+            </w:pPr>
+            <w:r>
+              <w:rPr>
+                <w:rFonts w:ascii="맑은 고딕" w:hAnsi="맑은 고딕" w:eastAsia="맑은 고딕" w:cs="맑은 고딕"/>
+                <w:b w:val="0"/>
+                <w:sz w:val="17"/>
+              </w:rPr>
+              <w:t>0</w:t>
+            </w:r>
+          </w:p>
+        </w:tc>
+        <w:tc>
+          <w:tcPr>
+            <w:tcW w:type="dxa" w:w="1928"/>
+          </w:tcPr>
+          <w:p>
+            <w:pPr>
+              <w:spacing w:after="0" w:line="264" w:lineRule="auto"/>
+              <w:jc w:val="center"/>
+            </w:pPr>
+            <w:r>
+              <w:rPr>
+                <w:rFonts w:ascii="맑은 고딕" w:hAnsi="맑은 고딕" w:eastAsia="맑은 고딕" w:cs="맑은 고딕"/>
+                <w:b w:val="0"/>
+                <w:sz w:val="17"/>
+              </w:rPr>
+              <w:t>같음</w:t>
+            </w:r>
+          </w:p>
+        </w:tc>
+      </w:tr>
+      <w:tr>
+        <w:trPr>
+          <w:cantSplit/>
+        </w:trPr>
+        <w:tc>
+          <w:tcPr>
+            <w:tcW w:type="dxa" w:w="3288"/>
+          </w:tcPr>
+          <w:p>
+            <w:pPr>
+              <w:spacing w:after="0" w:line="264" w:lineRule="auto"/>
+            </w:pPr>
+            <w:r>
+              <w:rPr>
+                <w:rFonts w:ascii="맑은 고딕" w:hAnsi="맑은 고딕" w:eastAsia="맑은 고딕" w:cs="맑은 고딕"/>
+                <w:b w:val="0"/>
+                <w:sz w:val="17"/>
+              </w:rPr>
+              <w:t>Agent 결과 상태 (20개)</w:t>
+            </w:r>
+          </w:p>
+        </w:tc>
+        <w:tc>
+          <w:tcPr>
+            <w:tcW w:type="dxa" w:w="2381"/>
+          </w:tcPr>
+          <w:p>
+            <w:pPr>
+              <w:spacing w:after="0" w:line="264" w:lineRule="auto"/>
+              <w:jc w:val="center"/>
+            </w:pPr>
+            <w:r>
+              <w:rPr>
+                <w:rFonts w:ascii="맑은 고딕" w:hAnsi="맑은 고딕" w:eastAsia="맑은 고딕" w:cs="맑은 고딕"/>
+                <w:b w:val="0"/>
+                <w:sz w:val="17"/>
+              </w:rPr>
+              <w:t>찾음 17, 못 찾음 1, 알 수 없는 요청 2</w:t>
+            </w:r>
+          </w:p>
+        </w:tc>
+        <w:tc>
+          <w:tcPr>
+            <w:tcW w:type="dxa" w:w="2041"/>
+          </w:tcPr>
+          <w:p>
+            <w:pPr>
+              <w:spacing w:after="0" w:line="264" w:lineRule="auto"/>
+              <w:jc w:val="center"/>
+            </w:pPr>
+            <w:r>
+              <w:rPr>
+                <w:rFonts w:ascii="맑은 고딕" w:hAnsi="맑은 고딕" w:eastAsia="맑은 고딕" w:cs="맑은 고딕"/>
+                <w:b w:val="0"/>
+                <w:sz w:val="17"/>
+              </w:rPr>
+              <w:t>같음</w:t>
+            </w:r>
+          </w:p>
+        </w:tc>
+        <w:tc>
+          <w:tcPr>
+            <w:tcW w:type="dxa" w:w="1928"/>
+          </w:tcPr>
+          <w:p>
+            <w:pPr>
+              <w:spacing w:after="0" w:line="264" w:lineRule="auto"/>
+              <w:jc w:val="center"/>
+            </w:pPr>
+            <w:r>
+              <w:rPr>
+                <w:rFonts w:ascii="맑은 고딕" w:hAnsi="맑은 고딕" w:eastAsia="맑은 고딕" w:cs="맑은 고딕"/>
+                <w:b w:val="0"/>
+                <w:sz w:val="17"/>
+              </w:rPr>
+              <w:t>같음</w:t>
+            </w:r>
+          </w:p>
+        </w:tc>
+      </w:tr>
+      <w:tr>
+        <w:trPr>
+          <w:cantSplit/>
+        </w:trPr>
+        <w:tc>
+          <w:tcPr>
+            <w:tcW w:type="dxa" w:w="3288"/>
+          </w:tcPr>
+          <w:p>
+            <w:pPr>
+              <w:spacing w:after="0" w:line="264" w:lineRule="auto"/>
+            </w:pPr>
+            <w:r>
+              <w:rPr>
+                <w:rFonts w:ascii="맑은 고딕" w:hAnsi="맑은 고딕" w:eastAsia="맑은 고딕" w:cs="맑은 고딕"/>
+                <w:b w:val="0"/>
+                <w:sz w:val="17"/>
+              </w:rPr>
+              <w:t>Agent 질문당 Tool 호출 (평균)</w:t>
+            </w:r>
+          </w:p>
+        </w:tc>
+        <w:tc>
+          <w:tcPr>
+            <w:tcW w:type="dxa" w:w="2381"/>
+          </w:tcPr>
+          <w:p>
+            <w:pPr>
+              <w:spacing w:after="0" w:line="264" w:lineRule="auto"/>
+              <w:jc w:val="center"/>
+            </w:pPr>
+            <w:r>
+              <w:rPr>
+                <w:rFonts w:ascii="맑은 고딕" w:hAnsi="맑은 고딕" w:eastAsia="맑은 고딕" w:cs="맑은 고딕"/>
+                <w:b w:val="0"/>
+                <w:sz w:val="17"/>
+              </w:rPr>
+              <w:t>4.0 (총 80)</w:t>
+            </w:r>
+          </w:p>
+        </w:tc>
+        <w:tc>
+          <w:tcPr>
+            <w:tcW w:type="dxa" w:w="2041"/>
+          </w:tcPr>
+          <w:p>
+            <w:pPr>
+              <w:spacing w:after="0" w:line="264" w:lineRule="auto"/>
+              <w:jc w:val="center"/>
+            </w:pPr>
+            <w:r>
+              <w:rPr>
+                <w:rFonts w:ascii="맑은 고딕" w:hAnsi="맑은 고딕" w:eastAsia="맑은 고딕" w:cs="맑은 고딕"/>
+                <w:b w:val="0"/>
+                <w:sz w:val="17"/>
+              </w:rPr>
+              <w:t>4.9 (총 98)</w:t>
+            </w:r>
+          </w:p>
+        </w:tc>
+        <w:tc>
+          <w:tcPr>
+            <w:tcW w:type="dxa" w:w="1928"/>
+          </w:tcPr>
+          <w:p>
+            <w:pPr>
+              <w:spacing w:after="0" w:line="264" w:lineRule="auto"/>
+              <w:jc w:val="center"/>
+            </w:pPr>
+            <w:r>
+              <w:rPr>
+                <w:rFonts w:ascii="맑은 고딕" w:hAnsi="맑은 고딕" w:eastAsia="맑은 고딕" w:cs="맑은 고딕"/>
+                <w:b w:val="0"/>
+                <w:sz w:val="17"/>
+              </w:rPr>
+              <w:t>+1회/장면 질문</w:t>
+            </w:r>
+          </w:p>
+        </w:tc>
+      </w:tr>
+      <w:tr>
+        <w:trPr>
+          <w:cantSplit/>
+        </w:trPr>
+        <w:tc>
+          <w:tcPr>
+            <w:tcW w:type="dxa" w:w="3288"/>
+          </w:tcPr>
+          <w:p>
+            <w:pPr>
+              <w:spacing w:after="0" w:line="264" w:lineRule="auto"/>
+            </w:pPr>
+            <w:r>
+              <w:rPr>
+                <w:rFonts w:ascii="맑은 고딕" w:hAnsi="맑은 고딕" w:eastAsia="맑은 고딕" w:cs="맑은 고딕"/>
+                <w:b w:val="0"/>
+                <w:sz w:val="17"/>
+              </w:rPr>
+              <w:t>Agent LLM 호출 수 (20문항 전체)</w:t>
+            </w:r>
+          </w:p>
+        </w:tc>
+        <w:tc>
+          <w:tcPr>
+            <w:tcW w:type="dxa" w:w="2381"/>
+          </w:tcPr>
+          <w:p>
+            <w:pPr>
+              <w:spacing w:after="0" w:line="264" w:lineRule="auto"/>
+              <w:jc w:val="center"/>
+            </w:pPr>
+            <w:r>
+              <w:rPr>
+                <w:rFonts w:ascii="맑은 고딕" w:hAnsi="맑은 고딕" w:eastAsia="맑은 고딕" w:cs="맑은 고딕"/>
+                <w:b w:val="0"/>
+                <w:sz w:val="17"/>
+              </w:rPr>
+              <w:t>42</w:t>
+            </w:r>
+          </w:p>
+        </w:tc>
+        <w:tc>
+          <w:tcPr>
+            <w:tcW w:type="dxa" w:w="2041"/>
+          </w:tcPr>
+          <w:p>
+            <w:pPr>
+              <w:spacing w:after="0" w:line="264" w:lineRule="auto"/>
+              <w:jc w:val="center"/>
+            </w:pPr>
+            <w:r>
+              <w:rPr>
+                <w:rFonts w:ascii="맑은 고딕" w:hAnsi="맑은 고딕" w:eastAsia="맑은 고딕" w:cs="맑은 고딕"/>
+                <w:b w:val="0"/>
+                <w:sz w:val="17"/>
+              </w:rPr>
+              <w:t>42</w:t>
+            </w:r>
+          </w:p>
+        </w:tc>
+        <w:tc>
+          <w:tcPr>
+            <w:tcW w:type="dxa" w:w="1928"/>
+          </w:tcPr>
+          <w:p>
+            <w:pPr>
+              <w:spacing w:after="0" w:line="264" w:lineRule="auto"/>
+              <w:jc w:val="center"/>
+            </w:pPr>
+            <w:r>
+              <w:rPr>
+                <w:rFonts w:ascii="맑은 고딕" w:hAnsi="맑은 고딕" w:eastAsia="맑은 고딕" w:cs="맑은 고딕"/>
+                <w:b w:val="0"/>
+                <w:sz w:val="17"/>
+              </w:rPr>
+              <w:t>같음</w:t>
+            </w:r>
+          </w:p>
+        </w:tc>
+      </w:tr>
+      <w:tr>
+        <w:trPr>
+          <w:cantSplit/>
+        </w:trPr>
+        <w:tc>
+          <w:tcPr>
+            <w:tcW w:type="dxa" w:w="3288"/>
+          </w:tcPr>
+          <w:p>
+            <w:pPr>
+              <w:spacing w:after="0" w:line="264" w:lineRule="auto"/>
+            </w:pPr>
+            <w:r>
+              <w:rPr>
+                <w:rFonts w:ascii="맑은 고딕" w:hAnsi="맑은 고딕" w:eastAsia="맑은 고딕" w:cs="맑은 고딕"/>
+                <w:b w:val="0"/>
+                <w:sz w:val="17"/>
+              </w:rPr>
+              <w:t>Agent 입력 / 출력 토큰</w:t>
+            </w:r>
+          </w:p>
+        </w:tc>
+        <w:tc>
+          <w:tcPr>
+            <w:tcW w:type="dxa" w:w="2381"/>
+          </w:tcPr>
+          <w:p>
+            <w:pPr>
+              <w:spacing w:after="0" w:line="264" w:lineRule="auto"/>
+              <w:jc w:val="center"/>
+            </w:pPr>
+            <w:r>
+              <w:rPr>
+                <w:rFonts w:ascii="맑은 고딕" w:hAnsi="맑은 고딕" w:eastAsia="맑은 고딕" w:cs="맑은 고딕"/>
+                <w:b w:val="0"/>
+                <w:sz w:val="17"/>
+              </w:rPr>
+              <w:t>34,037 / 1,723</w:t>
+            </w:r>
+          </w:p>
+        </w:tc>
+        <w:tc>
+          <w:tcPr>
+            <w:tcW w:type="dxa" w:w="2041"/>
+          </w:tcPr>
+          <w:p>
+            <w:pPr>
+              <w:spacing w:after="0" w:line="264" w:lineRule="auto"/>
+              <w:jc w:val="center"/>
+            </w:pPr>
+            <w:r>
+              <w:rPr>
+                <w:rFonts w:ascii="맑은 고딕" w:hAnsi="맑은 고딕" w:eastAsia="맑은 고딕" w:cs="맑은 고딕"/>
+                <w:b w:val="0"/>
+                <w:sz w:val="17"/>
+              </w:rPr>
+              <w:t>33,531 / 1,719</w:t>
+            </w:r>
+          </w:p>
+        </w:tc>
+        <w:tc>
+          <w:tcPr>
+            <w:tcW w:type="dxa" w:w="1928"/>
+          </w:tcPr>
+          <w:p>
+            <w:pPr>
+              <w:spacing w:after="0" w:line="264" w:lineRule="auto"/>
+              <w:jc w:val="center"/>
+            </w:pPr>
+            <w:r>
+              <w:rPr>
+                <w:rFonts w:ascii="맑은 고딕" w:hAnsi="맑은 고딕" w:eastAsia="맑은 고딕" w:cs="맑은 고딕"/>
+                <w:b w:val="0"/>
+                <w:sz w:val="17"/>
+              </w:rPr>
+              <w:t>거의 같음</w:t>
+            </w:r>
+          </w:p>
+        </w:tc>
+      </w:tr>
+      <w:tr>
+        <w:trPr>
+          <w:cantSplit/>
+        </w:trPr>
+        <w:tc>
+          <w:tcPr>
+            <w:tcW w:type="dxa" w:w="3288"/>
+          </w:tcPr>
+          <w:p>
+            <w:pPr>
+              <w:spacing w:after="0" w:line="264" w:lineRule="auto"/>
+            </w:pPr>
+            <w:r>
+              <w:rPr>
+                <w:rFonts w:ascii="맑은 고딕" w:hAnsi="맑은 고딕" w:eastAsia="맑은 고딕" w:cs="맑은 고딕"/>
+                <w:b w:val="0"/>
+                <w:sz w:val="17"/>
+              </w:rPr>
+              <w:t>Agent 평균 / 최대 지연 (초)</w:t>
+            </w:r>
+          </w:p>
+        </w:tc>
+        <w:tc>
+          <w:tcPr>
+            <w:tcW w:type="dxa" w:w="2381"/>
+          </w:tcPr>
+          <w:p>
+            <w:pPr>
+              <w:spacing w:after="0" w:line="264" w:lineRule="auto"/>
+              <w:jc w:val="center"/>
+            </w:pPr>
+            <w:r>
+              <w:rPr>
+                <w:rFonts w:ascii="맑은 고딕" w:hAnsi="맑은 고딕" w:eastAsia="맑은 고딕" w:cs="맑은 고딕"/>
+                <w:b w:val="0"/>
+                <w:sz w:val="17"/>
+              </w:rPr>
+              <w:t>2.56 / 6.24</w:t>
+            </w:r>
+          </w:p>
+        </w:tc>
+        <w:tc>
+          <w:tcPr>
+            <w:tcW w:type="dxa" w:w="2041"/>
+          </w:tcPr>
+          <w:p>
+            <w:pPr>
+              <w:spacing w:after="0" w:line="264" w:lineRule="auto"/>
+              <w:jc w:val="center"/>
+            </w:pPr>
+            <w:r>
+              <w:rPr>
+                <w:rFonts w:ascii="맑은 고딕" w:hAnsi="맑은 고딕" w:eastAsia="맑은 고딕" w:cs="맑은 고딕"/>
+                <w:b w:val="0"/>
+                <w:sz w:val="17"/>
+              </w:rPr>
+              <w:t>2.38 / 6.00</w:t>
+            </w:r>
+          </w:p>
+        </w:tc>
+        <w:tc>
+          <w:tcPr>
+            <w:tcW w:type="dxa" w:w="1928"/>
+          </w:tcPr>
+          <w:p>
+            <w:pPr>
+              <w:spacing w:after="0" w:line="264" w:lineRule="auto"/>
+              <w:jc w:val="center"/>
+            </w:pPr>
+            <w:r>
+              <w:rPr>
+                <w:rFonts w:ascii="맑은 고딕" w:hAnsi="맑은 고딕" w:eastAsia="맑은 고딕" w:cs="맑은 고딕"/>
+                <w:b w:val="0"/>
+                <w:sz w:val="17"/>
+              </w:rPr>
+              <w:t>켠 쪽이 오히려 짧음 (우연 범위)</w:t>
             </w:r>
           </w:p>
         </w:tc>
@@ -7011,6 +7802,110 @@
       <w:pPr>
         <w:spacing w:after="40"/>
       </w:pPr>
+    </w:p>
+    <w:p>
+      <w:pPr>
+        <w:pStyle w:val="ListBullet"/>
+        <w:spacing w:after="40"/>
+      </w:pPr>
+      <w:r>
+        <w:rPr>
+          <w:rFonts w:ascii="맑은 고딕" w:hAnsi="맑은 고딕" w:eastAsia="맑은 고딕" w:cs="맑은 고딕"/>
+          <w:b/>
+          <w:sz w:val="20"/>
+        </w:rPr>
+        <w:t>1위 적중 수에는 차이가 없다.</w:t>
+      </w:r>
+      <w:r>
+        <w:rPr>
+          <w:rFonts w:ascii="맑은 고딕" w:hAnsi="맑은 고딕" w:eastAsia="맑은 고딕" w:cs="맑은 고딕"/>
+          <w:b w:val="0"/>
+          <w:sz w:val="20"/>
+        </w:rPr>
+        <w:t xml:space="preserve"> 두 실행에서 Agent가 놓친 문항이 같다. 하나는 비슷한 말을 하는 장면이 여럿이라 다른 장면을 "찾음"으로 답한 문항이고, 다른 하나는 못 찾은 화자 질문이다. 이중 첫 검색은 이 두 문항을 구하지 못했다. 정답 평가셋에서는 이 기능의 정확도 이득을 확인하지 못했다.</w:t>
+      </w:r>
+    </w:p>
+    <w:p>
+      <w:pPr>
+        <w:pStyle w:val="ListBullet"/>
+        <w:spacing w:after="40"/>
+      </w:pPr>
+      <w:r>
+        <w:rPr>
+          <w:rFonts w:ascii="맑은 고딕" w:hAnsi="맑은 고딕" w:eastAsia="맑은 고딕" w:cs="맑은 고딕"/>
+          <w:b/>
+          <w:sz w:val="20"/>
+        </w:rPr>
+        <w:t>비용은 예상대로 늘었다.</w:t>
+      </w:r>
+      <w:r>
+        <w:rPr>
+          <w:rFonts w:ascii="맑은 고딕" w:hAnsi="맑은 고딕" w:eastAsia="맑은 고딕" w:cs="맑은 고딕"/>
+          <w:b w:val="0"/>
+          <w:sz w:val="20"/>
+        </w:rPr>
+        <w:t xml:space="preserve"> 장면 질문 18개에서 검색(Tool 호출)이 1번씩 늘어 총 80회에서 98회가 됐다. LLM 호출과 토큰은 늘지 않았다. 평균 지연은 이 실행에서 오히려 짧게 나왔지만 0.2초 차이이고 질문당 1회 실행이므로 빨라졌다고 말할 수 없다.</w:t>
+      </w:r>
+    </w:p>
+    <w:p>
+      <w:pPr>
+        <w:pStyle w:val="ListBullet"/>
+        <w:spacing w:after="40"/>
+      </w:pPr>
+      <w:r>
+        <w:rPr>
+          <w:rFonts w:ascii="맑은 고딕" w:hAnsi="맑은 고딕" w:eastAsia="맑은 고딕" w:cs="맑은 고딕"/>
+          <w:b/>
+          <w:sz w:val="20"/>
+        </w:rPr>
+        <w:t>실행마다 달라지는 부분이 있다.</w:t>
+      </w:r>
+      <w:r>
+        <w:rPr>
+          <w:rFonts w:ascii="맑은 고딕" w:hAnsi="맑은 고딕" w:eastAsia="맑은 고딕" w:cs="맑은 고딕"/>
+          <w:b w:val="0"/>
+          <w:sz w:val="20"/>
+        </w:rPr>
+        <w:t xml:space="preserve"> temperature 0, seed 42로 같은 설정인데도 Router가 만든 영어 검색어가 5문항에서 두 실행 사이에 달랐다. 그래서 같은 검색어를 재사용하는 A·B의 조건 ② 수치가 A는 12 → 11, B는 상위 3개 16 → 15로 움직였다. 이중 첫 검색은 A·B에 적용되지 않으므로 이 차이는 기능의 효과가 아니라 Router 출력의 흔들림이다. Agent 결과가 바뀐 것은 반환 시점이 몇 초 달라진 2문항뿐이고 둘 다 정답 구간 안이었다.</w:t>
+      </w:r>
+    </w:p>
+    <w:p>
+      <w:pPr>
+        <w:pStyle w:val="ListBullet"/>
+        <w:spacing w:after="40"/>
+      </w:pPr>
+      <w:r>
+        <w:rPr>
+          <w:rFonts w:ascii="맑은 고딕" w:hAnsi="맑은 고딕" w:eastAsia="맑은 고딕" w:cs="맑은 고딕"/>
+          <w:b/>
+          <w:sz w:val="20"/>
+        </w:rPr>
+        <w:t>결정</w:t>
+      </w:r>
+      <w:r>
+        <w:rPr>
+          <w:rFonts w:ascii="맑은 고딕" w:hAnsi="맑은 고딕" w:eastAsia="맑은 고딕" w:cs="맑은 고딕"/>
+          <w:b w:val="0"/>
+          <w:sz w:val="20"/>
+        </w:rPr>
+        <w:t xml:space="preserve">: 정답 평가셋에서 이득이 없고 검색 비용만 늘었으므로 </w:t>
+      </w:r>
+      <w:r>
+        <w:rPr>
+          <w:rFonts w:ascii="맑은 고딕" w:hAnsi="맑은 고딕" w:eastAsia="맑은 고딕" w:cs="맑은 고딕"/>
+          <w:b/>
+          <w:sz w:val="20"/>
+        </w:rPr>
+        <w:t>기본값은 꺼짐으로 유지</w:t>
+      </w:r>
+      <w:r>
+        <w:rPr>
+          <w:rFonts w:ascii="맑은 고딕" w:hAnsi="맑은 고딕" w:eastAsia="맑은 고딕" w:cs="맑은 고딕"/>
+          <w:b w:val="0"/>
+          <w:sz w:val="20"/>
+        </w:rPr>
+        <w:t>한다. 이 평가셋 20문항 중 이중 검색이 필요한 "단어가 달라서 못 찾는" 문항은 이미 Router의 동의어 검색어로 대부분 찾고 있어서 보완 여지가 작았을 수 있다. 다만 이것은 가설이며, 마니또처럼 못 찾던 질문에서의 개선은 평가셋 밖의 직접 실행(위 표)에서만 확인했다. 효과 여부는 표본이 더 큰 평가셋이 있어야 판단할 수 있다.</w:t>
+      </w:r>
     </w:p>
     <w:p>
       <w:pPr>
@@ -7116,6 +8011,28 @@
           <w:sz w:val="20"/>
         </w:rPr>
         <w:t>: 지금은 그래프 코드가 MCP 도구를 정해진 순서로 호출하고, LLM이 도구를 고르는 방식(function calling)이 아니다. MCP를 "자료에 안전하게 접근하는 표준 통로"로 쓰는 것이며, Search Agent가 도구를 스스로 고르게 하는 것은 위 설계안의 한 부분이다.</w:t>
+      </w:r>
+    </w:p>
+    <w:p>
+      <w:pPr>
+        <w:pStyle w:val="ListBullet"/>
+        <w:spacing w:after="40"/>
+      </w:pPr>
+      <w:r>
+        <w:rPr>
+          <w:rFonts w:ascii="맑은 고딕" w:hAnsi="맑은 고딕" w:eastAsia="맑은 고딕" w:cs="맑은 고딕"/>
+          <w:b/>
+          <w:sz w:val="20"/>
+        </w:rPr>
+        <w:t>서비스가 더 복잡해지면 전환한다.</w:t>
+      </w:r>
+      <w:r>
+        <w:rPr>
+          <w:rFonts w:ascii="맑은 고딕" w:hAnsi="맑은 고딕" w:eastAsia="맑은 고딕" w:cs="맑은 고딕"/>
+          <w:b w:val="0"/>
+          <w:sz w:val="20"/>
+        </w:rPr>
+        <w:t xml:space="preserve"> 지금은 "공식 영상 자막에서 장면 하나를 찾는" 단순한 흐름이라 나누지 않았다. 다음처럼 일이 늘어나면 역할을 나눌 이유가 생긴다. ① 여러 콘텐츠 유형을 함께 탐색: 공식 영상과 라이브 아카이브처럼 데이터와 검색 방식이 다르면 콘텐츠별 Agent가 각각 검색하고 Supervisor가 결과를 합치고 중복을 없앤다(라이브 자막 데이터를 확보해야 가능한 확장). ② 여러 장면을 연결해 조사: "마니또로 자기 자신을 뽑은 뒤 결국 누구 선물을 준비했어? 장면 순서대로 정리해 줘"처럼 한 구간으로 답할 수 없으면 Search Agent가 장면을 찾고, Timeline Agent가 시간 순서와 사건 관계를 정리하고, Verification Agent가 장면 간 연결이 실제 자막으로 뒷받침되는지 검증하며, Supervisor가 부족한 정보를 추가 조사하게 한다. 이때는 하나의 장면을 찾는 서비스에서 여러 장면을 조사하고 연결하는 서비스로 바뀐다. 두 시나리오는 이번 제출에서 구현하거나 측정하지 않았다.</w:t>
       </w:r>
     </w:p>
     <w:p>
@@ -7302,7 +8219,7 @@
         <w:drawing>
           <wp:inline xmlns:a="http://schemas.openxmlformats.org/drawingml/2006/main" xmlns:pic="http://schemas.openxmlformats.org/drawingml/2006/picture">
             <wp:extent cx="5400000" cy="3375000"/>
-            <wp:docPr id="9" name="Picture 9"/>
+            <wp:docPr id="6" name="Picture 6"/>
             <wp:cNvGraphicFramePr>
               <a:graphicFrameLocks noChangeAspect="1"/>
             </wp:cNvGraphicFramePr>
@@ -7314,7 +8231,7 @@
                     <pic:cNvPicPr/>
                   </pic:nvPicPr>
                   <pic:blipFill>
-                    <a:blip r:embed="rId19"/>
+                    <a:blip r:embed="rId16"/>
                     <a:stretch>
                       <a:fillRect/>
                     </a:stretch>
@@ -7345,7 +8262,7 @@
           <w:color w:val="3C3C3C"/>
           <w:sz w:val="18"/>
         </w:rPr>
-        <w:t>그림 9. 후속 질문의 실패 사례 (이중 첫 검색을 끈 채 실행 중이던 서버). 대상 없는 "다른 장면도 있어?"에 료칸과 무관한 캠핑 영상의 "bread" 장면을 정답으로 냈다(이 서버에서 같은 입력으로 6/6번 재현). 주제를 말한 후속 질문은 정상이다.</w:t>
+        <w:t>그림 6. 후속 질문의 실패 사례 (이중 첫 검색을 끈 채 실행 중이던 서버). 대상 없는 "다른 장면도 있어?"에 료칸과 무관한 캠핑 영상의 "bread" 장면을 정답으로 냈다(이 서버에서 같은 입력으로 6/6번 재현). 주제를 말한 후속 질문은 정상이다.</w:t>
       </w:r>
     </w:p>
     <w:p>
@@ -7465,7 +8382,7 @@
           <w:b w:val="0"/>
           <w:sz w:val="20"/>
         </w:rPr>
-        <w:t>실행 순서가 고정이라 앞선 실행이 만든 캐시가 뒤 조건의 지연을 줄였을 수 있다. 청크 길이(20초, 10초 겹침)와 RRF 상수(60)도 다른 값과 비교하지 않았다.</w:t>
+        <w:t>실행 순서가 고정이라 앞선 실행이 만든 캐시가 뒤 조건의 지연을 줄였을 수 있다. 청크 길이는 10초/5초, 30초/15초, 40초/20초와 비교했으나(부록 E) 한국어 원문 조건의 검색(B)만 보았고 Agent(C)는 설정마다 다시 측정하지 않았다. RRF 상수(60)는 다른 값과 비교하지 않았다.</w:t>
       </w:r>
     </w:p>
     <w:p>
@@ -7564,50 +8481,6 @@
         <w:t>5.1 느낀점</w:t>
       </w:r>
     </w:p>
-    <w:tbl>
-      <w:tblPr>
-        <w:tblStyle w:val="TableGrid"/>
-        <w:tblW w:type="auto" w:w="0"/>
-        <w:jc w:val="center"/>
-        <w:tblLook w:firstColumn="1" w:firstRow="1" w:lastColumn="0" w:lastRow="0" w:noHBand="0" w:noVBand="1" w:val="04A0"/>
-        <w:tblCellMar>
-          <w:top w:w="90" w:type="dxa"/>
-          <w:left w:w="140" w:type="dxa"/>
-          <w:bottom w:w="90" w:type="dxa"/>
-          <w:right w:w="140" w:type="dxa"/>
-        </w:tblCellMar>
-      </w:tblPr>
-      <w:tblGrid>
-        <w:gridCol w:w="9638"/>
-      </w:tblGrid>
-      <w:tr>
-        <w:tc>
-          <w:tcPr>
-            <w:tcW w:type="dxa" w:w="9638"/>
-            <w:shd w:val="clear" w:color="auto" w:fill="FFFBE0"/>
-          </w:tcPr>
-          <w:p>
-            <w:pPr>
-              <w:spacing w:after="40"/>
-            </w:pPr>
-            <w:r>
-              <w:rPr>
-                <w:rFonts w:ascii="맑은 고딕" w:hAnsi="맑은 고딕" w:eastAsia="맑은 고딕" w:cs="맑은 고딕"/>
-                <w:b/>
-                <w:sz w:val="19"/>
-                <w:highlight w:val="yellow"/>
-              </w:rPr>
-              <w:t>[이 절은 작성자 본인의 경험으로 고쳐 쓰세요. 아래는 이 프로젝트에서 실제로 있었던 일을 바탕으로 쓴 초안입니다. 가장 막혔던 순간, 예상과 달랐던 결과, 다시 한다면 바꿀 점을 떠올리면 쓰기 쉽습니다.]</w:t>
-            </w:r>
-          </w:p>
-        </w:tc>
-      </w:tr>
-    </w:tbl>
-    <w:p>
-      <w:pPr>
-        <w:spacing w:after="40"/>
-      </w:pPr>
-    </w:p>
     <w:p>
       <w:pPr>
         <w:pStyle w:val="ListBullet"/>
@@ -7619,7 +8492,7 @@
           <w:b/>
           <w:sz w:val="20"/>
         </w:rPr>
-        <w:t>문제는 구조보다 데이터에 있었다.</w:t>
+        <w:t>같은 질문인데 답이 나올 때도, 안 나올 때도 있었다.</w:t>
       </w:r>
       <w:r>
         <w:rPr>
@@ -7627,7 +8500,7 @@
           <w:b w:val="0"/>
           <w:sz w:val="20"/>
         </w:rPr>
-        <w:t xml:space="preserve"> 검증과 재검색을 하는 Agent를 만들면 정확도가 오를 줄 알았다. 그런데 못 찾은 질문을 하나씩 열어 보니 원인은 번역 자막의 단어였다. 질문은 "마니또"인데 자막에는 "Secret Santa"로 적혀 있었다. 프롬프트와 설정을 고치자 Agent가 없는 키워드 검색(A)도 5에서 13으로 올랐다.</w:t>
+        <w:t xml:space="preserve"> 마니또 장면은 표현을 조금 바꾸면 찾기도 하고 못 찾기도 했다. 같은 설정(temperature 0, seed 42)으로 두 번 실행해도 Agent가 만든 영어 검색어가 5문항에서 달랐다. 그래서 한 번 잘 나온 결과로 "된다"고 말할 수 없었고, 결과를 볼 때마다 같은 조건에서 다시 나오는지부터 의심하게 됐다.</w:t>
       </w:r>
     </w:p>
     <w:p>
@@ -7641,7 +8514,7 @@
           <w:b/>
           <w:sz w:val="20"/>
         </w:rPr>
-        <w:t>측정해야 개선이라고 말할 수 있다.</w:t>
+        <w:t>정확도가 기대보다 낮았고, 원인을 전부 밝히지는 못했다.</w:t>
       </w:r>
       <w:r>
         <w:rPr>
@@ -7649,7 +8522,7 @@
           <w:b w:val="0"/>
           <w:sz w:val="20"/>
         </w:rPr>
-        <w:t xml:space="preserve"> 같은 설정으로 두 번 실행해도 한 문항이 달랐고, 개선한 버전(v3)은 정답 수가 그대로인데 입력 토큰은 24% 늘었다. "좋아졌다"고만 쓰면 틀리는 경우가 있어서, 무엇이 얼마나 달라졌는지 숫자로 적는 습관이 생겼다.</w:t>
+        <w:t xml:space="preserve"> 검증과 재검색을 하는 Agent를 붙이면 많이 오를 줄 알았지만 Agent는 장면 질문 18개 중 16개를 맞혔고 일반 검색(Hybrid)과의 차이는 1~5문항이었다. 이중 첫 검색을 켜도 16에서 16으로 같았다. 못 찾은 질문 하나는 Router의 영어 검색어("manitto")와 번역 자막의 단어("Secret Santa")가 달랐다는 원인을 확인했지만, 나머지 실패(비슷한 장면 중 다른 장면을 고른 경우, 못 찾은 화자 질문)는 원인을 가리지 못했다.</w:t>
       </w:r>
     </w:p>
     <w:p>
@@ -7663,7 +8536,7 @@
           <w:b/>
           <w:sz w:val="20"/>
         </w:rPr>
-        <w:t>테스트가 통과해도 실제 데이터로 봐야 한다.</w:t>
+        <w:t>다시 한다면 세 가지를 바꾸겠다.</w:t>
       </w:r>
       <w:r>
         <w:rPr>
@@ -7671,51 +8544,7 @@
           <w:b w:val="0"/>
           <w:sz w:val="20"/>
         </w:rPr>
-        <w:t xml:space="preserve"> 이중 첫 검색을 고치다가 단위 테스트는 모두 통과했는데, 실제 자막으로 실행해 보니 정답이 후보에서 밀려나 있었다. 원인을 찾고 나서야 방식을 바꿀 수 있었다.</w:t>
-      </w:r>
-    </w:p>
-    <w:p>
-      <w:pPr>
-        <w:pStyle w:val="ListBullet"/>
-        <w:spacing w:after="40"/>
-      </w:pPr>
-      <w:r>
-        <w:rPr>
-          <w:rFonts w:ascii="맑은 고딕" w:hAnsi="맑은 고딕" w:eastAsia="맑은 고딕" w:cs="맑은 고딕"/>
-          <w:b/>
-          <w:sz w:val="20"/>
-        </w:rPr>
-        <w:t>할 수 없는 것을 알려 주는 것도 기능이다.</w:t>
-      </w:r>
-      <w:r>
-        <w:rPr>
-          <w:rFonts w:ascii="맑은 고딕" w:hAnsi="맑은 고딕" w:eastAsia="맑은 고딕" w:cs="맑은 고딕"/>
-          <w:b w:val="0"/>
-          <w:sz w:val="20"/>
-        </w:rPr>
-        <w:t xml:space="preserve"> 자막에는 말한 사람이 없어서 화자는 "확인 불가"로 안내하고, 인용과 시각은 LLM이 쓰지 않고 코드가 원본에서 만들게 했다. 그 결과 근거 없이 화자를 단정한 경우가 0건이었다. 반대로 후속 질문처럼 아직 틀리는 부분은 숨기지 않고 한계로 적었다.</w:t>
-      </w:r>
-    </w:p>
-    <w:p>
-      <w:pPr>
-        <w:pStyle w:val="ListBullet"/>
-        <w:spacing w:after="40"/>
-      </w:pPr>
-      <w:r>
-        <w:rPr>
-          <w:rFonts w:ascii="맑은 고딕" w:hAnsi="맑은 고딕" w:eastAsia="맑은 고딕" w:cs="맑은 고딕"/>
-          <w:b/>
-          <w:sz w:val="20"/>
-        </w:rPr>
-        <w:t>막혔을 때는 추측보다 기록이다.</w:t>
-      </w:r>
-      <w:r>
-        <w:rPr>
-          <w:rFonts w:ascii="맑은 고딕" w:hAnsi="맑은 고딕" w:eastAsia="맑은 고딕" w:cs="맑은 고딕"/>
-          <w:b w:val="0"/>
-          <w:sz w:val="20"/>
-        </w:rPr>
-        <w:t xml:space="preserve"> Windows에서 MCP 서버가 가끔 시작에 실패했을 때, 짐작으로 고친 것은 두 번 빗나갔고 자식 프로세스의 출력을 파일로 남긴 뒤에야 원인을 좁힐 수 있었다.</w:t>
+        <w:t xml:space="preserve"> 첫째, 한 번에 여러 개를 고치지 않고 하나씩 고치고 하나씩 측정한다. v3에서는 네 가지를 한꺼번에 고쳐서 어느 변경이 효과를 냈는지 나누지 못했다. 둘째, 질문당 여러 번 실행해서 결과의 흔들림을 함께 잰다. 셋째, 기획을 달리해 여러 장면을 연결해 조사하는 더 복잡한 서비스로 잡고, 그에 맞는 Multi-Agent(Supervisor) 구조를 시험해 본다. 지금처럼 장면 하나를 찾는 서비스에서는 나누는 이점이 크지 않다고 판단했다(4.1절).</w:t>
       </w:r>
     </w:p>
     <w:p>
@@ -7742,7 +8571,7 @@
           <w:color w:val="3C3C3C"/>
           <w:sz w:val="18"/>
         </w:rPr>
-        <w:t>표 13. 이후 개선 포인트</w:t>
+        <w:t>표 14. 이후 개선 포인트</w:t>
       </w:r>
     </w:p>
     <w:tbl>
@@ -7869,7 +8698,7 @@
                 <w:b w:val="0"/>
                 <w:sz w:val="17"/>
               </w:rPr>
-              <w:t>Supervisor가 다음에 부를 Agent를 고르고 Search Agent가 MCP 도구를 스스로 고르는 구조를 환경변수로 켤 수 있게 만든다(4.1절).</w:t>
+              <w:t>지금의 단순한 "장면 하나 찾기"에서는 Multi-Agent로 바꾸지 않는다. 여러 콘텐츠 유형(영상·라이브)을 함께 탐색하거나 여러 장면을 시간 순으로 연결해 조사하는 서비스로 넓힐 때 Supervisor 구조로 전환한다(4.1절).</w:t>
             </w:r>
           </w:p>
         </w:tc>
@@ -7887,7 +8716,7 @@
                 <w:b w:val="0"/>
                 <w:sz w:val="17"/>
               </w:rPr>
-              <w:t>같은 정답 평가셋으로 정확도·지연·호출 수·토큰·재검색 횟수 비교</w:t>
+              <w:t>전환할 때 같은 평가셋으로 정확도·지연·호출 수·토큰 비교</w:t>
             </w:r>
           </w:p>
         </w:tc>
@@ -7928,7 +8757,7 @@
                 <w:b w:val="0"/>
                 <w:sz w:val="17"/>
               </w:rPr>
-              <w:t>청크 길이(지금 20초, 10초 겹침)와 RRF 상수(60)를 바꿔 비교한다. 청크 길이는 설정과 실행 스크립트가 준비되어 있다.</w:t>
+              <w:t>RRF 상수(60)를 바꿔 비교하고, 청크 길이는 Agent(C)까지 포함해 설정별로 다시 측정한다. 청크 길이를 B에서 비교한 결과는 부록 E에 있다(20초/10초 유지).</w:t>
             </w:r>
           </w:p>
         </w:tc>
@@ -7946,7 +8775,7 @@
                 <w:b w:val="0"/>
                 <w:sz w:val="17"/>
               </w:rPr>
-              <w:t>정답 평가셋에서 1위 적중 수 비교(설정별 A/B 평가)</w:t>
+              <w:t>정답 평가셋에서 1위 적중 수 비교(설정별 평가)</w:t>
             </w:r>
           </w:p>
         </w:tc>
@@ -7987,7 +8816,7 @@
                 <w:b w:val="0"/>
                 <w:sz w:val="17"/>
               </w:rPr>
-              <w:t>이중 첫 검색의 재측정과 기본값 결정, 못 찾았을 때만 "혹시 이런 뜻인가요?"라고 되묻기, Router 모델과 동의어 사전 개선.</w:t>
+              <w:t>이중 첫 검색은 정답 평가셋에서 이득이 없어 기본값 꺼짐으로 유지했다. 표본이 더 큰 평가셋으로 다시 확인, 못 찾았을 때만 "혹시 이런 뜻인가요?"라고 되묻기, Router 모델과 동의어 사전 개선.</w:t>
             </w:r>
           </w:p>
         </w:tc>
@@ -8046,7 +8875,7 @@
                 <w:b w:val="0"/>
                 <w:sz w:val="17"/>
               </w:rPr>
-              <w:t>다시 쓴 질문이 원래 맥락을 벗어나지 않았는지 코드로 점검하고, 후속 질문 전용 평가셋을 만든다.</w:t>
+              <w:t>"다른 장면도 있어?"처럼 이어서 묻는 질문은 직전 질문을 보고 검색어를 다시 쓴다. 이때 다시 쓴 검색어가 원래 질문의 주제를 벗어나지 않았는지 지금은 프롬프트로만 당부한다. 이것을 코드로 직접 검사하게 하고, 후속 질문만 모은 평가 질문을 따로 만든다.</w:t>
             </w:r>
           </w:p>
         </w:tc>
@@ -8223,7 +9052,7 @@
                 <w:b w:val="0"/>
                 <w:sz w:val="17"/>
               </w:rPr>
-              <w:t>반복 실행으로 결과의 흔들림을 재고, 확인용 질문을 따로 두고, 못 찾아야 하는 질문과 비슷한 장면이 여럿인 질문의 정답을 보완한다.</w:t>
+              <w:t>① 같은 질문을 여러 번 실행해 결과가 얼마나 흔들리는지 잰다(지금은 질문당 1회). ② 설정을 고칠 때 쓰는 질문과 최종 확인에 쓰는 질문을 나눈다(지금은 고친 뒤 같은 질문으로 다시 재서 점수가 실제보다 좋게 나올 수 있다). ③ 자막에 정답이 없어서 "못 찾음"이 맞는 질문을 만든다(지금은 없어서 이 정확도를 못 쟀다). ④ 비슷한 장면이 여러 개인 질문은 정답으로 인정할 장면을 모두 정해 둔다.</w:t>
             </w:r>
           </w:p>
         </w:tc>
@@ -8326,6 +9155,174 @@
           <w:b/>
         </w:rPr>
         <w:t>부록 A. 실행 화면 모음</w:t>
+      </w:r>
+    </w:p>
+    <w:p>
+      <w:pPr>
+        <w:keepNext/>
+        <w:spacing w:after="40"/>
+        <w:jc w:val="center"/>
+      </w:pPr>
+      <w:r>
+        <w:drawing>
+          <wp:inline xmlns:a="http://schemas.openxmlformats.org/drawingml/2006/main" xmlns:pic="http://schemas.openxmlformats.org/drawingml/2006/picture">
+            <wp:extent cx="4860000" cy="3037500"/>
+            <wp:docPr id="7" name="Picture 7"/>
+            <wp:cNvGraphicFramePr>
+              <a:graphicFrameLocks noChangeAspect="1"/>
+            </wp:cNvGraphicFramePr>
+            <a:graphic>
+              <a:graphicData uri="http://schemas.openxmlformats.org/drawingml/2006/picture">
+                <pic:pic>
+                  <pic:nvPicPr>
+                    <pic:cNvPr id="0" name="03_result_detail.png"/>
+                    <pic:cNvPicPr/>
+                  </pic:nvPicPr>
+                  <pic:blipFill>
+                    <a:blip r:embed="rId17"/>
+                    <a:stretch>
+                      <a:fillRect/>
+                    </a:stretch>
+                  </pic:blipFill>
+                  <pic:spPr>
+                    <a:xfrm>
+                      <a:off x="0" y="0"/>
+                      <a:ext cx="4860000" cy="3037500"/>
+                    </a:xfrm>
+                    <a:prstGeom prst="rect"/>
+                  </pic:spPr>
+                </pic:pic>
+              </a:graphicData>
+            </a:graphic>
+          </wp:inline>
+        </w:drawing>
+      </w:r>
+    </w:p>
+    <w:p>
+      <w:pPr>
+        <w:spacing w:after="160"/>
+        <w:jc w:val="center"/>
+      </w:pPr>
+      <w:r>
+        <w:rPr>
+          <w:rFonts w:ascii="맑은 고딕" w:hAnsi="맑은 고딕" w:eastAsia="맑은 고딕" w:cs="맑은 고딕"/>
+          <w:b w:val="0"/>
+          <w:color w:val="3C3C3C"/>
+          <w:sz w:val="18"/>
+        </w:rPr>
+        <w:t>그림 7. 결과 화면. 검증을 통과한 장면 카드(원본 자막 인용), 선택한 장면의 영상, 원본 앞뒤 자막(강조된 줄이 근거). 화자는 "확인할 수 없음"으로 안내한다.</w:t>
+      </w:r>
+    </w:p>
+    <w:p>
+      <w:pPr>
+        <w:keepNext/>
+        <w:spacing w:after="40"/>
+        <w:jc w:val="center"/>
+      </w:pPr>
+      <w:r>
+        <w:drawing>
+          <wp:inline xmlns:a="http://schemas.openxmlformats.org/drawingml/2006/main" xmlns:pic="http://schemas.openxmlformats.org/drawingml/2006/picture">
+            <wp:extent cx="4860000" cy="3037500"/>
+            <wp:docPr id="8" name="Picture 8"/>
+            <wp:cNvGraphicFramePr>
+              <a:graphicFrameLocks noChangeAspect="1"/>
+            </wp:cNvGraphicFramePr>
+            <a:graphic>
+              <a:graphicData uri="http://schemas.openxmlformats.org/drawingml/2006/picture">
+                <pic:pic>
+                  <pic:nvPicPr>
+                    <pic:cNvPr id="0" name="03b_progress_expanded.png"/>
+                    <pic:cNvPicPr/>
+                  </pic:nvPicPr>
+                  <pic:blipFill>
+                    <a:blip r:embed="rId18"/>
+                    <a:stretch>
+                      <a:fillRect/>
+                    </a:stretch>
+                  </pic:blipFill>
+                  <pic:spPr>
+                    <a:xfrm>
+                      <a:off x="0" y="0"/>
+                      <a:ext cx="4860000" cy="3037500"/>
+                    </a:xfrm>
+                    <a:prstGeom prst="rect"/>
+                  </pic:spPr>
+                </pic:pic>
+              </a:graphicData>
+            </a:graphic>
+          </wp:inline>
+        </w:drawing>
+      </w:r>
+    </w:p>
+    <w:p>
+      <w:pPr>
+        <w:spacing w:after="160"/>
+        <w:jc w:val="center"/>
+      </w:pPr>
+      <w:r>
+        <w:rPr>
+          <w:rFonts w:ascii="맑은 고딕" w:hAnsi="맑은 고딕" w:eastAsia="맑은 고딕" w:cs="맑은 고딕"/>
+          <w:b w:val="0"/>
+          <w:color w:val="3C3C3C"/>
+          <w:sz w:val="18"/>
+        </w:rPr>
+        <w:t>그림 8. Agent 진행 단계: 질문 유형 파악 1.4초 → 장면 검색 0.4초 → 원문·시점 확인 1.3초, 총 3.0초. 검증 전 결과는 화면에 나타나지 않는다.</w:t>
+      </w:r>
+    </w:p>
+    <w:p>
+      <w:pPr>
+        <w:keepNext/>
+        <w:spacing w:after="40"/>
+        <w:jc w:val="center"/>
+      </w:pPr>
+      <w:r>
+        <w:drawing>
+          <wp:inline xmlns:a="http://schemas.openxmlformats.org/drawingml/2006/main" xmlns:pic="http://schemas.openxmlformats.org/drawingml/2006/picture">
+            <wp:extent cx="4860000" cy="3037500"/>
+            <wp:docPr id="9" name="Picture 9"/>
+            <wp:cNvGraphicFramePr>
+              <a:graphicFrameLocks noChangeAspect="1"/>
+            </wp:cNvGraphicFramePr>
+            <a:graphic>
+              <a:graphicData uri="http://schemas.openxmlformats.org/drawingml/2006/picture">
+                <pic:pic>
+                  <pic:nvPicPr>
+                    <pic:cNvPr id="0" name="05_speaker_unknown.png"/>
+                    <pic:cNvPicPr/>
+                  </pic:nvPicPr>
+                  <pic:blipFill>
+                    <a:blip r:embed="rId19"/>
+                    <a:stretch>
+                      <a:fillRect/>
+                    </a:stretch>
+                  </pic:blipFill>
+                  <pic:spPr>
+                    <a:xfrm>
+                      <a:off x="0" y="0"/>
+                      <a:ext cx="4860000" cy="3037500"/>
+                    </a:xfrm>
+                    <a:prstGeom prst="rect"/>
+                  </pic:spPr>
+                </pic:pic>
+              </a:graphicData>
+            </a:graphic>
+          </wp:inline>
+        </w:drawing>
+      </w:r>
+    </w:p>
+    <w:p>
+      <w:pPr>
+        <w:spacing w:after="160"/>
+        <w:jc w:val="center"/>
+      </w:pPr>
+      <w:r>
+        <w:rPr>
+          <w:rFonts w:ascii="맑은 고딕" w:hAnsi="맑은 고딕" w:eastAsia="맑은 고딕" w:cs="맑은 고딕"/>
+          <w:b w:val="0"/>
+          <w:color w:val="3C3C3C"/>
+          <w:sz w:val="18"/>
+        </w:rPr>
+        <w:t>그림 9. 화자 질문("곰이 물고기 물고 있다고 말한 사람이 누구야?"). 장면(58:04)은 찾되 "자막만으로 화자를 확인할 수 없습니다"라고 안내하고 말한 사람을 단정하지 않는다(총 5.0초).</w:t>
       </w:r>
     </w:p>
     <w:p>
@@ -8632,7 +9629,7 @@
           <w:color w:val="3C3C3C"/>
           <w:sz w:val="18"/>
         </w:rPr>
-        <w:t>표 14. 실행·재현</w:t>
+        <w:t>표 15. 실행·재현</w:t>
       </w:r>
     </w:p>
     <w:tbl>
@@ -8977,7 +9974,7 @@
           <w:color w:val="3C3C3C"/>
           <w:sz w:val="18"/>
         </w:rPr>
-        <w:t>표 15. ADR 목록 (docs/adr/)</w:t>
+        <w:t>표 16. ADR 목록 (docs/adr/)</w:t>
       </w:r>
     </w:p>
     <w:tbl>
@@ -9522,7 +10519,22 @@
           <w:b w:val="0"/>
           <w:sz w:val="19"/>
         </w:rPr>
-        <w:t>평가에 쓴 정답 평가셋 20문항의 구성은 3.1절과 같다(장면 질문 18: 일반 13, 같은 말을 하는 장면이 여러 개인 질문 1, 화자 질문 4 / 자막으로 알 수 없는 요청 2). 질문과 정답 시점은 공개 저장소에 올리지 않는 파일에 있어 이 PC에서는 확인할 수 없다.</w:t>
+        <w:t>평가에 쓴 정답 평가셋 20문항의 구성은 3.1절과 같다(장면 질문 18: 일반 13, 같은 말을 하는 장면이 여러 개인 질문 1, 화자 질문 4 / 자막으로 알 수 없는 요청 2). 질문과 정답 시점은 평가셋 노출을 피하려고 공개 저장소와 이 보고서에 싣지 않고, 아래에는 문항별 결과만 적었다.</w:t>
+      </w:r>
+    </w:p>
+    <w:p>
+      <w:pPr>
+        <w:keepNext/>
+        <w:spacing w:after="40"/>
+      </w:pPr>
+      <w:r>
+        <w:rPr>
+          <w:rFonts w:ascii="맑은 고딕" w:hAnsi="맑은 고딕" w:eastAsia="맑은 고딕" w:cs="맑은 고딕"/>
+          <w:b/>
+          <w:color w:val="3C3C3C"/>
+          <w:sz w:val="18"/>
+        </w:rPr>
+        <w:t>표 17. 정답 평가셋 문항별 결과 (OpenAI, 질문당 1회 실행, 질문 원문과 정답 시점은 싣지 않음)</w:t>
       </w:r>
     </w:p>
     <w:tbl>
@@ -9530,35 +10542,2089 @@
         <w:tblStyle w:val="TableGrid"/>
         <w:tblW w:type="auto" w:w="0"/>
         <w:jc w:val="center"/>
+        <w:tblLayout w:type="fixed"/>
         <w:tblLook w:firstColumn="1" w:firstRow="1" w:lastColumn="0" w:lastRow="0" w:noHBand="0" w:noVBand="1" w:val="04A0"/>
         <w:tblCellMar>
-          <w:top w:w="90" w:type="dxa"/>
-          <w:left w:w="140" w:type="dxa"/>
-          <w:bottom w:w="90" w:type="dxa"/>
-          <w:right w:w="140" w:type="dxa"/>
+          <w:top w:w="50" w:type="dxa"/>
+          <w:left w:w="90" w:type="dxa"/>
+          <w:bottom w:w="50" w:type="dxa"/>
+          <w:right w:w="90" w:type="dxa"/>
         </w:tblCellMar>
       </w:tblPr>
       <w:tblGrid>
-        <w:gridCol w:w="9638"/>
+        <w:gridCol w:w="1928"/>
+        <w:gridCol w:w="1928"/>
+        <w:gridCol w:w="1928"/>
+        <w:gridCol w:w="1928"/>
+        <w:gridCol w:w="1928"/>
       </w:tblGrid>
       <w:tr>
-        <w:tc>
-          <w:tcPr>
-            <w:tcW w:type="dxa" w:w="9638"/>
-            <w:shd w:val="clear" w:color="auto" w:fill="FFFBE0"/>
-          </w:tcPr>
-          <w:p>
-            <w:pPr>
-              <w:spacing w:after="40"/>
+        <w:trPr>
+          <w:cantSplit/>
+          <w:tblHeader/>
+        </w:trPr>
+        <w:tc>
+          <w:tcPr>
+            <w:tcW w:type="dxa" w:w="794"/>
+            <w:shd w:val="clear" w:color="auto" w:fill="D9E2F3"/>
+          </w:tcPr>
+          <w:p>
+            <w:pPr>
+              <w:keepNext/>
+              <w:spacing w:after="0" w:line="264" w:lineRule="auto"/>
+              <w:jc w:val="center"/>
             </w:pPr>
             <w:r>
               <w:rPr>
                 <w:rFonts w:ascii="맑은 고딕" w:hAnsi="맑은 고딕" w:eastAsia="맑은 고딕" w:cs="맑은 고딕"/>
                 <w:b/>
-                <w:sz w:val="19"/>
-                <w:highlight w:val="yellow"/>
-              </w:rPr>
-              <w:t>[맥북에서 정답 평가셋(eval/private/gold.jsonl)의 문항 번호, 유형, 질문, 정답 영상과 시점(허용 구간)을 표로 삽입. 질문과 정답 시점을 제출 PDF에 공개할지는 본인이 정한다]</w:t>
+                <w:sz w:val="16"/>
+              </w:rPr>
+              <w:t>번호</w:t>
+            </w:r>
+          </w:p>
+        </w:tc>
+        <w:tc>
+          <w:tcPr>
+            <w:tcW w:type="dxa" w:w="2041"/>
+            <w:shd w:val="clear" w:color="auto" w:fill="D9E2F3"/>
+          </w:tcPr>
+          <w:p>
+            <w:pPr>
+              <w:keepNext/>
+              <w:spacing w:after="0" w:line="264" w:lineRule="auto"/>
+              <w:jc w:val="center"/>
+            </w:pPr>
+            <w:r>
+              <w:rPr>
+                <w:rFonts w:ascii="맑은 고딕" w:hAnsi="맑은 고딕" w:eastAsia="맑은 고딕" w:cs="맑은 고딕"/>
+                <w:b/>
+                <w:sz w:val="16"/>
+              </w:rPr>
+              <w:t>유형</w:t>
+            </w:r>
+          </w:p>
+        </w:tc>
+        <w:tc>
+          <w:tcPr>
+            <w:tcW w:type="dxa" w:w="1928"/>
+            <w:shd w:val="clear" w:color="auto" w:fill="D9E2F3"/>
+          </w:tcPr>
+          <w:p>
+            <w:pPr>
+              <w:keepNext/>
+              <w:spacing w:after="0" w:line="264" w:lineRule="auto"/>
+              <w:jc w:val="center"/>
+            </w:pPr>
+            <w:r>
+              <w:rPr>
+                <w:rFonts w:ascii="맑은 고딕" w:hAnsi="맑은 고딕" w:eastAsia="맑은 고딕" w:cs="맑은 고딕"/>
+                <w:b/>
+                <w:sz w:val="16"/>
+              </w:rPr>
+              <w:t>B Hybrid (원문)</w:t>
+            </w:r>
+          </w:p>
+        </w:tc>
+        <w:tc>
+          <w:tcPr>
+            <w:tcW w:type="dxa" w:w="2438"/>
+            <w:shd w:val="clear" w:color="auto" w:fill="D9E2F3"/>
+          </w:tcPr>
+          <w:p>
+            <w:pPr>
+              <w:keepNext/>
+              <w:spacing w:after="0" w:line="264" w:lineRule="auto"/>
+              <w:jc w:val="center"/>
+            </w:pPr>
+            <w:r>
+              <w:rPr>
+                <w:rFonts w:ascii="맑은 고딕" w:hAnsi="맑은 고딕" w:eastAsia="맑은 고딕" w:cs="맑은 고딕"/>
+                <w:b/>
+                <w:sz w:val="16"/>
+              </w:rPr>
+              <w:t>C Agent (이중 검색 끔)</w:t>
+            </w:r>
+          </w:p>
+        </w:tc>
+        <w:tc>
+          <w:tcPr>
+            <w:tcW w:type="dxa" w:w="2438"/>
+            <w:shd w:val="clear" w:color="auto" w:fill="D9E2F3"/>
+          </w:tcPr>
+          <w:p>
+            <w:pPr>
+              <w:keepNext/>
+              <w:spacing w:after="0" w:line="264" w:lineRule="auto"/>
+              <w:jc w:val="center"/>
+            </w:pPr>
+            <w:r>
+              <w:rPr>
+                <w:rFonts w:ascii="맑은 고딕" w:hAnsi="맑은 고딕" w:eastAsia="맑은 고딕" w:cs="맑은 고딕"/>
+                <w:b/>
+                <w:sz w:val="16"/>
+              </w:rPr>
+              <w:t>C Agent (이중 검색 켬)</w:t>
+            </w:r>
+          </w:p>
+        </w:tc>
+      </w:tr>
+      <w:tr>
+        <w:trPr>
+          <w:cantSplit/>
+        </w:trPr>
+        <w:tc>
+          <w:tcPr>
+            <w:tcW w:type="dxa" w:w="794"/>
+          </w:tcPr>
+          <w:p>
+            <w:pPr>
+              <w:spacing w:after="0" w:line="264" w:lineRule="auto"/>
+            </w:pPr>
+            <w:r>
+              <w:rPr>
+                <w:rFonts w:ascii="맑은 고딕" w:hAnsi="맑은 고딕" w:eastAsia="맑은 고딕" w:cs="맑은 고딕"/>
+                <w:b w:val="0"/>
+                <w:sz w:val="16"/>
+              </w:rPr>
+              <w:t>1</w:t>
+            </w:r>
+          </w:p>
+        </w:tc>
+        <w:tc>
+          <w:tcPr>
+            <w:tcW w:type="dxa" w:w="2041"/>
+          </w:tcPr>
+          <w:p>
+            <w:pPr>
+              <w:spacing w:after="0" w:line="264" w:lineRule="auto"/>
+            </w:pPr>
+            <w:r>
+              <w:rPr>
+                <w:rFonts w:ascii="맑은 고딕" w:hAnsi="맑은 고딕" w:eastAsia="맑은 고딕" w:cs="맑은 고딕"/>
+                <w:b w:val="0"/>
+                <w:sz w:val="16"/>
+              </w:rPr>
+              <w:t>직접 표현</w:t>
+            </w:r>
+          </w:p>
+        </w:tc>
+        <w:tc>
+          <w:tcPr>
+            <w:tcW w:type="dxa" w:w="1928"/>
+          </w:tcPr>
+          <w:p>
+            <w:pPr>
+              <w:spacing w:after="0" w:line="264" w:lineRule="auto"/>
+              <w:jc w:val="center"/>
+            </w:pPr>
+            <w:r>
+              <w:rPr>
+                <w:rFonts w:ascii="맑은 고딕" w:hAnsi="맑은 고딕" w:eastAsia="맑은 고딕" w:cs="맑은 고딕"/>
+                <w:b w:val="0"/>
+                <w:sz w:val="16"/>
+              </w:rPr>
+              <w:t>오답</w:t>
+            </w:r>
+          </w:p>
+        </w:tc>
+        <w:tc>
+          <w:tcPr>
+            <w:tcW w:type="dxa" w:w="2438"/>
+          </w:tcPr>
+          <w:p>
+            <w:pPr>
+              <w:spacing w:after="0" w:line="264" w:lineRule="auto"/>
+              <w:jc w:val="center"/>
+            </w:pPr>
+            <w:r>
+              <w:rPr>
+                <w:rFonts w:ascii="맑은 고딕" w:hAnsi="맑은 고딕" w:eastAsia="맑은 고딕" w:cs="맑은 고딕"/>
+                <w:b w:val="0"/>
+                <w:sz w:val="16"/>
+              </w:rPr>
+              <w:t>적중 (found)</w:t>
+            </w:r>
+          </w:p>
+        </w:tc>
+        <w:tc>
+          <w:tcPr>
+            <w:tcW w:type="dxa" w:w="2438"/>
+          </w:tcPr>
+          <w:p>
+            <w:pPr>
+              <w:spacing w:after="0" w:line="264" w:lineRule="auto"/>
+              <w:jc w:val="center"/>
+            </w:pPr>
+            <w:r>
+              <w:rPr>
+                <w:rFonts w:ascii="맑은 고딕" w:hAnsi="맑은 고딕" w:eastAsia="맑은 고딕" w:cs="맑은 고딕"/>
+                <w:b w:val="0"/>
+                <w:sz w:val="16"/>
+              </w:rPr>
+              <w:t>적중 (found)</w:t>
+            </w:r>
+          </w:p>
+        </w:tc>
+      </w:tr>
+      <w:tr>
+        <w:trPr>
+          <w:cantSplit/>
+        </w:trPr>
+        <w:tc>
+          <w:tcPr>
+            <w:tcW w:type="dxa" w:w="794"/>
+          </w:tcPr>
+          <w:p>
+            <w:pPr>
+              <w:spacing w:after="0" w:line="264" w:lineRule="auto"/>
+            </w:pPr>
+            <w:r>
+              <w:rPr>
+                <w:rFonts w:ascii="맑은 고딕" w:hAnsi="맑은 고딕" w:eastAsia="맑은 고딕" w:cs="맑은 고딕"/>
+                <w:b w:val="0"/>
+                <w:sz w:val="16"/>
+              </w:rPr>
+              <w:t>2</w:t>
+            </w:r>
+          </w:p>
+        </w:tc>
+        <w:tc>
+          <w:tcPr>
+            <w:tcW w:type="dxa" w:w="2041"/>
+          </w:tcPr>
+          <w:p>
+            <w:pPr>
+              <w:spacing w:after="0" w:line="264" w:lineRule="auto"/>
+            </w:pPr>
+            <w:r>
+              <w:rPr>
+                <w:rFonts w:ascii="맑은 고딕" w:hAnsi="맑은 고딕" w:eastAsia="맑은 고딕" w:cs="맑은 고딕"/>
+                <w:b w:val="0"/>
+                <w:sz w:val="16"/>
+              </w:rPr>
+              <w:t>직접 표현</w:t>
+            </w:r>
+          </w:p>
+        </w:tc>
+        <w:tc>
+          <w:tcPr>
+            <w:tcW w:type="dxa" w:w="1928"/>
+          </w:tcPr>
+          <w:p>
+            <w:pPr>
+              <w:spacing w:after="0" w:line="264" w:lineRule="auto"/>
+              <w:jc w:val="center"/>
+            </w:pPr>
+            <w:r>
+              <w:rPr>
+                <w:rFonts w:ascii="맑은 고딕" w:hAnsi="맑은 고딕" w:eastAsia="맑은 고딕" w:cs="맑은 고딕"/>
+                <w:b w:val="0"/>
+                <w:sz w:val="16"/>
+              </w:rPr>
+              <w:t>오답</w:t>
+            </w:r>
+          </w:p>
+        </w:tc>
+        <w:tc>
+          <w:tcPr>
+            <w:tcW w:type="dxa" w:w="2438"/>
+          </w:tcPr>
+          <w:p>
+            <w:pPr>
+              <w:spacing w:after="0" w:line="264" w:lineRule="auto"/>
+              <w:jc w:val="center"/>
+            </w:pPr>
+            <w:r>
+              <w:rPr>
+                <w:rFonts w:ascii="맑은 고딕" w:hAnsi="맑은 고딕" w:eastAsia="맑은 고딕" w:cs="맑은 고딕"/>
+                <w:b w:val="0"/>
+                <w:sz w:val="16"/>
+              </w:rPr>
+              <w:t>적중 (found)</w:t>
+            </w:r>
+          </w:p>
+        </w:tc>
+        <w:tc>
+          <w:tcPr>
+            <w:tcW w:type="dxa" w:w="2438"/>
+          </w:tcPr>
+          <w:p>
+            <w:pPr>
+              <w:spacing w:after="0" w:line="264" w:lineRule="auto"/>
+              <w:jc w:val="center"/>
+            </w:pPr>
+            <w:r>
+              <w:rPr>
+                <w:rFonts w:ascii="맑은 고딕" w:hAnsi="맑은 고딕" w:eastAsia="맑은 고딕" w:cs="맑은 고딕"/>
+                <w:b w:val="0"/>
+                <w:sz w:val="16"/>
+              </w:rPr>
+              <w:t>적중 (found)</w:t>
+            </w:r>
+          </w:p>
+        </w:tc>
+      </w:tr>
+      <w:tr>
+        <w:trPr>
+          <w:cantSplit/>
+        </w:trPr>
+        <w:tc>
+          <w:tcPr>
+            <w:tcW w:type="dxa" w:w="794"/>
+          </w:tcPr>
+          <w:p>
+            <w:pPr>
+              <w:spacing w:after="0" w:line="264" w:lineRule="auto"/>
+            </w:pPr>
+            <w:r>
+              <w:rPr>
+                <w:rFonts w:ascii="맑은 고딕" w:hAnsi="맑은 고딕" w:eastAsia="맑은 고딕" w:cs="맑은 고딕"/>
+                <w:b w:val="0"/>
+                <w:sz w:val="16"/>
+              </w:rPr>
+              <w:t>3</w:t>
+            </w:r>
+          </w:p>
+        </w:tc>
+        <w:tc>
+          <w:tcPr>
+            <w:tcW w:type="dxa" w:w="2041"/>
+          </w:tcPr>
+          <w:p>
+            <w:pPr>
+              <w:spacing w:after="0" w:line="264" w:lineRule="auto"/>
+            </w:pPr>
+            <w:r>
+              <w:rPr>
+                <w:rFonts w:ascii="맑은 고딕" w:hAnsi="맑은 고딕" w:eastAsia="맑은 고딕" w:cs="맑은 고딕"/>
+                <w:b w:val="0"/>
+                <w:sz w:val="16"/>
+              </w:rPr>
+              <w:t>바꿔 말한 표현</w:t>
+            </w:r>
+          </w:p>
+        </w:tc>
+        <w:tc>
+          <w:tcPr>
+            <w:tcW w:type="dxa" w:w="1928"/>
+          </w:tcPr>
+          <w:p>
+            <w:pPr>
+              <w:spacing w:after="0" w:line="264" w:lineRule="auto"/>
+              <w:jc w:val="center"/>
+            </w:pPr>
+            <w:r>
+              <w:rPr>
+                <w:rFonts w:ascii="맑은 고딕" w:hAnsi="맑은 고딕" w:eastAsia="맑은 고딕" w:cs="맑은 고딕"/>
+                <w:b w:val="0"/>
+                <w:sz w:val="16"/>
+              </w:rPr>
+              <w:t>오답</w:t>
+            </w:r>
+          </w:p>
+        </w:tc>
+        <w:tc>
+          <w:tcPr>
+            <w:tcW w:type="dxa" w:w="2438"/>
+          </w:tcPr>
+          <w:p>
+            <w:pPr>
+              <w:spacing w:after="0" w:line="264" w:lineRule="auto"/>
+              <w:jc w:val="center"/>
+            </w:pPr>
+            <w:r>
+              <w:rPr>
+                <w:rFonts w:ascii="맑은 고딕" w:hAnsi="맑은 고딕" w:eastAsia="맑은 고딕" w:cs="맑은 고딕"/>
+                <w:b w:val="0"/>
+                <w:sz w:val="16"/>
+              </w:rPr>
+              <w:t>적중 (found)</w:t>
+            </w:r>
+          </w:p>
+        </w:tc>
+        <w:tc>
+          <w:tcPr>
+            <w:tcW w:type="dxa" w:w="2438"/>
+          </w:tcPr>
+          <w:p>
+            <w:pPr>
+              <w:spacing w:after="0" w:line="264" w:lineRule="auto"/>
+              <w:jc w:val="center"/>
+            </w:pPr>
+            <w:r>
+              <w:rPr>
+                <w:rFonts w:ascii="맑은 고딕" w:hAnsi="맑은 고딕" w:eastAsia="맑은 고딕" w:cs="맑은 고딕"/>
+                <w:b w:val="0"/>
+                <w:sz w:val="16"/>
+              </w:rPr>
+              <w:t>적중 (found)</w:t>
+            </w:r>
+          </w:p>
+        </w:tc>
+      </w:tr>
+      <w:tr>
+        <w:trPr>
+          <w:cantSplit/>
+        </w:trPr>
+        <w:tc>
+          <w:tcPr>
+            <w:tcW w:type="dxa" w:w="794"/>
+          </w:tcPr>
+          <w:p>
+            <w:pPr>
+              <w:spacing w:after="0" w:line="264" w:lineRule="auto"/>
+            </w:pPr>
+            <w:r>
+              <w:rPr>
+                <w:rFonts w:ascii="맑은 고딕" w:hAnsi="맑은 고딕" w:eastAsia="맑은 고딕" w:cs="맑은 고딕"/>
+                <w:b w:val="0"/>
+                <w:sz w:val="16"/>
+              </w:rPr>
+              <w:t>4</w:t>
+            </w:r>
+          </w:p>
+        </w:tc>
+        <w:tc>
+          <w:tcPr>
+            <w:tcW w:type="dxa" w:w="2041"/>
+          </w:tcPr>
+          <w:p>
+            <w:pPr>
+              <w:spacing w:after="0" w:line="264" w:lineRule="auto"/>
+            </w:pPr>
+            <w:r>
+              <w:rPr>
+                <w:rFonts w:ascii="맑은 고딕" w:hAnsi="맑은 고딕" w:eastAsia="맑은 고딕" w:cs="맑은 고딕"/>
+                <w:b w:val="0"/>
+                <w:sz w:val="16"/>
+              </w:rPr>
+              <w:t>바꿔 말한 표현</w:t>
+            </w:r>
+          </w:p>
+        </w:tc>
+        <w:tc>
+          <w:tcPr>
+            <w:tcW w:type="dxa" w:w="1928"/>
+          </w:tcPr>
+          <w:p>
+            <w:pPr>
+              <w:spacing w:after="0" w:line="264" w:lineRule="auto"/>
+              <w:jc w:val="center"/>
+            </w:pPr>
+            <w:r>
+              <w:rPr>
+                <w:rFonts w:ascii="맑은 고딕" w:hAnsi="맑은 고딕" w:eastAsia="맑은 고딕" w:cs="맑은 고딕"/>
+                <w:b w:val="0"/>
+                <w:sz w:val="16"/>
+              </w:rPr>
+              <w:t>적중</w:t>
+            </w:r>
+          </w:p>
+        </w:tc>
+        <w:tc>
+          <w:tcPr>
+            <w:tcW w:type="dxa" w:w="2438"/>
+          </w:tcPr>
+          <w:p>
+            <w:pPr>
+              <w:spacing w:after="0" w:line="264" w:lineRule="auto"/>
+              <w:jc w:val="center"/>
+            </w:pPr>
+            <w:r>
+              <w:rPr>
+                <w:rFonts w:ascii="맑은 고딕" w:hAnsi="맑은 고딕" w:eastAsia="맑은 고딕" w:cs="맑은 고딕"/>
+                <w:b w:val="0"/>
+                <w:sz w:val="16"/>
+              </w:rPr>
+              <w:t>적중 (found)</w:t>
+            </w:r>
+          </w:p>
+        </w:tc>
+        <w:tc>
+          <w:tcPr>
+            <w:tcW w:type="dxa" w:w="2438"/>
+          </w:tcPr>
+          <w:p>
+            <w:pPr>
+              <w:spacing w:after="0" w:line="264" w:lineRule="auto"/>
+              <w:jc w:val="center"/>
+            </w:pPr>
+            <w:r>
+              <w:rPr>
+                <w:rFonts w:ascii="맑은 고딕" w:hAnsi="맑은 고딕" w:eastAsia="맑은 고딕" w:cs="맑은 고딕"/>
+                <w:b w:val="0"/>
+                <w:sz w:val="16"/>
+              </w:rPr>
+              <w:t>적중 (found)</w:t>
+            </w:r>
+          </w:p>
+        </w:tc>
+      </w:tr>
+      <w:tr>
+        <w:trPr>
+          <w:cantSplit/>
+        </w:trPr>
+        <w:tc>
+          <w:tcPr>
+            <w:tcW w:type="dxa" w:w="794"/>
+          </w:tcPr>
+          <w:p>
+            <w:pPr>
+              <w:spacing w:after="0" w:line="264" w:lineRule="auto"/>
+            </w:pPr>
+            <w:r>
+              <w:rPr>
+                <w:rFonts w:ascii="맑은 고딕" w:hAnsi="맑은 고딕" w:eastAsia="맑은 고딕" w:cs="맑은 고딕"/>
+                <w:b w:val="0"/>
+                <w:sz w:val="16"/>
+              </w:rPr>
+              <w:t>5</w:t>
+            </w:r>
+          </w:p>
+        </w:tc>
+        <w:tc>
+          <w:tcPr>
+            <w:tcW w:type="dxa" w:w="2041"/>
+          </w:tcPr>
+          <w:p>
+            <w:pPr>
+              <w:spacing w:after="0" w:line="264" w:lineRule="auto"/>
+            </w:pPr>
+            <w:r>
+              <w:rPr>
+                <w:rFonts w:ascii="맑은 고딕" w:hAnsi="맑은 고딕" w:eastAsia="맑은 고딕" w:cs="맑은 고딕"/>
+                <w:b w:val="0"/>
+                <w:sz w:val="16"/>
+              </w:rPr>
+              <w:t>직접 표현</w:t>
+            </w:r>
+          </w:p>
+        </w:tc>
+        <w:tc>
+          <w:tcPr>
+            <w:tcW w:type="dxa" w:w="1928"/>
+          </w:tcPr>
+          <w:p>
+            <w:pPr>
+              <w:spacing w:after="0" w:line="264" w:lineRule="auto"/>
+              <w:jc w:val="center"/>
+            </w:pPr>
+            <w:r>
+              <w:rPr>
+                <w:rFonts w:ascii="맑은 고딕" w:hAnsi="맑은 고딕" w:eastAsia="맑은 고딕" w:cs="맑은 고딕"/>
+                <w:b w:val="0"/>
+                <w:sz w:val="16"/>
+              </w:rPr>
+              <w:t>적중</w:t>
+            </w:r>
+          </w:p>
+        </w:tc>
+        <w:tc>
+          <w:tcPr>
+            <w:tcW w:type="dxa" w:w="2438"/>
+          </w:tcPr>
+          <w:p>
+            <w:pPr>
+              <w:spacing w:after="0" w:line="264" w:lineRule="auto"/>
+              <w:jc w:val="center"/>
+            </w:pPr>
+            <w:r>
+              <w:rPr>
+                <w:rFonts w:ascii="맑은 고딕" w:hAnsi="맑은 고딕" w:eastAsia="맑은 고딕" w:cs="맑은 고딕"/>
+                <w:b w:val="0"/>
+                <w:sz w:val="16"/>
+              </w:rPr>
+              <w:t>적중 (found)</w:t>
+            </w:r>
+          </w:p>
+        </w:tc>
+        <w:tc>
+          <w:tcPr>
+            <w:tcW w:type="dxa" w:w="2438"/>
+          </w:tcPr>
+          <w:p>
+            <w:pPr>
+              <w:spacing w:after="0" w:line="264" w:lineRule="auto"/>
+              <w:jc w:val="center"/>
+            </w:pPr>
+            <w:r>
+              <w:rPr>
+                <w:rFonts w:ascii="맑은 고딕" w:hAnsi="맑은 고딕" w:eastAsia="맑은 고딕" w:cs="맑은 고딕"/>
+                <w:b w:val="0"/>
+                <w:sz w:val="16"/>
+              </w:rPr>
+              <w:t>적중 (found)</w:t>
+            </w:r>
+          </w:p>
+        </w:tc>
+      </w:tr>
+      <w:tr>
+        <w:trPr>
+          <w:cantSplit/>
+        </w:trPr>
+        <w:tc>
+          <w:tcPr>
+            <w:tcW w:type="dxa" w:w="794"/>
+          </w:tcPr>
+          <w:p>
+            <w:pPr>
+              <w:spacing w:after="0" w:line="264" w:lineRule="auto"/>
+            </w:pPr>
+            <w:r>
+              <w:rPr>
+                <w:rFonts w:ascii="맑은 고딕" w:hAnsi="맑은 고딕" w:eastAsia="맑은 고딕" w:cs="맑은 고딕"/>
+                <w:b w:val="0"/>
+                <w:sz w:val="16"/>
+              </w:rPr>
+              <w:t>6</w:t>
+            </w:r>
+          </w:p>
+        </w:tc>
+        <w:tc>
+          <w:tcPr>
+            <w:tcW w:type="dxa" w:w="2041"/>
+          </w:tcPr>
+          <w:p>
+            <w:pPr>
+              <w:spacing w:after="0" w:line="264" w:lineRule="auto"/>
+            </w:pPr>
+            <w:r>
+              <w:rPr>
+                <w:rFonts w:ascii="맑은 고딕" w:hAnsi="맑은 고딕" w:eastAsia="맑은 고딕" w:cs="맑은 고딕"/>
+                <w:b w:val="0"/>
+                <w:sz w:val="16"/>
+              </w:rPr>
+              <w:t>직접 표현</w:t>
+            </w:r>
+          </w:p>
+        </w:tc>
+        <w:tc>
+          <w:tcPr>
+            <w:tcW w:type="dxa" w:w="1928"/>
+          </w:tcPr>
+          <w:p>
+            <w:pPr>
+              <w:spacing w:after="0" w:line="264" w:lineRule="auto"/>
+              <w:jc w:val="center"/>
+            </w:pPr>
+            <w:r>
+              <w:rPr>
+                <w:rFonts w:ascii="맑은 고딕" w:hAnsi="맑은 고딕" w:eastAsia="맑은 고딕" w:cs="맑은 고딕"/>
+                <w:b w:val="0"/>
+                <w:sz w:val="16"/>
+              </w:rPr>
+              <w:t>적중</w:t>
+            </w:r>
+          </w:p>
+        </w:tc>
+        <w:tc>
+          <w:tcPr>
+            <w:tcW w:type="dxa" w:w="2438"/>
+          </w:tcPr>
+          <w:p>
+            <w:pPr>
+              <w:spacing w:after="0" w:line="264" w:lineRule="auto"/>
+              <w:jc w:val="center"/>
+            </w:pPr>
+            <w:r>
+              <w:rPr>
+                <w:rFonts w:ascii="맑은 고딕" w:hAnsi="맑은 고딕" w:eastAsia="맑은 고딕" w:cs="맑은 고딕"/>
+                <w:b w:val="0"/>
+                <w:sz w:val="16"/>
+              </w:rPr>
+              <w:t>적중 (found)</w:t>
+            </w:r>
+          </w:p>
+        </w:tc>
+        <w:tc>
+          <w:tcPr>
+            <w:tcW w:type="dxa" w:w="2438"/>
+          </w:tcPr>
+          <w:p>
+            <w:pPr>
+              <w:spacing w:after="0" w:line="264" w:lineRule="auto"/>
+              <w:jc w:val="center"/>
+            </w:pPr>
+            <w:r>
+              <w:rPr>
+                <w:rFonts w:ascii="맑은 고딕" w:hAnsi="맑은 고딕" w:eastAsia="맑은 고딕" w:cs="맑은 고딕"/>
+                <w:b w:val="0"/>
+                <w:sz w:val="16"/>
+              </w:rPr>
+              <w:t>적중 (found)</w:t>
+            </w:r>
+          </w:p>
+        </w:tc>
+      </w:tr>
+      <w:tr>
+        <w:trPr>
+          <w:cantSplit/>
+        </w:trPr>
+        <w:tc>
+          <w:tcPr>
+            <w:tcW w:type="dxa" w:w="794"/>
+          </w:tcPr>
+          <w:p>
+            <w:pPr>
+              <w:spacing w:after="0" w:line="264" w:lineRule="auto"/>
+            </w:pPr>
+            <w:r>
+              <w:rPr>
+                <w:rFonts w:ascii="맑은 고딕" w:hAnsi="맑은 고딕" w:eastAsia="맑은 고딕" w:cs="맑은 고딕"/>
+                <w:b w:val="0"/>
+                <w:sz w:val="16"/>
+              </w:rPr>
+              <w:t>7</w:t>
+            </w:r>
+          </w:p>
+        </w:tc>
+        <w:tc>
+          <w:tcPr>
+            <w:tcW w:type="dxa" w:w="2041"/>
+          </w:tcPr>
+          <w:p>
+            <w:pPr>
+              <w:spacing w:after="0" w:line="264" w:lineRule="auto"/>
+            </w:pPr>
+            <w:r>
+              <w:rPr>
+                <w:rFonts w:ascii="맑은 고딕" w:hAnsi="맑은 고딕" w:eastAsia="맑은 고딕" w:cs="맑은 고딕"/>
+                <w:b w:val="0"/>
+                <w:sz w:val="16"/>
+              </w:rPr>
+              <w:t>바꿔 말한 표현</w:t>
+            </w:r>
+          </w:p>
+        </w:tc>
+        <w:tc>
+          <w:tcPr>
+            <w:tcW w:type="dxa" w:w="1928"/>
+          </w:tcPr>
+          <w:p>
+            <w:pPr>
+              <w:spacing w:after="0" w:line="264" w:lineRule="auto"/>
+              <w:jc w:val="center"/>
+            </w:pPr>
+            <w:r>
+              <w:rPr>
+                <w:rFonts w:ascii="맑은 고딕" w:hAnsi="맑은 고딕" w:eastAsia="맑은 고딕" w:cs="맑은 고딕"/>
+                <w:b w:val="0"/>
+                <w:sz w:val="16"/>
+              </w:rPr>
+              <w:t>적중</w:t>
+            </w:r>
+          </w:p>
+        </w:tc>
+        <w:tc>
+          <w:tcPr>
+            <w:tcW w:type="dxa" w:w="2438"/>
+          </w:tcPr>
+          <w:p>
+            <w:pPr>
+              <w:spacing w:after="0" w:line="264" w:lineRule="auto"/>
+              <w:jc w:val="center"/>
+            </w:pPr>
+            <w:r>
+              <w:rPr>
+                <w:rFonts w:ascii="맑은 고딕" w:hAnsi="맑은 고딕" w:eastAsia="맑은 고딕" w:cs="맑은 고딕"/>
+                <w:b w:val="0"/>
+                <w:sz w:val="16"/>
+              </w:rPr>
+              <w:t>적중 (found)</w:t>
+            </w:r>
+          </w:p>
+        </w:tc>
+        <w:tc>
+          <w:tcPr>
+            <w:tcW w:type="dxa" w:w="2438"/>
+          </w:tcPr>
+          <w:p>
+            <w:pPr>
+              <w:spacing w:after="0" w:line="264" w:lineRule="auto"/>
+              <w:jc w:val="center"/>
+            </w:pPr>
+            <w:r>
+              <w:rPr>
+                <w:rFonts w:ascii="맑은 고딕" w:hAnsi="맑은 고딕" w:eastAsia="맑은 고딕" w:cs="맑은 고딕"/>
+                <w:b w:val="0"/>
+                <w:sz w:val="16"/>
+              </w:rPr>
+              <w:t>적중 (found)</w:t>
+            </w:r>
+          </w:p>
+        </w:tc>
+      </w:tr>
+      <w:tr>
+        <w:trPr>
+          <w:cantSplit/>
+        </w:trPr>
+        <w:tc>
+          <w:tcPr>
+            <w:tcW w:type="dxa" w:w="794"/>
+          </w:tcPr>
+          <w:p>
+            <w:pPr>
+              <w:spacing w:after="0" w:line="264" w:lineRule="auto"/>
+            </w:pPr>
+            <w:r>
+              <w:rPr>
+                <w:rFonts w:ascii="맑은 고딕" w:hAnsi="맑은 고딕" w:eastAsia="맑은 고딕" w:cs="맑은 고딕"/>
+                <w:b w:val="0"/>
+                <w:sz w:val="16"/>
+              </w:rPr>
+              <w:t>8</w:t>
+            </w:r>
+          </w:p>
+        </w:tc>
+        <w:tc>
+          <w:tcPr>
+            <w:tcW w:type="dxa" w:w="2041"/>
+          </w:tcPr>
+          <w:p>
+            <w:pPr>
+              <w:spacing w:after="0" w:line="264" w:lineRule="auto"/>
+            </w:pPr>
+            <w:r>
+              <w:rPr>
+                <w:rFonts w:ascii="맑은 고딕" w:hAnsi="맑은 고딕" w:eastAsia="맑은 고딕" w:cs="맑은 고딕"/>
+                <w:b w:val="0"/>
+                <w:sz w:val="16"/>
+              </w:rPr>
+              <w:t>바꿔 말한 표현</w:t>
+            </w:r>
+          </w:p>
+        </w:tc>
+        <w:tc>
+          <w:tcPr>
+            <w:tcW w:type="dxa" w:w="1928"/>
+          </w:tcPr>
+          <w:p>
+            <w:pPr>
+              <w:spacing w:after="0" w:line="264" w:lineRule="auto"/>
+              <w:jc w:val="center"/>
+            </w:pPr>
+            <w:r>
+              <w:rPr>
+                <w:rFonts w:ascii="맑은 고딕" w:hAnsi="맑은 고딕" w:eastAsia="맑은 고딕" w:cs="맑은 고딕"/>
+                <w:b w:val="0"/>
+                <w:sz w:val="16"/>
+              </w:rPr>
+              <w:t>오답</w:t>
+            </w:r>
+          </w:p>
+        </w:tc>
+        <w:tc>
+          <w:tcPr>
+            <w:tcW w:type="dxa" w:w="2438"/>
+          </w:tcPr>
+          <w:p>
+            <w:pPr>
+              <w:spacing w:after="0" w:line="264" w:lineRule="auto"/>
+              <w:jc w:val="center"/>
+            </w:pPr>
+            <w:r>
+              <w:rPr>
+                <w:rFonts w:ascii="맑은 고딕" w:hAnsi="맑은 고딕" w:eastAsia="맑은 고딕" w:cs="맑은 고딕"/>
+                <w:b w:val="0"/>
+                <w:sz w:val="16"/>
+              </w:rPr>
+              <w:t>적중 (found)</w:t>
+            </w:r>
+          </w:p>
+        </w:tc>
+        <w:tc>
+          <w:tcPr>
+            <w:tcW w:type="dxa" w:w="2438"/>
+          </w:tcPr>
+          <w:p>
+            <w:pPr>
+              <w:spacing w:after="0" w:line="264" w:lineRule="auto"/>
+              <w:jc w:val="center"/>
+            </w:pPr>
+            <w:r>
+              <w:rPr>
+                <w:rFonts w:ascii="맑은 고딕" w:hAnsi="맑은 고딕" w:eastAsia="맑은 고딕" w:cs="맑은 고딕"/>
+                <w:b w:val="0"/>
+                <w:sz w:val="16"/>
+              </w:rPr>
+              <w:t>적중 (found)</w:t>
+            </w:r>
+          </w:p>
+        </w:tc>
+      </w:tr>
+      <w:tr>
+        <w:trPr>
+          <w:cantSplit/>
+        </w:trPr>
+        <w:tc>
+          <w:tcPr>
+            <w:tcW w:type="dxa" w:w="794"/>
+          </w:tcPr>
+          <w:p>
+            <w:pPr>
+              <w:spacing w:after="0" w:line="264" w:lineRule="auto"/>
+            </w:pPr>
+            <w:r>
+              <w:rPr>
+                <w:rFonts w:ascii="맑은 고딕" w:hAnsi="맑은 고딕" w:eastAsia="맑은 고딕" w:cs="맑은 고딕"/>
+                <w:b w:val="0"/>
+                <w:sz w:val="16"/>
+              </w:rPr>
+              <w:t>9</w:t>
+            </w:r>
+          </w:p>
+        </w:tc>
+        <w:tc>
+          <w:tcPr>
+            <w:tcW w:type="dxa" w:w="2041"/>
+          </w:tcPr>
+          <w:p>
+            <w:pPr>
+              <w:spacing w:after="0" w:line="264" w:lineRule="auto"/>
+            </w:pPr>
+            <w:r>
+              <w:rPr>
+                <w:rFonts w:ascii="맑은 고딕" w:hAnsi="맑은 고딕" w:eastAsia="맑은 고딕" w:cs="맑은 고딕"/>
+                <w:b w:val="0"/>
+                <w:sz w:val="16"/>
+              </w:rPr>
+              <w:t>바꿔 말한 표현</w:t>
+            </w:r>
+          </w:p>
+        </w:tc>
+        <w:tc>
+          <w:tcPr>
+            <w:tcW w:type="dxa" w:w="1928"/>
+          </w:tcPr>
+          <w:p>
+            <w:pPr>
+              <w:spacing w:after="0" w:line="264" w:lineRule="auto"/>
+              <w:jc w:val="center"/>
+            </w:pPr>
+            <w:r>
+              <w:rPr>
+                <w:rFonts w:ascii="맑은 고딕" w:hAnsi="맑은 고딕" w:eastAsia="맑은 고딕" w:cs="맑은 고딕"/>
+                <w:b w:val="0"/>
+                <w:sz w:val="16"/>
+              </w:rPr>
+              <w:t>오답</w:t>
+            </w:r>
+          </w:p>
+        </w:tc>
+        <w:tc>
+          <w:tcPr>
+            <w:tcW w:type="dxa" w:w="2438"/>
+          </w:tcPr>
+          <w:p>
+            <w:pPr>
+              <w:spacing w:after="0" w:line="264" w:lineRule="auto"/>
+              <w:jc w:val="center"/>
+            </w:pPr>
+            <w:r>
+              <w:rPr>
+                <w:rFonts w:ascii="맑은 고딕" w:hAnsi="맑은 고딕" w:eastAsia="맑은 고딕" w:cs="맑은 고딕"/>
+                <w:b w:val="0"/>
+                <w:sz w:val="16"/>
+              </w:rPr>
+              <w:t>오답 (found)</w:t>
+            </w:r>
+          </w:p>
+        </w:tc>
+        <w:tc>
+          <w:tcPr>
+            <w:tcW w:type="dxa" w:w="2438"/>
+          </w:tcPr>
+          <w:p>
+            <w:pPr>
+              <w:spacing w:after="0" w:line="264" w:lineRule="auto"/>
+              <w:jc w:val="center"/>
+            </w:pPr>
+            <w:r>
+              <w:rPr>
+                <w:rFonts w:ascii="맑은 고딕" w:hAnsi="맑은 고딕" w:eastAsia="맑은 고딕" w:cs="맑은 고딕"/>
+                <w:b w:val="0"/>
+                <w:sz w:val="16"/>
+              </w:rPr>
+              <w:t>오답 (found)</w:t>
+            </w:r>
+          </w:p>
+        </w:tc>
+      </w:tr>
+      <w:tr>
+        <w:trPr>
+          <w:cantSplit/>
+        </w:trPr>
+        <w:tc>
+          <w:tcPr>
+            <w:tcW w:type="dxa" w:w="794"/>
+          </w:tcPr>
+          <w:p>
+            <w:pPr>
+              <w:spacing w:after="0" w:line="264" w:lineRule="auto"/>
+            </w:pPr>
+            <w:r>
+              <w:rPr>
+                <w:rFonts w:ascii="맑은 고딕" w:hAnsi="맑은 고딕" w:eastAsia="맑은 고딕" w:cs="맑은 고딕"/>
+                <w:b w:val="0"/>
+                <w:sz w:val="16"/>
+              </w:rPr>
+              <w:t>10</w:t>
+            </w:r>
+          </w:p>
+        </w:tc>
+        <w:tc>
+          <w:tcPr>
+            <w:tcW w:type="dxa" w:w="2041"/>
+          </w:tcPr>
+          <w:p>
+            <w:pPr>
+              <w:spacing w:after="0" w:line="264" w:lineRule="auto"/>
+            </w:pPr>
+            <w:r>
+              <w:rPr>
+                <w:rFonts w:ascii="맑은 고딕" w:hAnsi="맑은 고딕" w:eastAsia="맑은 고딕" w:cs="맑은 고딕"/>
+                <w:b w:val="0"/>
+                <w:sz w:val="16"/>
+              </w:rPr>
+              <w:t>화면 편집 설명</w:t>
+            </w:r>
+          </w:p>
+        </w:tc>
+        <w:tc>
+          <w:tcPr>
+            <w:tcW w:type="dxa" w:w="1928"/>
+          </w:tcPr>
+          <w:p>
+            <w:pPr>
+              <w:spacing w:after="0" w:line="264" w:lineRule="auto"/>
+              <w:jc w:val="center"/>
+            </w:pPr>
+            <w:r>
+              <w:rPr>
+                <w:rFonts w:ascii="맑은 고딕" w:hAnsi="맑은 고딕" w:eastAsia="맑은 고딕" w:cs="맑은 고딕"/>
+                <w:b w:val="0"/>
+                <w:sz w:val="16"/>
+              </w:rPr>
+              <w:t>적중</w:t>
+            </w:r>
+          </w:p>
+        </w:tc>
+        <w:tc>
+          <w:tcPr>
+            <w:tcW w:type="dxa" w:w="2438"/>
+          </w:tcPr>
+          <w:p>
+            <w:pPr>
+              <w:spacing w:after="0" w:line="264" w:lineRule="auto"/>
+              <w:jc w:val="center"/>
+            </w:pPr>
+            <w:r>
+              <w:rPr>
+                <w:rFonts w:ascii="맑은 고딕" w:hAnsi="맑은 고딕" w:eastAsia="맑은 고딕" w:cs="맑은 고딕"/>
+                <w:b w:val="0"/>
+                <w:sz w:val="16"/>
+              </w:rPr>
+              <w:t>적중 (found)</w:t>
+            </w:r>
+          </w:p>
+        </w:tc>
+        <w:tc>
+          <w:tcPr>
+            <w:tcW w:type="dxa" w:w="2438"/>
+          </w:tcPr>
+          <w:p>
+            <w:pPr>
+              <w:spacing w:after="0" w:line="264" w:lineRule="auto"/>
+              <w:jc w:val="center"/>
+            </w:pPr>
+            <w:r>
+              <w:rPr>
+                <w:rFonts w:ascii="맑은 고딕" w:hAnsi="맑은 고딕" w:eastAsia="맑은 고딕" w:cs="맑은 고딕"/>
+                <w:b w:val="0"/>
+                <w:sz w:val="16"/>
+              </w:rPr>
+              <w:t>적중 (found)</w:t>
+            </w:r>
+          </w:p>
+        </w:tc>
+      </w:tr>
+      <w:tr>
+        <w:trPr>
+          <w:cantSplit/>
+        </w:trPr>
+        <w:tc>
+          <w:tcPr>
+            <w:tcW w:type="dxa" w:w="794"/>
+          </w:tcPr>
+          <w:p>
+            <w:pPr>
+              <w:spacing w:after="0" w:line="264" w:lineRule="auto"/>
+            </w:pPr>
+            <w:r>
+              <w:rPr>
+                <w:rFonts w:ascii="맑은 고딕" w:hAnsi="맑은 고딕" w:eastAsia="맑은 고딕" w:cs="맑은 고딕"/>
+                <w:b w:val="0"/>
+                <w:sz w:val="16"/>
+              </w:rPr>
+              <w:t>11</w:t>
+            </w:r>
+          </w:p>
+        </w:tc>
+        <w:tc>
+          <w:tcPr>
+            <w:tcW w:type="dxa" w:w="2041"/>
+          </w:tcPr>
+          <w:p>
+            <w:pPr>
+              <w:spacing w:after="0" w:line="264" w:lineRule="auto"/>
+            </w:pPr>
+            <w:r>
+              <w:rPr>
+                <w:rFonts w:ascii="맑은 고딕" w:hAnsi="맑은 고딕" w:eastAsia="맑은 고딕" w:cs="맑은 고딕"/>
+                <w:b w:val="0"/>
+                <w:sz w:val="16"/>
+              </w:rPr>
+              <w:t>화면 편집 설명</w:t>
+            </w:r>
+          </w:p>
+        </w:tc>
+        <w:tc>
+          <w:tcPr>
+            <w:tcW w:type="dxa" w:w="1928"/>
+          </w:tcPr>
+          <w:p>
+            <w:pPr>
+              <w:spacing w:after="0" w:line="264" w:lineRule="auto"/>
+              <w:jc w:val="center"/>
+            </w:pPr>
+            <w:r>
+              <w:rPr>
+                <w:rFonts w:ascii="맑은 고딕" w:hAnsi="맑은 고딕" w:eastAsia="맑은 고딕" w:cs="맑은 고딕"/>
+                <w:b w:val="0"/>
+                <w:sz w:val="16"/>
+              </w:rPr>
+              <w:t>적중</w:t>
+            </w:r>
+          </w:p>
+        </w:tc>
+        <w:tc>
+          <w:tcPr>
+            <w:tcW w:type="dxa" w:w="2438"/>
+          </w:tcPr>
+          <w:p>
+            <w:pPr>
+              <w:spacing w:after="0" w:line="264" w:lineRule="auto"/>
+              <w:jc w:val="center"/>
+            </w:pPr>
+            <w:r>
+              <w:rPr>
+                <w:rFonts w:ascii="맑은 고딕" w:hAnsi="맑은 고딕" w:eastAsia="맑은 고딕" w:cs="맑은 고딕"/>
+                <w:b w:val="0"/>
+                <w:sz w:val="16"/>
+              </w:rPr>
+              <w:t>적중 (found)</w:t>
+            </w:r>
+          </w:p>
+        </w:tc>
+        <w:tc>
+          <w:tcPr>
+            <w:tcW w:type="dxa" w:w="2438"/>
+          </w:tcPr>
+          <w:p>
+            <w:pPr>
+              <w:spacing w:after="0" w:line="264" w:lineRule="auto"/>
+              <w:jc w:val="center"/>
+            </w:pPr>
+            <w:r>
+              <w:rPr>
+                <w:rFonts w:ascii="맑은 고딕" w:hAnsi="맑은 고딕" w:eastAsia="맑은 고딕" w:cs="맑은 고딕"/>
+                <w:b w:val="0"/>
+                <w:sz w:val="16"/>
+              </w:rPr>
+              <w:t>적중 (found)</w:t>
+            </w:r>
+          </w:p>
+        </w:tc>
+      </w:tr>
+      <w:tr>
+        <w:trPr>
+          <w:cantSplit/>
+        </w:trPr>
+        <w:tc>
+          <w:tcPr>
+            <w:tcW w:type="dxa" w:w="794"/>
+          </w:tcPr>
+          <w:p>
+            <w:pPr>
+              <w:spacing w:after="0" w:line="264" w:lineRule="auto"/>
+            </w:pPr>
+            <w:r>
+              <w:rPr>
+                <w:rFonts w:ascii="맑은 고딕" w:hAnsi="맑은 고딕" w:eastAsia="맑은 고딕" w:cs="맑은 고딕"/>
+                <w:b w:val="0"/>
+                <w:sz w:val="16"/>
+              </w:rPr>
+              <w:t>12</w:t>
+            </w:r>
+          </w:p>
+        </w:tc>
+        <w:tc>
+          <w:tcPr>
+            <w:tcW w:type="dxa" w:w="2041"/>
+          </w:tcPr>
+          <w:p>
+            <w:pPr>
+              <w:spacing w:after="0" w:line="264" w:lineRule="auto"/>
+            </w:pPr>
+            <w:r>
+              <w:rPr>
+                <w:rFonts w:ascii="맑은 고딕" w:hAnsi="맑은 고딕" w:eastAsia="맑은 고딕" w:cs="맑은 고딕"/>
+                <w:b w:val="0"/>
+                <w:sz w:val="16"/>
+              </w:rPr>
+              <w:t>화면 편집 설명</w:t>
+            </w:r>
+          </w:p>
+        </w:tc>
+        <w:tc>
+          <w:tcPr>
+            <w:tcW w:type="dxa" w:w="1928"/>
+          </w:tcPr>
+          <w:p>
+            <w:pPr>
+              <w:spacing w:after="0" w:line="264" w:lineRule="auto"/>
+              <w:jc w:val="center"/>
+            </w:pPr>
+            <w:r>
+              <w:rPr>
+                <w:rFonts w:ascii="맑은 고딕" w:hAnsi="맑은 고딕" w:eastAsia="맑은 고딕" w:cs="맑은 고딕"/>
+                <w:b w:val="0"/>
+                <w:sz w:val="16"/>
+              </w:rPr>
+              <w:t>적중</w:t>
+            </w:r>
+          </w:p>
+        </w:tc>
+        <w:tc>
+          <w:tcPr>
+            <w:tcW w:type="dxa" w:w="2438"/>
+          </w:tcPr>
+          <w:p>
+            <w:pPr>
+              <w:spacing w:after="0" w:line="264" w:lineRule="auto"/>
+              <w:jc w:val="center"/>
+            </w:pPr>
+            <w:r>
+              <w:rPr>
+                <w:rFonts w:ascii="맑은 고딕" w:hAnsi="맑은 고딕" w:eastAsia="맑은 고딕" w:cs="맑은 고딕"/>
+                <w:b w:val="0"/>
+                <w:sz w:val="16"/>
+              </w:rPr>
+              <w:t>적중 (found)</w:t>
+            </w:r>
+          </w:p>
+        </w:tc>
+        <w:tc>
+          <w:tcPr>
+            <w:tcW w:type="dxa" w:w="2438"/>
+          </w:tcPr>
+          <w:p>
+            <w:pPr>
+              <w:spacing w:after="0" w:line="264" w:lineRule="auto"/>
+              <w:jc w:val="center"/>
+            </w:pPr>
+            <w:r>
+              <w:rPr>
+                <w:rFonts w:ascii="맑은 고딕" w:hAnsi="맑은 고딕" w:eastAsia="맑은 고딕" w:cs="맑은 고딕"/>
+                <w:b w:val="0"/>
+                <w:sz w:val="16"/>
+              </w:rPr>
+              <w:t>적중 (found)</w:t>
+            </w:r>
+          </w:p>
+        </w:tc>
+      </w:tr>
+      <w:tr>
+        <w:trPr>
+          <w:cantSplit/>
+        </w:trPr>
+        <w:tc>
+          <w:tcPr>
+            <w:tcW w:type="dxa" w:w="794"/>
+          </w:tcPr>
+          <w:p>
+            <w:pPr>
+              <w:spacing w:after="0" w:line="264" w:lineRule="auto"/>
+            </w:pPr>
+            <w:r>
+              <w:rPr>
+                <w:rFonts w:ascii="맑은 고딕" w:hAnsi="맑은 고딕" w:eastAsia="맑은 고딕" w:cs="맑은 고딕"/>
+                <w:b w:val="0"/>
+                <w:sz w:val="16"/>
+              </w:rPr>
+              <w:t>13</w:t>
+            </w:r>
+          </w:p>
+        </w:tc>
+        <w:tc>
+          <w:tcPr>
+            <w:tcW w:type="dxa" w:w="2041"/>
+          </w:tcPr>
+          <w:p>
+            <w:pPr>
+              <w:spacing w:after="0" w:line="264" w:lineRule="auto"/>
+            </w:pPr>
+            <w:r>
+              <w:rPr>
+                <w:rFonts w:ascii="맑은 고딕" w:hAnsi="맑은 고딕" w:eastAsia="맑은 고딕" w:cs="맑은 고딕"/>
+                <w:b w:val="0"/>
+                <w:sz w:val="16"/>
+              </w:rPr>
+              <w:t>바꿔 말한 표현</w:t>
+            </w:r>
+          </w:p>
+        </w:tc>
+        <w:tc>
+          <w:tcPr>
+            <w:tcW w:type="dxa" w:w="1928"/>
+          </w:tcPr>
+          <w:p>
+            <w:pPr>
+              <w:spacing w:after="0" w:line="264" w:lineRule="auto"/>
+              <w:jc w:val="center"/>
+            </w:pPr>
+            <w:r>
+              <w:rPr>
+                <w:rFonts w:ascii="맑은 고딕" w:hAnsi="맑은 고딕" w:eastAsia="맑은 고딕" w:cs="맑은 고딕"/>
+                <w:b w:val="0"/>
+                <w:sz w:val="16"/>
+              </w:rPr>
+              <w:t>적중</w:t>
+            </w:r>
+          </w:p>
+        </w:tc>
+        <w:tc>
+          <w:tcPr>
+            <w:tcW w:type="dxa" w:w="2438"/>
+          </w:tcPr>
+          <w:p>
+            <w:pPr>
+              <w:spacing w:after="0" w:line="264" w:lineRule="auto"/>
+              <w:jc w:val="center"/>
+            </w:pPr>
+            <w:r>
+              <w:rPr>
+                <w:rFonts w:ascii="맑은 고딕" w:hAnsi="맑은 고딕" w:eastAsia="맑은 고딕" w:cs="맑은 고딕"/>
+                <w:b w:val="0"/>
+                <w:sz w:val="16"/>
+              </w:rPr>
+              <w:t>적중 (found)</w:t>
+            </w:r>
+          </w:p>
+        </w:tc>
+        <w:tc>
+          <w:tcPr>
+            <w:tcW w:type="dxa" w:w="2438"/>
+          </w:tcPr>
+          <w:p>
+            <w:pPr>
+              <w:spacing w:after="0" w:line="264" w:lineRule="auto"/>
+              <w:jc w:val="center"/>
+            </w:pPr>
+            <w:r>
+              <w:rPr>
+                <w:rFonts w:ascii="맑은 고딕" w:hAnsi="맑은 고딕" w:eastAsia="맑은 고딕" w:cs="맑은 고딕"/>
+                <w:b w:val="0"/>
+                <w:sz w:val="16"/>
+              </w:rPr>
+              <w:t>적중 (found)</w:t>
+            </w:r>
+          </w:p>
+        </w:tc>
+      </w:tr>
+      <w:tr>
+        <w:trPr>
+          <w:cantSplit/>
+        </w:trPr>
+        <w:tc>
+          <w:tcPr>
+            <w:tcW w:type="dxa" w:w="794"/>
+          </w:tcPr>
+          <w:p>
+            <w:pPr>
+              <w:spacing w:after="0" w:line="264" w:lineRule="auto"/>
+            </w:pPr>
+            <w:r>
+              <w:rPr>
+                <w:rFonts w:ascii="맑은 고딕" w:hAnsi="맑은 고딕" w:eastAsia="맑은 고딕" w:cs="맑은 고딕"/>
+                <w:b w:val="0"/>
+                <w:sz w:val="16"/>
+              </w:rPr>
+              <w:t>14</w:t>
+            </w:r>
+          </w:p>
+        </w:tc>
+        <w:tc>
+          <w:tcPr>
+            <w:tcW w:type="dxa" w:w="2041"/>
+          </w:tcPr>
+          <w:p>
+            <w:pPr>
+              <w:spacing w:after="0" w:line="264" w:lineRule="auto"/>
+            </w:pPr>
+            <w:r>
+              <w:rPr>
+                <w:rFonts w:ascii="맑은 고딕" w:hAnsi="맑은 고딕" w:eastAsia="맑은 고딕" w:cs="맑은 고딕"/>
+                <w:b w:val="0"/>
+                <w:sz w:val="16"/>
+              </w:rPr>
+              <w:t>비슷한 장면 여럿</w:t>
+            </w:r>
+          </w:p>
+        </w:tc>
+        <w:tc>
+          <w:tcPr>
+            <w:tcW w:type="dxa" w:w="1928"/>
+          </w:tcPr>
+          <w:p>
+            <w:pPr>
+              <w:spacing w:after="0" w:line="264" w:lineRule="auto"/>
+              <w:jc w:val="center"/>
+            </w:pPr>
+            <w:r>
+              <w:rPr>
+                <w:rFonts w:ascii="맑은 고딕" w:hAnsi="맑은 고딕" w:eastAsia="맑은 고딕" w:cs="맑은 고딕"/>
+                <w:b w:val="0"/>
+                <w:sz w:val="16"/>
+              </w:rPr>
+              <w:t>적중</w:t>
+            </w:r>
+          </w:p>
+        </w:tc>
+        <w:tc>
+          <w:tcPr>
+            <w:tcW w:type="dxa" w:w="2438"/>
+          </w:tcPr>
+          <w:p>
+            <w:pPr>
+              <w:spacing w:after="0" w:line="264" w:lineRule="auto"/>
+              <w:jc w:val="center"/>
+            </w:pPr>
+            <w:r>
+              <w:rPr>
+                <w:rFonts w:ascii="맑은 고딕" w:hAnsi="맑은 고딕" w:eastAsia="맑은 고딕" w:cs="맑은 고딕"/>
+                <w:b w:val="0"/>
+                <w:sz w:val="16"/>
+              </w:rPr>
+              <w:t>적중 (found)</w:t>
+            </w:r>
+          </w:p>
+        </w:tc>
+        <w:tc>
+          <w:tcPr>
+            <w:tcW w:type="dxa" w:w="2438"/>
+          </w:tcPr>
+          <w:p>
+            <w:pPr>
+              <w:spacing w:after="0" w:line="264" w:lineRule="auto"/>
+              <w:jc w:val="center"/>
+            </w:pPr>
+            <w:r>
+              <w:rPr>
+                <w:rFonts w:ascii="맑은 고딕" w:hAnsi="맑은 고딕" w:eastAsia="맑은 고딕" w:cs="맑은 고딕"/>
+                <w:b w:val="0"/>
+                <w:sz w:val="16"/>
+              </w:rPr>
+              <w:t>적중 (found)</w:t>
+            </w:r>
+          </w:p>
+        </w:tc>
+      </w:tr>
+      <w:tr>
+        <w:trPr>
+          <w:cantSplit/>
+        </w:trPr>
+        <w:tc>
+          <w:tcPr>
+            <w:tcW w:type="dxa" w:w="794"/>
+          </w:tcPr>
+          <w:p>
+            <w:pPr>
+              <w:spacing w:after="0" w:line="264" w:lineRule="auto"/>
+            </w:pPr>
+            <w:r>
+              <w:rPr>
+                <w:rFonts w:ascii="맑은 고딕" w:hAnsi="맑은 고딕" w:eastAsia="맑은 고딕" w:cs="맑은 고딕"/>
+                <w:b w:val="0"/>
+                <w:sz w:val="16"/>
+              </w:rPr>
+              <w:t>15</w:t>
+            </w:r>
+          </w:p>
+        </w:tc>
+        <w:tc>
+          <w:tcPr>
+            <w:tcW w:type="dxa" w:w="2041"/>
+          </w:tcPr>
+          <w:p>
+            <w:pPr>
+              <w:spacing w:after="0" w:line="264" w:lineRule="auto"/>
+            </w:pPr>
+            <w:r>
+              <w:rPr>
+                <w:rFonts w:ascii="맑은 고딕" w:hAnsi="맑은 고딕" w:eastAsia="맑은 고딕" w:cs="맑은 고딕"/>
+                <w:b w:val="0"/>
+                <w:sz w:val="16"/>
+              </w:rPr>
+              <w:t>화자 질문</w:t>
+            </w:r>
+          </w:p>
+        </w:tc>
+        <w:tc>
+          <w:tcPr>
+            <w:tcW w:type="dxa" w:w="1928"/>
+          </w:tcPr>
+          <w:p>
+            <w:pPr>
+              <w:spacing w:after="0" w:line="264" w:lineRule="auto"/>
+              <w:jc w:val="center"/>
+            </w:pPr>
+            <w:r>
+              <w:rPr>
+                <w:rFonts w:ascii="맑은 고딕" w:hAnsi="맑은 고딕" w:eastAsia="맑은 고딕" w:cs="맑은 고딕"/>
+                <w:b w:val="0"/>
+                <w:sz w:val="16"/>
+              </w:rPr>
+              <w:t>적중</w:t>
+            </w:r>
+          </w:p>
+        </w:tc>
+        <w:tc>
+          <w:tcPr>
+            <w:tcW w:type="dxa" w:w="2438"/>
+          </w:tcPr>
+          <w:p>
+            <w:pPr>
+              <w:spacing w:after="0" w:line="264" w:lineRule="auto"/>
+              <w:jc w:val="center"/>
+            </w:pPr>
+            <w:r>
+              <w:rPr>
+                <w:rFonts w:ascii="맑은 고딕" w:hAnsi="맑은 고딕" w:eastAsia="맑은 고딕" w:cs="맑은 고딕"/>
+                <w:b w:val="0"/>
+                <w:sz w:val="16"/>
+              </w:rPr>
+              <w:t>화자 처리 성공 (found)</w:t>
+            </w:r>
+          </w:p>
+        </w:tc>
+        <w:tc>
+          <w:tcPr>
+            <w:tcW w:type="dxa" w:w="2438"/>
+          </w:tcPr>
+          <w:p>
+            <w:pPr>
+              <w:spacing w:after="0" w:line="264" w:lineRule="auto"/>
+              <w:jc w:val="center"/>
+            </w:pPr>
+            <w:r>
+              <w:rPr>
+                <w:rFonts w:ascii="맑은 고딕" w:hAnsi="맑은 고딕" w:eastAsia="맑은 고딕" w:cs="맑은 고딕"/>
+                <w:b w:val="0"/>
+                <w:sz w:val="16"/>
+              </w:rPr>
+              <w:t>화자 처리 성공 (found)</w:t>
+            </w:r>
+          </w:p>
+        </w:tc>
+      </w:tr>
+      <w:tr>
+        <w:trPr>
+          <w:cantSplit/>
+        </w:trPr>
+        <w:tc>
+          <w:tcPr>
+            <w:tcW w:type="dxa" w:w="794"/>
+          </w:tcPr>
+          <w:p>
+            <w:pPr>
+              <w:spacing w:after="0" w:line="264" w:lineRule="auto"/>
+            </w:pPr>
+            <w:r>
+              <w:rPr>
+                <w:rFonts w:ascii="맑은 고딕" w:hAnsi="맑은 고딕" w:eastAsia="맑은 고딕" w:cs="맑은 고딕"/>
+                <w:b w:val="0"/>
+                <w:sz w:val="16"/>
+              </w:rPr>
+              <w:t>16</w:t>
+            </w:r>
+          </w:p>
+        </w:tc>
+        <w:tc>
+          <w:tcPr>
+            <w:tcW w:type="dxa" w:w="2041"/>
+          </w:tcPr>
+          <w:p>
+            <w:pPr>
+              <w:spacing w:after="0" w:line="264" w:lineRule="auto"/>
+            </w:pPr>
+            <w:r>
+              <w:rPr>
+                <w:rFonts w:ascii="맑은 고딕" w:hAnsi="맑은 고딕" w:eastAsia="맑은 고딕" w:cs="맑은 고딕"/>
+                <w:b w:val="0"/>
+                <w:sz w:val="16"/>
+              </w:rPr>
+              <w:t>화자 질문</w:t>
+            </w:r>
+          </w:p>
+        </w:tc>
+        <w:tc>
+          <w:tcPr>
+            <w:tcW w:type="dxa" w:w="1928"/>
+          </w:tcPr>
+          <w:p>
+            <w:pPr>
+              <w:spacing w:after="0" w:line="264" w:lineRule="auto"/>
+              <w:jc w:val="center"/>
+            </w:pPr>
+            <w:r>
+              <w:rPr>
+                <w:rFonts w:ascii="맑은 고딕" w:hAnsi="맑은 고딕" w:eastAsia="맑은 고딕" w:cs="맑은 고딕"/>
+                <w:b w:val="0"/>
+                <w:sz w:val="16"/>
+              </w:rPr>
+              <w:t>적중</w:t>
+            </w:r>
+          </w:p>
+        </w:tc>
+        <w:tc>
+          <w:tcPr>
+            <w:tcW w:type="dxa" w:w="2438"/>
+          </w:tcPr>
+          <w:p>
+            <w:pPr>
+              <w:spacing w:after="0" w:line="264" w:lineRule="auto"/>
+              <w:jc w:val="center"/>
+            </w:pPr>
+            <w:r>
+              <w:rPr>
+                <w:rFonts w:ascii="맑은 고딕" w:hAnsi="맑은 고딕" w:eastAsia="맑은 고딕" w:cs="맑은 고딕"/>
+                <w:b w:val="0"/>
+                <w:sz w:val="16"/>
+              </w:rPr>
+              <w:t>화자 처리 성공 (found)</w:t>
+            </w:r>
+          </w:p>
+        </w:tc>
+        <w:tc>
+          <w:tcPr>
+            <w:tcW w:type="dxa" w:w="2438"/>
+          </w:tcPr>
+          <w:p>
+            <w:pPr>
+              <w:spacing w:after="0" w:line="264" w:lineRule="auto"/>
+              <w:jc w:val="center"/>
+            </w:pPr>
+            <w:r>
+              <w:rPr>
+                <w:rFonts w:ascii="맑은 고딕" w:hAnsi="맑은 고딕" w:eastAsia="맑은 고딕" w:cs="맑은 고딕"/>
+                <w:b w:val="0"/>
+                <w:sz w:val="16"/>
+              </w:rPr>
+              <w:t>화자 처리 성공 (found)</w:t>
+            </w:r>
+          </w:p>
+        </w:tc>
+      </w:tr>
+      <w:tr>
+        <w:trPr>
+          <w:cantSplit/>
+        </w:trPr>
+        <w:tc>
+          <w:tcPr>
+            <w:tcW w:type="dxa" w:w="794"/>
+          </w:tcPr>
+          <w:p>
+            <w:pPr>
+              <w:spacing w:after="0" w:line="264" w:lineRule="auto"/>
+            </w:pPr>
+            <w:r>
+              <w:rPr>
+                <w:rFonts w:ascii="맑은 고딕" w:hAnsi="맑은 고딕" w:eastAsia="맑은 고딕" w:cs="맑은 고딕"/>
+                <w:b w:val="0"/>
+                <w:sz w:val="16"/>
+              </w:rPr>
+              <w:t>17</w:t>
+            </w:r>
+          </w:p>
+        </w:tc>
+        <w:tc>
+          <w:tcPr>
+            <w:tcW w:type="dxa" w:w="2041"/>
+          </w:tcPr>
+          <w:p>
+            <w:pPr>
+              <w:spacing w:after="0" w:line="264" w:lineRule="auto"/>
+            </w:pPr>
+            <w:r>
+              <w:rPr>
+                <w:rFonts w:ascii="맑은 고딕" w:hAnsi="맑은 고딕" w:eastAsia="맑은 고딕" w:cs="맑은 고딕"/>
+                <w:b w:val="0"/>
+                <w:sz w:val="16"/>
+              </w:rPr>
+              <w:t>화자 질문</w:t>
+            </w:r>
+          </w:p>
+        </w:tc>
+        <w:tc>
+          <w:tcPr>
+            <w:tcW w:type="dxa" w:w="1928"/>
+          </w:tcPr>
+          <w:p>
+            <w:pPr>
+              <w:spacing w:after="0" w:line="264" w:lineRule="auto"/>
+              <w:jc w:val="center"/>
+            </w:pPr>
+            <w:r>
+              <w:rPr>
+                <w:rFonts w:ascii="맑은 고딕" w:hAnsi="맑은 고딕" w:eastAsia="맑은 고딕" w:cs="맑은 고딕"/>
+                <w:b w:val="0"/>
+                <w:sz w:val="16"/>
+              </w:rPr>
+              <w:t>오답</w:t>
+            </w:r>
+          </w:p>
+        </w:tc>
+        <w:tc>
+          <w:tcPr>
+            <w:tcW w:type="dxa" w:w="2438"/>
+          </w:tcPr>
+          <w:p>
+            <w:pPr>
+              <w:spacing w:after="0" w:line="264" w:lineRule="auto"/>
+              <w:jc w:val="center"/>
+            </w:pPr>
+            <w:r>
+              <w:rPr>
+                <w:rFonts w:ascii="맑은 고딕" w:hAnsi="맑은 고딕" w:eastAsia="맑은 고딕" w:cs="맑은 고딕"/>
+                <w:b w:val="0"/>
+                <w:sz w:val="16"/>
+              </w:rPr>
+              <w:t>화자 처리 실패 (not_found)</w:t>
+            </w:r>
+          </w:p>
+        </w:tc>
+        <w:tc>
+          <w:tcPr>
+            <w:tcW w:type="dxa" w:w="2438"/>
+          </w:tcPr>
+          <w:p>
+            <w:pPr>
+              <w:spacing w:after="0" w:line="264" w:lineRule="auto"/>
+              <w:jc w:val="center"/>
+            </w:pPr>
+            <w:r>
+              <w:rPr>
+                <w:rFonts w:ascii="맑은 고딕" w:hAnsi="맑은 고딕" w:eastAsia="맑은 고딕" w:cs="맑은 고딕"/>
+                <w:b w:val="0"/>
+                <w:sz w:val="16"/>
+              </w:rPr>
+              <w:t>화자 처리 실패 (not_found)</w:t>
+            </w:r>
+          </w:p>
+        </w:tc>
+      </w:tr>
+      <w:tr>
+        <w:trPr>
+          <w:cantSplit/>
+        </w:trPr>
+        <w:tc>
+          <w:tcPr>
+            <w:tcW w:type="dxa" w:w="794"/>
+          </w:tcPr>
+          <w:p>
+            <w:pPr>
+              <w:spacing w:after="0" w:line="264" w:lineRule="auto"/>
+            </w:pPr>
+            <w:r>
+              <w:rPr>
+                <w:rFonts w:ascii="맑은 고딕" w:hAnsi="맑은 고딕" w:eastAsia="맑은 고딕" w:cs="맑은 고딕"/>
+                <w:b w:val="0"/>
+                <w:sz w:val="16"/>
+              </w:rPr>
+              <w:t>18</w:t>
+            </w:r>
+          </w:p>
+        </w:tc>
+        <w:tc>
+          <w:tcPr>
+            <w:tcW w:type="dxa" w:w="2041"/>
+          </w:tcPr>
+          <w:p>
+            <w:pPr>
+              <w:spacing w:after="0" w:line="264" w:lineRule="auto"/>
+            </w:pPr>
+            <w:r>
+              <w:rPr>
+                <w:rFonts w:ascii="맑은 고딕" w:hAnsi="맑은 고딕" w:eastAsia="맑은 고딕" w:cs="맑은 고딕"/>
+                <w:b w:val="0"/>
+                <w:sz w:val="16"/>
+              </w:rPr>
+              <w:t>화자 질문</w:t>
+            </w:r>
+          </w:p>
+        </w:tc>
+        <w:tc>
+          <w:tcPr>
+            <w:tcW w:type="dxa" w:w="1928"/>
+          </w:tcPr>
+          <w:p>
+            <w:pPr>
+              <w:spacing w:after="0" w:line="264" w:lineRule="auto"/>
+              <w:jc w:val="center"/>
+            </w:pPr>
+            <w:r>
+              <w:rPr>
+                <w:rFonts w:ascii="맑은 고딕" w:hAnsi="맑은 고딕" w:eastAsia="맑은 고딕" w:cs="맑은 고딕"/>
+                <w:b w:val="0"/>
+                <w:sz w:val="16"/>
+              </w:rPr>
+              <w:t>오답</w:t>
+            </w:r>
+          </w:p>
+        </w:tc>
+        <w:tc>
+          <w:tcPr>
+            <w:tcW w:type="dxa" w:w="2438"/>
+          </w:tcPr>
+          <w:p>
+            <w:pPr>
+              <w:spacing w:after="0" w:line="264" w:lineRule="auto"/>
+              <w:jc w:val="center"/>
+            </w:pPr>
+            <w:r>
+              <w:rPr>
+                <w:rFonts w:ascii="맑은 고딕" w:hAnsi="맑은 고딕" w:eastAsia="맑은 고딕" w:cs="맑은 고딕"/>
+                <w:b w:val="0"/>
+                <w:sz w:val="16"/>
+              </w:rPr>
+              <w:t>화자 처리 성공 (found)</w:t>
+            </w:r>
+          </w:p>
+        </w:tc>
+        <w:tc>
+          <w:tcPr>
+            <w:tcW w:type="dxa" w:w="2438"/>
+          </w:tcPr>
+          <w:p>
+            <w:pPr>
+              <w:spacing w:after="0" w:line="264" w:lineRule="auto"/>
+              <w:jc w:val="center"/>
+            </w:pPr>
+            <w:r>
+              <w:rPr>
+                <w:rFonts w:ascii="맑은 고딕" w:hAnsi="맑은 고딕" w:eastAsia="맑은 고딕" w:cs="맑은 고딕"/>
+                <w:b w:val="0"/>
+                <w:sz w:val="16"/>
+              </w:rPr>
+              <w:t>화자 처리 성공 (found)</w:t>
+            </w:r>
+          </w:p>
+        </w:tc>
+      </w:tr>
+      <w:tr>
+        <w:trPr>
+          <w:cantSplit/>
+        </w:trPr>
+        <w:tc>
+          <w:tcPr>
+            <w:tcW w:type="dxa" w:w="794"/>
+          </w:tcPr>
+          <w:p>
+            <w:pPr>
+              <w:spacing w:after="0" w:line="264" w:lineRule="auto"/>
+            </w:pPr>
+            <w:r>
+              <w:rPr>
+                <w:rFonts w:ascii="맑은 고딕" w:hAnsi="맑은 고딕" w:eastAsia="맑은 고딕" w:cs="맑은 고딕"/>
+                <w:b w:val="0"/>
+                <w:sz w:val="16"/>
+              </w:rPr>
+              <w:t>19</w:t>
+            </w:r>
+          </w:p>
+        </w:tc>
+        <w:tc>
+          <w:tcPr>
+            <w:tcW w:type="dxa" w:w="2041"/>
+          </w:tcPr>
+          <w:p>
+            <w:pPr>
+              <w:spacing w:after="0" w:line="264" w:lineRule="auto"/>
+            </w:pPr>
+            <w:r>
+              <w:rPr>
+                <w:rFonts w:ascii="맑은 고딕" w:hAnsi="맑은 고딕" w:eastAsia="맑은 고딕" w:cs="맑은 고딕"/>
+                <w:b w:val="0"/>
+                <w:sz w:val="16"/>
+              </w:rPr>
+              <w:t>자막으로 알 수 없는 요청</w:t>
+            </w:r>
+          </w:p>
+        </w:tc>
+        <w:tc>
+          <w:tcPr>
+            <w:tcW w:type="dxa" w:w="1928"/>
+          </w:tcPr>
+          <w:p>
+            <w:pPr>
+              <w:spacing w:after="0" w:line="264" w:lineRule="auto"/>
+              <w:jc w:val="center"/>
+            </w:pPr>
+            <w:r>
+              <w:rPr>
+                <w:rFonts w:ascii="맑은 고딕" w:hAnsi="맑은 고딕" w:eastAsia="맑은 고딕" w:cs="맑은 고딕"/>
+                <w:b w:val="0"/>
+                <w:sz w:val="16"/>
+              </w:rPr>
+              <w:t>해당 없음</w:t>
+            </w:r>
+          </w:p>
+        </w:tc>
+        <w:tc>
+          <w:tcPr>
+            <w:tcW w:type="dxa" w:w="2438"/>
+          </w:tcPr>
+          <w:p>
+            <w:pPr>
+              <w:spacing w:after="0" w:line="264" w:lineRule="auto"/>
+              <w:jc w:val="center"/>
+            </w:pPr>
+            <w:r>
+              <w:rPr>
+                <w:rFonts w:ascii="맑은 고딕" w:hAnsi="맑은 고딕" w:eastAsia="맑은 고딕" w:cs="맑은 고딕"/>
+                <w:b w:val="0"/>
+                <w:sz w:val="16"/>
+              </w:rPr>
+              <w:t>거부 성공</w:t>
+            </w:r>
+          </w:p>
+        </w:tc>
+        <w:tc>
+          <w:tcPr>
+            <w:tcW w:type="dxa" w:w="2438"/>
+          </w:tcPr>
+          <w:p>
+            <w:pPr>
+              <w:spacing w:after="0" w:line="264" w:lineRule="auto"/>
+              <w:jc w:val="center"/>
+            </w:pPr>
+            <w:r>
+              <w:rPr>
+                <w:rFonts w:ascii="맑은 고딕" w:hAnsi="맑은 고딕" w:eastAsia="맑은 고딕" w:cs="맑은 고딕"/>
+                <w:b w:val="0"/>
+                <w:sz w:val="16"/>
+              </w:rPr>
+              <w:t>거부 성공</w:t>
+            </w:r>
+          </w:p>
+        </w:tc>
+      </w:tr>
+      <w:tr>
+        <w:trPr>
+          <w:cantSplit/>
+        </w:trPr>
+        <w:tc>
+          <w:tcPr>
+            <w:tcW w:type="dxa" w:w="794"/>
+          </w:tcPr>
+          <w:p>
+            <w:pPr>
+              <w:spacing w:after="0" w:line="264" w:lineRule="auto"/>
+            </w:pPr>
+            <w:r>
+              <w:rPr>
+                <w:rFonts w:ascii="맑은 고딕" w:hAnsi="맑은 고딕" w:eastAsia="맑은 고딕" w:cs="맑은 고딕"/>
+                <w:b w:val="0"/>
+                <w:sz w:val="16"/>
+              </w:rPr>
+              <w:t>20</w:t>
+            </w:r>
+          </w:p>
+        </w:tc>
+        <w:tc>
+          <w:tcPr>
+            <w:tcW w:type="dxa" w:w="2041"/>
+          </w:tcPr>
+          <w:p>
+            <w:pPr>
+              <w:spacing w:after="0" w:line="264" w:lineRule="auto"/>
+            </w:pPr>
+            <w:r>
+              <w:rPr>
+                <w:rFonts w:ascii="맑은 고딕" w:hAnsi="맑은 고딕" w:eastAsia="맑은 고딕" w:cs="맑은 고딕"/>
+                <w:b w:val="0"/>
+                <w:sz w:val="16"/>
+              </w:rPr>
+              <w:t>자막으로 알 수 없는 요청</w:t>
+            </w:r>
+          </w:p>
+        </w:tc>
+        <w:tc>
+          <w:tcPr>
+            <w:tcW w:type="dxa" w:w="1928"/>
+          </w:tcPr>
+          <w:p>
+            <w:pPr>
+              <w:spacing w:after="0" w:line="264" w:lineRule="auto"/>
+              <w:jc w:val="center"/>
+            </w:pPr>
+            <w:r>
+              <w:rPr>
+                <w:rFonts w:ascii="맑은 고딕" w:hAnsi="맑은 고딕" w:eastAsia="맑은 고딕" w:cs="맑은 고딕"/>
+                <w:b w:val="0"/>
+                <w:sz w:val="16"/>
+              </w:rPr>
+              <w:t>해당 없음</w:t>
+            </w:r>
+          </w:p>
+        </w:tc>
+        <w:tc>
+          <w:tcPr>
+            <w:tcW w:type="dxa" w:w="2438"/>
+          </w:tcPr>
+          <w:p>
+            <w:pPr>
+              <w:spacing w:after="0" w:line="264" w:lineRule="auto"/>
+              <w:jc w:val="center"/>
+            </w:pPr>
+            <w:r>
+              <w:rPr>
+                <w:rFonts w:ascii="맑은 고딕" w:hAnsi="맑은 고딕" w:eastAsia="맑은 고딕" w:cs="맑은 고딕"/>
+                <w:b w:val="0"/>
+                <w:sz w:val="16"/>
+              </w:rPr>
+              <w:t>거부 성공</w:t>
+            </w:r>
+          </w:p>
+        </w:tc>
+        <w:tc>
+          <w:tcPr>
+            <w:tcW w:type="dxa" w:w="2438"/>
+          </w:tcPr>
+          <w:p>
+            <w:pPr>
+              <w:spacing w:after="0" w:line="264" w:lineRule="auto"/>
+              <w:jc w:val="center"/>
+            </w:pPr>
+            <w:r>
+              <w:rPr>
+                <w:rFonts w:ascii="맑은 고딕" w:hAnsi="맑은 고딕" w:eastAsia="맑은 고딕" w:cs="맑은 고딕"/>
+                <w:b w:val="0"/>
+                <w:sz w:val="16"/>
+              </w:rPr>
+              <w:t>거부 성공</w:t>
             </w:r>
           </w:p>
         </w:tc>
@@ -9568,6 +12634,658 @@
       <w:pPr>
         <w:spacing w:after="40"/>
       </w:pPr>
+    </w:p>
+    <w:p>
+      <w:r>
+        <w:rPr>
+          <w:rFonts w:ascii="맑은 고딕" w:hAnsi="맑은 고딕" w:eastAsia="맑은 고딕" w:cs="맑은 고딕"/>
+          <w:b w:val="0"/>
+          <w:sz w:val="18"/>
+        </w:rPr>
+        <w:t>표는 2026-10-22에 같은 평가셋으로 이중 첫 검색을 끈 실행과 켠 실행의 문항별 결과이며, 두 실행의 C 결과는 문항별로 모두 같았다. B는 질문 원문을 그대로 검색한 값이고, 화자 질문 행의 "적중"은 관련 장면을 1위로 냈다는 뜻일 뿐 화자를 확인했다는 뜻이 아니다.</w:t>
+      </w:r>
+    </w:p>
+    <w:p>
+      <w:r>
+        <w:br w:type="page"/>
+      </w:r>
+    </w:p>
+    <w:p>
+      <w:pPr>
+        <w:pStyle w:val="Heading1"/>
+      </w:pPr>
+      <w:r>
+        <w:rPr>
+          <w:rFonts w:ascii="맑은 고딕" w:hAnsi="맑은 고딕" w:eastAsia="맑은 고딕" w:cs="맑은 고딕"/>
+          <w:b/>
+        </w:rPr>
+        <w:t>부록 E. 청크 길이 비교 (2026-10-22)</w:t>
+      </w:r>
+    </w:p>
+    <w:p>
+      <w:r>
+        <w:rPr>
+          <w:rFonts w:ascii="맑은 고딕" w:hAnsi="맑은 고딕" w:eastAsia="맑은 고딕" w:cs="맑은 고딕"/>
+          <w:b w:val="0"/>
+          <w:sz w:val="20"/>
+        </w:rPr>
+        <w:t>검색 청크는 영상별로 N초 창을 N/2초씩 이동해 만든다. 설계 때 정한 20초/10초가 맞는지 같은 정답 평가셋으로 비교했다. 청크 길이만 바꾸고 나머지는 같게 했고, LLM을 쓰지 않는 A(BM25)와 B(Hybrid)를 한국어 원문 조건으로 측정했다(Agent는 설정마다 다시 측정하지 않았다). 설정마다 검색 인덱스를 새로 만들어 비교했고, 질문당 1회 실행이다.</w:t>
+      </w:r>
+    </w:p>
+    <w:p>
+      <w:pPr>
+        <w:keepNext/>
+        <w:spacing w:after="40"/>
+      </w:pPr>
+      <w:r>
+        <w:rPr>
+          <w:rFonts w:ascii="맑은 고딕" w:hAnsi="맑은 고딕" w:eastAsia="맑은 고딕" w:cs="맑은 고딕"/>
+          <w:b/>
+          <w:color w:val="3C3C3C"/>
+          <w:sz w:val="18"/>
+        </w:rPr>
+        <w:t>표 18. 청크 길이별 B(Hybrid) 비교 (OpenAI 없음, 질문당 1회, 한국어 원문 조건)</w:t>
+      </w:r>
+    </w:p>
+    <w:tbl>
+      <w:tblPr>
+        <w:tblStyle w:val="TableGrid"/>
+        <w:tblW w:type="auto" w:w="0"/>
+        <w:jc w:val="center"/>
+        <w:tblLayout w:type="fixed"/>
+        <w:tblLook w:firstColumn="1" w:firstRow="1" w:lastColumn="0" w:lastRow="0" w:noHBand="0" w:noVBand="1" w:val="04A0"/>
+        <w:tblCellMar>
+          <w:top w:w="50" w:type="dxa"/>
+          <w:left w:w="90" w:type="dxa"/>
+          <w:bottom w:w="50" w:type="dxa"/>
+          <w:right w:w="90" w:type="dxa"/>
+        </w:tblCellMar>
+      </w:tblPr>
+      <w:tblGrid>
+        <w:gridCol w:w="1928"/>
+        <w:gridCol w:w="1928"/>
+        <w:gridCol w:w="1928"/>
+        <w:gridCol w:w="1928"/>
+        <w:gridCol w:w="1928"/>
+      </w:tblGrid>
+      <w:tr>
+        <w:trPr>
+          <w:cantSplit/>
+          <w:tblHeader/>
+        </w:trPr>
+        <w:tc>
+          <w:tcPr>
+            <w:tcW w:type="dxa" w:w="2154"/>
+            <w:shd w:val="clear" w:color="auto" w:fill="D9E2F3"/>
+          </w:tcPr>
+          <w:p>
+            <w:pPr>
+              <w:keepNext/>
+              <w:spacing w:after="0" w:line="264" w:lineRule="auto"/>
+              <w:jc w:val="center"/>
+            </w:pPr>
+            <w:r>
+              <w:rPr>
+                <w:rFonts w:ascii="맑은 고딕" w:hAnsi="맑은 고딕" w:eastAsia="맑은 고딕" w:cs="맑은 고딕"/>
+                <w:b/>
+                <w:sz w:val="18"/>
+              </w:rPr>
+              <w:t>창 / 이동</w:t>
+            </w:r>
+          </w:p>
+        </w:tc>
+        <w:tc>
+          <w:tcPr>
+            <w:tcW w:type="dxa" w:w="1361"/>
+            <w:shd w:val="clear" w:color="auto" w:fill="D9E2F3"/>
+          </w:tcPr>
+          <w:p>
+            <w:pPr>
+              <w:keepNext/>
+              <w:spacing w:after="0" w:line="264" w:lineRule="auto"/>
+              <w:jc w:val="center"/>
+            </w:pPr>
+            <w:r>
+              <w:rPr>
+                <w:rFonts w:ascii="맑은 고딕" w:hAnsi="맑은 고딕" w:eastAsia="맑은 고딕" w:cs="맑은 고딕"/>
+                <w:b/>
+                <w:sz w:val="18"/>
+              </w:rPr>
+              <w:t>청크 수</w:t>
+            </w:r>
+          </w:p>
+        </w:tc>
+        <w:tc>
+          <w:tcPr>
+            <w:tcW w:type="dxa" w:w="1928"/>
+            <w:shd w:val="clear" w:color="auto" w:fill="D9E2F3"/>
+          </w:tcPr>
+          <w:p>
+            <w:pPr>
+              <w:keepNext/>
+              <w:spacing w:after="0" w:line="264" w:lineRule="auto"/>
+              <w:jc w:val="center"/>
+            </w:pPr>
+            <w:r>
+              <w:rPr>
+                <w:rFonts w:ascii="맑은 고딕" w:hAnsi="맑은 고딕" w:eastAsia="맑은 고딕" w:cs="맑은 고딕"/>
+                <w:b/>
+                <w:sz w:val="18"/>
+              </w:rPr>
+              <w:t>B 1위 적중 (18개)</w:t>
+            </w:r>
+          </w:p>
+        </w:tc>
+        <w:tc>
+          <w:tcPr>
+            <w:tcW w:type="dxa" w:w="2154"/>
+            <w:shd w:val="clear" w:color="auto" w:fill="D9E2F3"/>
+          </w:tcPr>
+          <w:p>
+            <w:pPr>
+              <w:keepNext/>
+              <w:spacing w:after="0" w:line="264" w:lineRule="auto"/>
+              <w:jc w:val="center"/>
+            </w:pPr>
+            <w:r>
+              <w:rPr>
+                <w:rFonts w:ascii="맑은 고딕" w:hAnsi="맑은 고딕" w:eastAsia="맑은 고딕" w:cs="맑은 고딕"/>
+                <w:b/>
+                <w:sz w:val="18"/>
+              </w:rPr>
+              <w:t>B 상위 3개 적중 (18개)</w:t>
+            </w:r>
+          </w:p>
+        </w:tc>
+        <w:tc>
+          <w:tcPr>
+            <w:tcW w:type="dxa" w:w="2041"/>
+            <w:shd w:val="clear" w:color="auto" w:fill="D9E2F3"/>
+          </w:tcPr>
+          <w:p>
+            <w:pPr>
+              <w:keepNext/>
+              <w:spacing w:after="0" w:line="264" w:lineRule="auto"/>
+              <w:jc w:val="center"/>
+            </w:pPr>
+            <w:r>
+              <w:rPr>
+                <w:rFonts w:ascii="맑은 고딕" w:hAnsi="맑은 고딕" w:eastAsia="맑은 고딕" w:cs="맑은 고딕"/>
+                <w:b/>
+                <w:sz w:val="18"/>
+              </w:rPr>
+              <w:t>B 평균 지연 (초)</w:t>
+            </w:r>
+          </w:p>
+        </w:tc>
+      </w:tr>
+      <w:tr>
+        <w:trPr>
+          <w:cantSplit/>
+        </w:trPr>
+        <w:tc>
+          <w:tcPr>
+            <w:tcW w:type="dxa" w:w="2154"/>
+          </w:tcPr>
+          <w:p>
+            <w:pPr>
+              <w:spacing w:after="0" w:line="264" w:lineRule="auto"/>
+            </w:pPr>
+            <w:r>
+              <w:rPr>
+                <w:rFonts w:ascii="맑은 고딕" w:hAnsi="맑은 고딕" w:eastAsia="맑은 고딕" w:cs="맑은 고딕"/>
+                <w:b w:val="0"/>
+                <w:sz w:val="18"/>
+              </w:rPr>
+              <w:t>10초 / 5초</w:t>
+            </w:r>
+          </w:p>
+        </w:tc>
+        <w:tc>
+          <w:tcPr>
+            <w:tcW w:type="dxa" w:w="1361"/>
+          </w:tcPr>
+          <w:p>
+            <w:pPr>
+              <w:spacing w:after="0" w:line="264" w:lineRule="auto"/>
+              <w:jc w:val="center"/>
+            </w:pPr>
+            <w:r>
+              <w:rPr>
+                <w:rFonts w:ascii="맑은 고딕" w:hAnsi="맑은 고딕" w:eastAsia="맑은 고딕" w:cs="맑은 고딕"/>
+                <w:b w:val="0"/>
+                <w:sz w:val="18"/>
+              </w:rPr>
+              <w:t>1,712</w:t>
+            </w:r>
+          </w:p>
+        </w:tc>
+        <w:tc>
+          <w:tcPr>
+            <w:tcW w:type="dxa" w:w="1928"/>
+          </w:tcPr>
+          <w:p>
+            <w:pPr>
+              <w:spacing w:after="0" w:line="264" w:lineRule="auto"/>
+              <w:jc w:val="center"/>
+            </w:pPr>
+            <w:r>
+              <w:rPr>
+                <w:rFonts w:ascii="맑은 고딕" w:hAnsi="맑은 고딕" w:eastAsia="맑은 고딕" w:cs="맑은 고딕"/>
+                <w:b w:val="0"/>
+                <w:sz w:val="18"/>
+              </w:rPr>
+              <w:t>11</w:t>
+            </w:r>
+          </w:p>
+        </w:tc>
+        <w:tc>
+          <w:tcPr>
+            <w:tcW w:type="dxa" w:w="2154"/>
+          </w:tcPr>
+          <w:p>
+            <w:pPr>
+              <w:spacing w:after="0" w:line="264" w:lineRule="auto"/>
+              <w:jc w:val="center"/>
+            </w:pPr>
+            <w:r>
+              <w:rPr>
+                <w:rFonts w:ascii="맑은 고딕" w:hAnsi="맑은 고딕" w:eastAsia="맑은 고딕" w:cs="맑은 고딕"/>
+                <w:b w:val="0"/>
+                <w:sz w:val="18"/>
+              </w:rPr>
+              <w:t>13</w:t>
+            </w:r>
+          </w:p>
+        </w:tc>
+        <w:tc>
+          <w:tcPr>
+            <w:tcW w:type="dxa" w:w="2041"/>
+          </w:tcPr>
+          <w:p>
+            <w:pPr>
+              <w:spacing w:after="0" w:line="264" w:lineRule="auto"/>
+              <w:jc w:val="center"/>
+            </w:pPr>
+            <w:r>
+              <w:rPr>
+                <w:rFonts w:ascii="맑은 고딕" w:hAnsi="맑은 고딕" w:eastAsia="맑은 고딕" w:cs="맑은 고딕"/>
+                <w:b w:val="0"/>
+                <w:sz w:val="18"/>
+              </w:rPr>
+              <w:t>0.19</w:t>
+            </w:r>
+          </w:p>
+        </w:tc>
+      </w:tr>
+      <w:tr>
+        <w:trPr>
+          <w:cantSplit/>
+        </w:trPr>
+        <w:tc>
+          <w:tcPr>
+            <w:tcW w:type="dxa" w:w="2154"/>
+          </w:tcPr>
+          <w:p>
+            <w:pPr>
+              <w:spacing w:after="0" w:line="264" w:lineRule="auto"/>
+            </w:pPr>
+            <w:r>
+              <w:rPr>
+                <w:rFonts w:ascii="맑은 고딕" w:hAnsi="맑은 고딕" w:eastAsia="맑은 고딕" w:cs="맑은 고딕"/>
+                <w:b/>
+                <w:sz w:val="18"/>
+              </w:rPr>
+              <w:t>20초 / 10초 (기본값)</w:t>
+            </w:r>
+          </w:p>
+        </w:tc>
+        <w:tc>
+          <w:tcPr>
+            <w:tcW w:type="dxa" w:w="1361"/>
+          </w:tcPr>
+          <w:p>
+            <w:pPr>
+              <w:spacing w:after="0" w:line="264" w:lineRule="auto"/>
+              <w:jc w:val="center"/>
+            </w:pPr>
+            <w:r>
+              <w:rPr>
+                <w:rFonts w:ascii="맑은 고딕" w:hAnsi="맑은 고딕" w:eastAsia="맑은 고딕" w:cs="맑은 고딕"/>
+                <w:b w:val="0"/>
+                <w:sz w:val="18"/>
+              </w:rPr>
+              <w:t>869</w:t>
+            </w:r>
+          </w:p>
+        </w:tc>
+        <w:tc>
+          <w:tcPr>
+            <w:tcW w:type="dxa" w:w="1928"/>
+          </w:tcPr>
+          <w:p>
+            <w:pPr>
+              <w:spacing w:after="0" w:line="264" w:lineRule="auto"/>
+              <w:jc w:val="center"/>
+            </w:pPr>
+            <w:r>
+              <w:rPr>
+                <w:rFonts w:ascii="맑은 고딕" w:hAnsi="맑은 고딕" w:eastAsia="맑은 고딕" w:cs="맑은 고딕"/>
+                <w:b w:val="0"/>
+                <w:sz w:val="18"/>
+              </w:rPr>
+              <w:t>11</w:t>
+            </w:r>
+          </w:p>
+        </w:tc>
+        <w:tc>
+          <w:tcPr>
+            <w:tcW w:type="dxa" w:w="2154"/>
+          </w:tcPr>
+          <w:p>
+            <w:pPr>
+              <w:spacing w:after="0" w:line="264" w:lineRule="auto"/>
+              <w:jc w:val="center"/>
+            </w:pPr>
+            <w:r>
+              <w:rPr>
+                <w:rFonts w:ascii="맑은 고딕" w:hAnsi="맑은 고딕" w:eastAsia="맑은 고딕" w:cs="맑은 고딕"/>
+                <w:b w:val="0"/>
+                <w:sz w:val="18"/>
+              </w:rPr>
+              <w:t>13</w:t>
+            </w:r>
+          </w:p>
+        </w:tc>
+        <w:tc>
+          <w:tcPr>
+            <w:tcW w:type="dxa" w:w="2041"/>
+          </w:tcPr>
+          <w:p>
+            <w:pPr>
+              <w:spacing w:after="0" w:line="264" w:lineRule="auto"/>
+              <w:jc w:val="center"/>
+            </w:pPr>
+            <w:r>
+              <w:rPr>
+                <w:rFonts w:ascii="맑은 고딕" w:hAnsi="맑은 고딕" w:eastAsia="맑은 고딕" w:cs="맑은 고딕"/>
+                <w:b w:val="0"/>
+                <w:sz w:val="18"/>
+              </w:rPr>
+              <w:t>0.30</w:t>
+            </w:r>
+          </w:p>
+        </w:tc>
+      </w:tr>
+      <w:tr>
+        <w:trPr>
+          <w:cantSplit/>
+        </w:trPr>
+        <w:tc>
+          <w:tcPr>
+            <w:tcW w:type="dxa" w:w="2154"/>
+          </w:tcPr>
+          <w:p>
+            <w:pPr>
+              <w:spacing w:after="0" w:line="264" w:lineRule="auto"/>
+            </w:pPr>
+            <w:r>
+              <w:rPr>
+                <w:rFonts w:ascii="맑은 고딕" w:hAnsi="맑은 고딕" w:eastAsia="맑은 고딕" w:cs="맑은 고딕"/>
+                <w:b w:val="0"/>
+                <w:sz w:val="18"/>
+              </w:rPr>
+              <w:t>30초 / 15초</w:t>
+            </w:r>
+          </w:p>
+        </w:tc>
+        <w:tc>
+          <w:tcPr>
+            <w:tcW w:type="dxa" w:w="1361"/>
+          </w:tcPr>
+          <w:p>
+            <w:pPr>
+              <w:spacing w:after="0" w:line="264" w:lineRule="auto"/>
+              <w:jc w:val="center"/>
+            </w:pPr>
+            <w:r>
+              <w:rPr>
+                <w:rFonts w:ascii="맑은 고딕" w:hAnsi="맑은 고딕" w:eastAsia="맑은 고딕" w:cs="맑은 고딕"/>
+                <w:b w:val="0"/>
+                <w:sz w:val="18"/>
+              </w:rPr>
+              <w:t>580</w:t>
+            </w:r>
+          </w:p>
+        </w:tc>
+        <w:tc>
+          <w:tcPr>
+            <w:tcW w:type="dxa" w:w="1928"/>
+          </w:tcPr>
+          <w:p>
+            <w:pPr>
+              <w:spacing w:after="0" w:line="264" w:lineRule="auto"/>
+              <w:jc w:val="center"/>
+            </w:pPr>
+            <w:r>
+              <w:rPr>
+                <w:rFonts w:ascii="맑은 고딕" w:hAnsi="맑은 고딕" w:eastAsia="맑은 고딕" w:cs="맑은 고딕"/>
+                <w:b w:val="0"/>
+                <w:sz w:val="18"/>
+              </w:rPr>
+              <w:t>9</w:t>
+            </w:r>
+          </w:p>
+        </w:tc>
+        <w:tc>
+          <w:tcPr>
+            <w:tcW w:type="dxa" w:w="2154"/>
+          </w:tcPr>
+          <w:p>
+            <w:pPr>
+              <w:spacing w:after="0" w:line="264" w:lineRule="auto"/>
+              <w:jc w:val="center"/>
+            </w:pPr>
+            <w:r>
+              <w:rPr>
+                <w:rFonts w:ascii="맑은 고딕" w:hAnsi="맑은 고딕" w:eastAsia="맑은 고딕" w:cs="맑은 고딕"/>
+                <w:b w:val="0"/>
+                <w:sz w:val="18"/>
+              </w:rPr>
+              <w:t>11</w:t>
+            </w:r>
+          </w:p>
+        </w:tc>
+        <w:tc>
+          <w:tcPr>
+            <w:tcW w:type="dxa" w:w="2041"/>
+          </w:tcPr>
+          <w:p>
+            <w:pPr>
+              <w:spacing w:after="0" w:line="264" w:lineRule="auto"/>
+              <w:jc w:val="center"/>
+            </w:pPr>
+            <w:r>
+              <w:rPr>
+                <w:rFonts w:ascii="맑은 고딕" w:hAnsi="맑은 고딕" w:eastAsia="맑은 고딕" w:cs="맑은 고딕"/>
+                <w:b w:val="0"/>
+                <w:sz w:val="18"/>
+              </w:rPr>
+              <w:t>0.41</w:t>
+            </w:r>
+          </w:p>
+        </w:tc>
+      </w:tr>
+      <w:tr>
+        <w:trPr>
+          <w:cantSplit/>
+        </w:trPr>
+        <w:tc>
+          <w:tcPr>
+            <w:tcW w:type="dxa" w:w="2154"/>
+          </w:tcPr>
+          <w:p>
+            <w:pPr>
+              <w:spacing w:after="0" w:line="264" w:lineRule="auto"/>
+            </w:pPr>
+            <w:r>
+              <w:rPr>
+                <w:rFonts w:ascii="맑은 고딕" w:hAnsi="맑은 고딕" w:eastAsia="맑은 고딕" w:cs="맑은 고딕"/>
+                <w:b w:val="0"/>
+                <w:sz w:val="18"/>
+              </w:rPr>
+              <w:t>40초 / 20초</w:t>
+            </w:r>
+          </w:p>
+        </w:tc>
+        <w:tc>
+          <w:tcPr>
+            <w:tcW w:type="dxa" w:w="1361"/>
+          </w:tcPr>
+          <w:p>
+            <w:pPr>
+              <w:spacing w:after="0" w:line="264" w:lineRule="auto"/>
+              <w:jc w:val="center"/>
+            </w:pPr>
+            <w:r>
+              <w:rPr>
+                <w:rFonts w:ascii="맑은 고딕" w:hAnsi="맑은 고딕" w:eastAsia="맑은 고딕" w:cs="맑은 고딕"/>
+                <w:b w:val="0"/>
+                <w:sz w:val="18"/>
+              </w:rPr>
+              <w:t>439</w:t>
+            </w:r>
+          </w:p>
+        </w:tc>
+        <w:tc>
+          <w:tcPr>
+            <w:tcW w:type="dxa" w:w="1928"/>
+          </w:tcPr>
+          <w:p>
+            <w:pPr>
+              <w:spacing w:after="0" w:line="264" w:lineRule="auto"/>
+              <w:jc w:val="center"/>
+            </w:pPr>
+            <w:r>
+              <w:rPr>
+                <w:rFonts w:ascii="맑은 고딕" w:hAnsi="맑은 고딕" w:eastAsia="맑은 고딕" w:cs="맑은 고딕"/>
+                <w:b w:val="0"/>
+                <w:sz w:val="18"/>
+              </w:rPr>
+              <w:t>5</w:t>
+            </w:r>
+          </w:p>
+        </w:tc>
+        <w:tc>
+          <w:tcPr>
+            <w:tcW w:type="dxa" w:w="2154"/>
+          </w:tcPr>
+          <w:p>
+            <w:pPr>
+              <w:spacing w:after="0" w:line="264" w:lineRule="auto"/>
+              <w:jc w:val="center"/>
+            </w:pPr>
+            <w:r>
+              <w:rPr>
+                <w:rFonts w:ascii="맑은 고딕" w:hAnsi="맑은 고딕" w:eastAsia="맑은 고딕" w:cs="맑은 고딕"/>
+                <w:b w:val="0"/>
+                <w:sz w:val="18"/>
+              </w:rPr>
+              <w:t>8</w:t>
+            </w:r>
+          </w:p>
+        </w:tc>
+        <w:tc>
+          <w:tcPr>
+            <w:tcW w:type="dxa" w:w="2041"/>
+          </w:tcPr>
+          <w:p>
+            <w:pPr>
+              <w:spacing w:after="0" w:line="264" w:lineRule="auto"/>
+              <w:jc w:val="center"/>
+            </w:pPr>
+            <w:r>
+              <w:rPr>
+                <w:rFonts w:ascii="맑은 고딕" w:hAnsi="맑은 고딕" w:eastAsia="맑은 고딕" w:cs="맑은 고딕"/>
+                <w:b w:val="0"/>
+                <w:sz w:val="18"/>
+              </w:rPr>
+              <w:t>0.43</w:t>
+            </w:r>
+          </w:p>
+        </w:tc>
+      </w:tr>
+    </w:tbl>
+    <w:p>
+      <w:pPr>
+        <w:spacing w:after="40"/>
+      </w:pPr>
+    </w:p>
+    <w:p>
+      <w:pPr>
+        <w:pStyle w:val="ListBullet"/>
+        <w:spacing w:after="40"/>
+      </w:pPr>
+      <w:r>
+        <w:rPr>
+          <w:rFonts w:ascii="맑은 고딕" w:hAnsi="맑은 고딕" w:eastAsia="맑은 고딕" w:cs="맑은 고딕"/>
+          <w:b/>
+          <w:sz w:val="20"/>
+        </w:rPr>
+        <w:t>기본값(20초/10초)은 유지한다.</w:t>
+      </w:r>
+      <w:r>
+        <w:rPr>
+          <w:rFonts w:ascii="맑은 고딕" w:hAnsi="맑은 고딕" w:eastAsia="맑은 고딕" w:cs="맑은 고딕"/>
+          <w:b w:val="0"/>
+          <w:sz w:val="20"/>
+        </w:rPr>
+        <w:t xml:space="preserve"> 10초/5초와 점수가 같았고 청크 수는 절반이라 인덱스가 작다. 30초 이상으로 늘리면 적중 수가 떨어졌다(11 → 9 → 5). 청크가 길수록 한 청크에 여러 장면이 섞여 질문과의 거리가 흐려지고, 고른 근거 cue가 정답 시각에서 멀어지는 것이 원인일 수 있으나 이 실험으로 원인을 가르지는 못했다.</w:t>
+      </w:r>
+    </w:p>
+    <w:p>
+      <w:pPr>
+        <w:pStyle w:val="ListBullet"/>
+        <w:spacing w:after="40"/>
+      </w:pPr>
+      <w:r>
+        <w:rPr>
+          <w:rFonts w:ascii="맑은 고딕" w:hAnsi="맑은 고딕" w:eastAsia="맑은 고딕" w:cs="맑은 고딕"/>
+          <w:b/>
+          <w:sz w:val="20"/>
+        </w:rPr>
+        <w:t>지연은 순서와 캐시에 영향을 받는다.</w:t>
+      </w:r>
+      <w:r>
+        <w:rPr>
+          <w:rFonts w:ascii="맑은 고딕" w:hAnsi="맑은 고딕" w:eastAsia="맑은 고딕" w:cs="맑은 고딕"/>
+          <w:b w:val="0"/>
+          <w:sz w:val="20"/>
+        </w:rPr>
+        <w:t xml:space="preserve"> 청크가 길어질수록 지연이 늘었지만 설정을 순서대로 한 번씩만 실행했으므로 지연 차이를 청크 길이의 효과라고 단정하지 않는다.</w:t>
+      </w:r>
+    </w:p>
+    <w:p>
+      <w:pPr>
+        <w:pStyle w:val="ListBullet"/>
+        <w:spacing w:after="40"/>
+      </w:pPr>
+      <w:r>
+        <w:rPr>
+          <w:rFonts w:ascii="맑은 고딕" w:hAnsi="맑은 고딕" w:eastAsia="맑은 고딕" w:cs="맑은 고딕"/>
+          <w:b/>
+          <w:sz w:val="20"/>
+        </w:rPr>
+        <w:t>한계</w:t>
+      </w:r>
+      <w:r>
+        <w:rPr>
+          <w:rFonts w:ascii="맑은 고딕" w:hAnsi="맑은 고딕" w:eastAsia="맑은 고딕" w:cs="맑은 고딕"/>
+          <w:b w:val="0"/>
+          <w:sz w:val="20"/>
+        </w:rPr>
+        <w:t>: 18문항, 설정당 1회라서 1~2문항 차이는 우연일 수 있다. 10초/5초와 20초/10초의 같은 점수도 "차이가 없다"는 뜻이지 "같다"는 증명은 아니다. 영어 검색어 조건과 Agent는 측정하지 않았다. 5초/2.5초처럼 더 짧은 창이나 더 큰 이동 폭은 시험하지 않았다.</w:t>
+      </w:r>
     </w:p>
     <w:sectPr>
       <w:headerReference w:type="default" r:id="rId9"/>

</xml_diff>

<commit_message>
docs: apply review feedback to the report, add a compact variant, rework the PPT
- Report: summary now includes the found-precision drop (16/16 -> 16/17) and
  limits the safety claim to what was measured; metric definitions (3.1);
  fairness notes for A/B latency and the dual-query comparison; clarified what
  source-cue verification does and does not guarantee; cue selection details,
  top-3 limit and a failure-type check (4.2); shorter Multi-Agent section;
  reproducibility table (appendix B); fixed the gold-label provenance wording.
- Add make_report_compact.py and a 25-page compact variant (docx/PDF preview)
  next to the original so both can be compared.
- PPT: restructure into 2 min (topic, tasks, results) + 3 min (Agent Graph,
  MCP, RAG code); move the limits slide to the backup section.
- Remove self-referential sentences from the report text.

Co-Authored-By: Claude Sonnet 5.5 <noreply@anthropic.com>
</commit_message>
<xml_diff>
--- a/docs/exec/G078_문희주_최종보고서_초안.docx
+++ b/docs/exec/G078_문희주_최종보고서_초안.docx
@@ -113,7 +113,23 @@
                 <w:b w:val="0"/>
                 <w:sz w:val="20"/>
               </w:rPr>
-              <w:t>이다. 자막에서 후보를 찾고, 원본 자막과 다시 대조해 검증한 뒤, 검증을 통과한 장면만 영상 링크와 함께 보여 준다.</w:t>
+              <w:t xml:space="preserve">이다. 자막에서 후보를 찾고, 원본 자막과 다시 대조해 검증한 뒤, 검증을 통과한 장면만 영상 링크와 함께 보여 준다. 중심 성과는 </w:t>
+            </w:r>
+            <w:r>
+              <w:rPr>
+                <w:rFonts w:ascii="맑은 고딕" w:hAnsi="맑은 고딕" w:eastAsia="맑은 고딕" w:cs="맑은 고딕"/>
+                <w:b/>
+                <w:sz w:val="20"/>
+              </w:rPr>
+              <w:t>자막 근거와 영상 시점을 코드로 연결하고, 의미 판정과 최대 2번의 재검색을 결합해 브라우저에서 실제로 동작하는 서비스로 구현한 것</w:t>
+            </w:r>
+            <w:r>
+              <w:rPr>
+                <w:rFonts w:ascii="맑은 고딕" w:hAnsi="맑은 고딕" w:eastAsia="맑은 고딕" w:cs="맑은 고딕"/>
+                <w:b w:val="0"/>
+                <w:sz w:val="20"/>
+              </w:rPr>
+              <w:t>이다.</w:t>
             </w:r>
           </w:p>
         </w:tc>
@@ -214,7 +230,7 @@
                 <w:b w:val="0"/>
                 <w:sz w:val="19"/>
               </w:rPr>
-              <w:t xml:space="preserve">: 정답 평가셋의 장면 질문 18개 중 Agent가 1위로 정답을 맞힌 것이 </w:t>
+              <w:t xml:space="preserve">: 정답 평가셋의 장면 질문 18개 중 Agent가 "찾음"으로 응답하고 1위가 정답인 것이 </w:t>
             </w:r>
             <w:r>
               <w:rPr>
@@ -230,7 +246,7 @@
                 <w:b w:val="0"/>
                 <w:sz w:val="19"/>
               </w:rPr>
-              <w:t>이다. 같은 조건의 일반 검색(Hybrid)은 11~15개였다. 다만 차이가 1~5문항이고 질문당 1회만 실행해서, Agent가 더 낫다고 단정할 수는 없다.</w:t>
+              <w:t>이다. 같은 조건의 일반 검색(Hybrid)은 11~15개였다. 다만 차이가 1~5문항이고 질문당 1회만 실행해서, Agent가 더 낫다고 단정할 수는 없다. 지표의 집계 기준은 3.1절에 정의했다.</w:t>
             </w:r>
           </w:p>
           <w:p>
@@ -251,7 +267,7 @@
                 <w:b/>
                 <w:sz w:val="19"/>
               </w:rPr>
-              <w:t>안전성</w:t>
+              <w:t>안전성(확인한 범위)</w:t>
             </w:r>
             <w:r>
               <w:rPr>
@@ -259,7 +275,7 @@
                 <w:b w:val="0"/>
                 <w:sz w:val="19"/>
               </w:rPr>
-              <w:t xml:space="preserve">: 근거 없이 화자를 단정한 경우 </w:t>
+              <w:t xml:space="preserve">: 이 평가셋 20문항에서 근거 없이 화자를 단정한 경우 </w:t>
             </w:r>
             <w:r>
               <w:rPr>
@@ -275,7 +291,7 @@
                 <w:b w:val="0"/>
                 <w:sz w:val="19"/>
               </w:rPr>
-              <w:t>, 자막으로 알 수 없는 요청 2개를 모두 거부했다.</w:t>
+              <w:t>, 자막으로 알 수 없는 요청 2개 모두 거부, 화자 질문 4개 중 3개를 성공했다. 이는 평가셋 안의 결과이며, 검증을 통과했다는 것이 그 장면이 사용자 의도에 맞는다는 보장은 아니다.</w:t>
             </w:r>
           </w:p>
           <w:p>
@@ -296,7 +312,7 @@
                 <w:b/>
                 <w:sz w:val="19"/>
               </w:rPr>
-              <w:t>개선 전/후</w:t>
+              <w:t>개선 전/후(v2 → v3)</w:t>
             </w:r>
             <w:r>
               <w:rPr>
@@ -304,7 +320,52 @@
                 <w:b w:val="0"/>
                 <w:sz w:val="19"/>
               </w:rPr>
-              <w:t>: 1위 적중은 16/18로 같았고, 화자 질문 처리가 2/4 → 3/4로 나아졌으며 LLM 호출이 16% 줄었다(50 → 42회). 대신 입력 토큰이 24% 늘었다.</w:t>
+              <w:t xml:space="preserve">: 1위 적중은 16/18로 같았다. 화자 질문 처리가 2/4 → 3/4로, LLM 호출이 16% 줄었다(50 → 42회). 반대로 입력 토큰이 24% 늘었고, "찾음"으로 응답한 사례 중 정답 비율이 16/16에서 </w:t>
+            </w:r>
+            <w:r>
+              <w:rPr>
+                <w:rFonts w:ascii="맑은 고딕" w:hAnsi="맑은 고딕" w:eastAsia="맑은 고딕" w:cs="맑은 고딕"/>
+                <w:b/>
+                <w:sz w:val="19"/>
+              </w:rPr>
+              <w:t>16/17(94.1%)</w:t>
+            </w:r>
+            <w:r>
+              <w:rPr>
+                <w:rFonts w:ascii="맑은 고딕" w:hAnsi="맑은 고딕" w:eastAsia="맑은 고딕" w:cs="맑은 고딕"/>
+                <w:b w:val="0"/>
+                <w:sz w:val="19"/>
+              </w:rPr>
+              <w:t>로 낮아졌다. 틀린 장면을 "찾음"으로 응답한 사례가 0건에서 1건으로 늘었기 때문이다.</w:t>
+            </w:r>
+          </w:p>
+          <w:p>
+            <w:pPr>
+              <w:spacing w:after="0"/>
+            </w:pPr>
+            <w:r>
+              <w:rPr>
+                <w:rFonts w:ascii="맑은 고딕" w:hAnsi="맑은 고딕" w:eastAsia="맑은 고딕" w:cs="맑은 고딕"/>
+                <w:b w:val="0"/>
+                <w:sz w:val="19"/>
+              </w:rPr>
+              <w:t xml:space="preserve">• </w:t>
+            </w:r>
+            <w:r>
+              <w:rPr>
+                <w:rFonts w:ascii="맑은 고딕" w:hAnsi="맑은 고딕" w:eastAsia="맑은 고딕" w:cs="맑은 고딕"/>
+                <w:b/>
+                <w:sz w:val="19"/>
+              </w:rPr>
+              <w:t>추가 측정(2026-10-22)</w:t>
+            </w:r>
+            <w:r>
+              <w:rPr>
+                <w:rFonts w:ascii="맑은 고딕" w:hAnsi="맑은 고딕" w:eastAsia="맑은 고딕" w:cs="맑은 고딕"/>
+                <w:b w:val="0"/>
+                <w:sz w:val="19"/>
+              </w:rPr>
+              <w:t>: 이중 첫 검색을 켜도 1위 적중은 16/18로 같고 검색 호출만 늘어 기본값은 꺼 두었다. 청크 길이는 20초/10초를 유지했다.</w:t>
             </w:r>
           </w:p>
           <w:p>
@@ -353,17 +414,6 @@
           <w:sz w:val="18"/>
         </w:rPr>
         <w:t>저장소: https://github.com/creepygrape/skala-AICapstone-mini-2   (실행 방법은 부록 B)</w:t>
-      </w:r>
-    </w:p>
-    <w:p>
-      <w:r>
-        <w:rPr>
-          <w:rFonts w:ascii="맑은 고딕" w:hAnsi="맑은 고딕" w:eastAsia="맑은 고딕" w:cs="맑은 고딕"/>
-          <w:b w:val="0"/>
-          <w:color w:val="5A5A5A"/>
-          <w:sz w:val="18"/>
-        </w:rPr>
-        <w:t>측정한 값과 측정하지 못한 값을 구분해서 적었다.</w:t>
       </w:r>
     </w:p>
     <w:p>
@@ -664,7 +714,7 @@
                 <w:b w:val="0"/>
                 <w:sz w:val="18"/>
               </w:rPr>
-              <w:t>사람이 영상을 확인해 정답 시점을 정해 둔 평가용 질문 20개(장면 질문 18, 자막으로 알 수 없는 요청 2).</w:t>
+              <w:t>원본 cue를 검토해 정답 구간을 정하고 사용자가 20문항을 승인한 평가용 질문(장면 질문 18, 자막으로 알 수 없는 요청 2). 영상 화면과의 대조는 영상별 3점 표본으로만 했다(4.3절).</w:t>
             </w:r>
           </w:p>
         </w:tc>
@@ -705,7 +755,7 @@
                 <w:b w:val="0"/>
                 <w:sz w:val="18"/>
               </w:rPr>
-              <w:t>검색 1위 결과가 정답 시점(±10초)인 비율 / 상위 3개 안에 정답이 있는 비율.</w:t>
+              <w:t>반환한 1위 결과의 링크 시각이 정답 구간(±10초) 안인 문항 수 / 상위 3개 중 하나라도 그런 문항 수. Agent(C)는 "찾음"으로 응답한 경우만 센다(3.1절).</w:t>
             </w:r>
           </w:p>
         </w:tc>
@@ -1946,7 +1996,7 @@
           <w:b w:val="0"/>
           <w:sz w:val="20"/>
         </w:rPr>
-        <w:t>: 모델이나 도구의 오류는 재검색 사유로 쓰지 않는다. 검증 전 후보만 있으면 "부분 결과"와 경고로, 이전에 불확실 판정이 있었으면 "애매함"으로 응답하고, 아무것도 없으면 안전한 오류 코드만 보낸다. 검증 전 결과는 화면에 보내지 않는다.</w:t>
+        <w:t>: 모델이나 도구의 오류는 재검색 사유로 쓰지 않는다. 여기서 "검증"은 두 가지다. 코드의 원본 대조(cue 존재, 영상·시각·인용의 일관성)는 통과했지만 LLM 의미 판정을 마치지 못한 후보만 있으면 "부분 결과"로 응답하고 의미 판정을 건너뛰었다는 경고를 붙인다. 이전에 "불확실" 판정이 있었으면 "애매함"으로 응답하고, 아무것도 없으면 안전한 오류 코드만 보낸다. 실시간(SSE) 전송 중에는 진행 단계 이벤트만 보내고, 결과는 이 최종 응답 하나로만 보낸다. 즉 "검증 전 결과는 보내지 않는다"는 것은 원본 대조를 거치지 않은 후보를 중간에 화면에 보내지 않는다는 뜻이다.</w:t>
       </w:r>
     </w:p>
     <w:p>
@@ -2536,7 +2586,7 @@
           <w:b w:val="0"/>
           <w:sz w:val="20"/>
         </w:rPr>
-        <w:t xml:space="preserve">: 영상별로 20초 단위를 10초씩 겹쳐 만든다. 영상을 가로질러 묶지 않으며, 각 청크는 포함된 cue 목록을 가지고 있어 결과를 항상 원본 cue로 되돌릴 수 있다. 자막 한 줄은 1~3초로 짧아 한 줄만으로는 의미 검색이 어렵고, 한 장면은 보통 수십 초에 걸쳐 이어진다고 보아 20초로 묶었다. 10초(절반)씩 겹치는 것은 장면이 단위의 경계에 걸쳐도 어느 한 단위에는 온전히 들어가게 하기 위해서이다. </w:t>
+        <w:t xml:space="preserve">: 영상별로 20초 단위를 10초씩 겹쳐 만든다. 영상을 가로질러 묶지 않으며, 각 청크는 포함된 cue 목록을 가지고 있어 결과를 항상 원본 cue로 되돌릴 수 있다. 자막 한 줄은 1~3초로 짧아 한 줄만으로는 의미 검색이 어렵고, 한 장면은 보통 수십 초에 걸쳐 이어진다고 보아 20초로 묶었다. 10초(절반)씩 겹치는 것은 장면이 단위의 경계에 걸리는 일을 줄이기 위해서이다. 10초 이하의 장면은 어느 한 단위에 온전히 들어가지만, 그보다 긴 장면은 한 청크에 다 들어간다고 보장하지 못한다. </w:t>
       </w:r>
       <w:r>
         <w:rPr>
@@ -2582,7 +2632,83 @@
           <w:b w:val="0"/>
           <w:sz w:val="20"/>
         </w:rPr>
-        <w:t xml:space="preserve"> 점수를 주고 두 목록의 점수를 더하는 방식이며, 60은 기본값을 사용했다. 합친 뒤 같은 영상에서 10초 이내인 후보는 하나만 남긴다. 청크 안에서 질문과 가장 가까운 cue를 대표 근거로 고른다.</w:t>
+        <w:t xml:space="preserve"> 점수를 주고 두 목록의 점수를 더하는 방식이며, 60은 기본값을 사용했다. 합친 뒤 같은 영상에서 cue가 겹치거나 시작이 10초 이내인 후보는 하나만 남기고, 위에서부터 </w:t>
+      </w:r>
+      <w:r>
+        <w:rPr>
+          <w:rFonts w:ascii="맑은 고딕" w:hAnsi="맑은 고딕" w:eastAsia="맑은 고딕" w:cs="맑은 고딕"/>
+          <w:b/>
+          <w:sz w:val="20"/>
+        </w:rPr>
+        <w:t>최대 3개</w:t>
+      </w:r>
+      <w:r>
+        <w:rPr>
+          <w:rFonts w:ascii="맑은 고딕" w:hAnsi="맑은 고딕" w:eastAsia="맑은 고딕" w:cs="맑은 고딕"/>
+          <w:b w:val="0"/>
+          <w:sz w:val="20"/>
+        </w:rPr>
+        <w:t>(top_k=3)를 후보로 쓴다(BM25는 질문과 단어가 하나라도 겹치는 청크만 순위에 오른다).</w:t>
+      </w:r>
+    </w:p>
+    <w:p>
+      <w:pPr>
+        <w:pStyle w:val="ListBullet"/>
+        <w:spacing w:after="40"/>
+      </w:pPr>
+      <w:r>
+        <w:rPr>
+          <w:rFonts w:ascii="맑은 고딕" w:hAnsi="맑은 고딕" w:eastAsia="맑은 고딕" w:cs="맑은 고딕"/>
+          <w:b/>
+          <w:sz w:val="20"/>
+        </w:rPr>
+        <w:t>대표 근거 cue</w:t>
+      </w:r>
+      <w:r>
+        <w:rPr>
+          <w:rFonts w:ascii="맑은 고딕" w:hAnsi="맑은 고딕" w:eastAsia="맑은 고딕" w:cs="맑은 고딕"/>
+          <w:b w:val="0"/>
+          <w:sz w:val="20"/>
+        </w:rPr>
+        <w:t xml:space="preserve">: 후보 청크 안의 cue마다 의미 검색 임베딩(bge-m3, 길이 1로 정규화)과 그 검색에 쓴 질문의 임베딩의 내적을 구해 가장 높은 cue </w:t>
+      </w:r>
+      <w:r>
+        <w:rPr>
+          <w:rFonts w:ascii="맑은 고딕" w:hAnsi="맑은 고딕" w:eastAsia="맑은 고딕" w:cs="맑은 고딕"/>
+          <w:b/>
+          <w:sz w:val="20"/>
+        </w:rPr>
+        <w:t>한 개</w:t>
+      </w:r>
+      <w:r>
+        <w:rPr>
+          <w:rFonts w:ascii="맑은 고딕" w:hAnsi="맑은 고딕" w:eastAsia="맑은 고딕" w:cs="맑은 고딕"/>
+          <w:b w:val="0"/>
+          <w:sz w:val="20"/>
+        </w:rPr>
+        <w:t>를 고른다(연속 구간이 아니라 단일 cue이며, 동점이면 청크 안에서 먼저 나온 cue). 질문은 해당 검색에 실제로 넣은 문자열이다. 즉 Router가 만든 영어 검색어이거나, 이중 첫 검색의 한국어 원문이다. 키워드 전용 모드는 질문과 겹치는 단어 수가 가장 많은 cue를 고른다. 사용자에게 보이는 인용과 시각은 이 cue를 원본에서 다시 읽어 만든다.</w:t>
+      </w:r>
+    </w:p>
+    <w:p>
+      <w:pPr>
+        <w:pStyle w:val="ListBullet"/>
+        <w:spacing w:after="40"/>
+      </w:pPr>
+      <w:r>
+        <w:rPr>
+          <w:rFonts w:ascii="맑은 고딕" w:hAnsi="맑은 고딕" w:eastAsia="맑은 고딕" w:cs="맑은 고딕"/>
+          <w:b/>
+          <w:sz w:val="20"/>
+        </w:rPr>
+        <w:t>후보 3개 제한의 영향</w:t>
+      </w:r>
+      <w:r>
+        <w:rPr>
+          <w:rFonts w:ascii="맑은 고딕" w:hAnsi="맑은 고딕" w:eastAsia="맑은 고딕" w:cs="맑은 고딕"/>
+          <w:b w:val="0"/>
+          <w:sz w:val="20"/>
+        </w:rPr>
+        <w:t>: 후보를 3개로 두면 판정 LLM의 토큰과 외부 전송량이 늘지 않는 대신, 정답 청크가 4위 이하이면 판정할 기회 자체가 없다. 실제로 이런 문항이 있었다(4.2절 실패 유형 점검).</w:t>
       </w:r>
     </w:p>
     <w:p>
@@ -3410,7 +3536,7 @@
           <w:b/>
           <w:sz w:val="20"/>
         </w:rPr>
-        <w:t>백엔드 177개 통과, 1개 건너뜀</w:t>
+        <w:t>백엔드 178개 통과</w:t>
       </w:r>
       <w:r>
         <w:rPr>
@@ -3418,7 +3544,7 @@
           <w:b w:val="0"/>
           <w:sz w:val="20"/>
         </w:rPr>
-        <w:t xml:space="preserve">(Windows에서 권한이 없으면 건너뛰는 파일 링크 테스트), </w:t>
+        <w:t xml:space="preserve">(macOS에서 2026-10-22 재실행. Windows에서는 권한이 없으면 건너뛰는 파일 링크 테스트 1개가 있어 177개 통과·1개 건너뜀), </w:t>
       </w:r>
       <w:r>
         <w:rPr>
@@ -3479,7 +3605,7 @@
           <w:color w:val="3C3C3C"/>
           <w:sz w:val="18"/>
         </w:rPr>
-        <w:t>표 7. 백엔드 테스트 영역별 내용 (합계 178개: 177개 통과, 1개 건너뜀)</w:t>
+        <w:t>표 7. 백엔드 테스트 영역별 내용 (합계 178개)</w:t>
       </w:r>
     </w:p>
     <w:tbl>
@@ -4007,7 +4133,7 @@
           <w:b w:val="0"/>
           <w:sz w:val="20"/>
         </w:rPr>
-        <w:t xml:space="preserve"> 개선 후(v3)에도 1위 적중 수는 16/18로 같았다. 달라진 것은 화자 질문 처리(2/4 → 3/4), LLM 호출 수(50 → 42회), 평균 지연(2.88 → 2.57초)이고, 입력 토큰은 오히려 늘었다. 아래 모든 수치는 </w:t>
+        <w:t xml:space="preserve"> 개선 후(v3)에도 1위 적중 수는 16/18로 같았다. 좋아진 것은 화자 질문 처리(2/4 → 3/4), LLM 호출 수(50 → 42회), 평균 지연(2.88 → 2.57초)이다. 나빠진 것은 입력 토큰(+24%)과 "찾음" 응답의 정확도다. 틀린 장면을 "찾음"으로 응답한 사례가 0건에서 1건으로 늘어 "찾음" 응답 중 정답 비율이 16/16에서 16/17(94.1%)이 됐다. 아래 모든 수치는 </w:t>
       </w:r>
       <w:r>
         <w:rPr>
@@ -4057,7 +4183,7 @@
           <w:b w:val="0"/>
           <w:sz w:val="20"/>
         </w:rPr>
-        <w:t>: 정답 평가셋(gold) 20문항. 장면 질문 18개(일반 13, 같은 말을 하는 장면이 여러 개인 질문 1, 화자 질문 4)와 자막으로 알 수 없는 요청 2개. 같은 영상 3편, 같은 정답. 정답은 영상이 맞고 링크 시각이 정답 구간 ±10초 안일 때이다.</w:t>
+        <w:t>: 정답 평가셋(gold) 20문항. 장면 질문 18개(일반 13, 같은 말을 하는 장면이 여러 개인 질문 1, 화자 질문 4)와 자막으로 알 수 없는 요청 2개. 같은 영상 3편, 같은 정답. 정답 구간은 어시스턴트가 원본 cue를 검토해 제안하고 사용자가 20문항을 승인한 것이며, 영상 화면과의 대조는 영상별 3점 표본에 한정한다(4.3절). 성공 기준은 아래 지표 정의를 따른다.</w:t>
       </w:r>
     </w:p>
     <w:p>
@@ -4225,6 +4351,507 @@
       </w:r>
     </w:p>
     <w:p>
+      <w:pPr>
+        <w:pStyle w:val="Heading3"/>
+      </w:pPr>
+      <w:r>
+        <w:rPr>
+          <w:rFonts w:ascii="맑은 고딕" w:hAnsi="맑은 고딕" w:eastAsia="맑은 고딕" w:cs="맑은 고딕"/>
+          <w:b/>
+        </w:rPr>
+        <w:t>평가 지표 정의</w:t>
+      </w:r>
+    </w:p>
+    <w:p>
+      <w:pPr>
+        <w:keepNext/>
+        <w:spacing w:after="40"/>
+      </w:pPr>
+      <w:r>
+        <w:rPr>
+          <w:rFonts w:ascii="맑은 고딕" w:hAnsi="맑은 고딕" w:eastAsia="맑은 고딕" w:cs="맑은 고딕"/>
+          <w:b/>
+          <w:color w:val="3C3C3C"/>
+          <w:sz w:val="18"/>
+        </w:rPr>
+        <w:t>표 8. 평가 지표 정의와 집계 기준</w:t>
+      </w:r>
+    </w:p>
+    <w:tbl>
+      <w:tblPr>
+        <w:tblStyle w:val="TableGrid"/>
+        <w:tblW w:type="auto" w:w="0"/>
+        <w:jc w:val="center"/>
+        <w:tblLayout w:type="fixed"/>
+        <w:tblLook w:firstColumn="1" w:firstRow="1" w:lastColumn="0" w:lastRow="0" w:noHBand="0" w:noVBand="1" w:val="04A0"/>
+        <w:tblCellMar>
+          <w:top w:w="50" w:type="dxa"/>
+          <w:left w:w="90" w:type="dxa"/>
+          <w:bottom w:w="50" w:type="dxa"/>
+          <w:right w:w="90" w:type="dxa"/>
+        </w:tblCellMar>
+      </w:tblPr>
+      <w:tblGrid>
+        <w:gridCol w:w="3213"/>
+        <w:gridCol w:w="3213"/>
+        <w:gridCol w:w="3213"/>
+      </w:tblGrid>
+      <w:tr>
+        <w:trPr>
+          <w:cantSplit/>
+          <w:tblHeader/>
+        </w:trPr>
+        <w:tc>
+          <w:tcPr>
+            <w:tcW w:type="dxa" w:w="1928"/>
+            <w:shd w:val="clear" w:color="auto" w:fill="D9E2F3"/>
+          </w:tcPr>
+          <w:p>
+            <w:pPr>
+              <w:keepNext/>
+              <w:spacing w:after="0" w:line="264" w:lineRule="auto"/>
+              <w:jc w:val="center"/>
+            </w:pPr>
+            <w:r>
+              <w:rPr>
+                <w:rFonts w:ascii="맑은 고딕" w:hAnsi="맑은 고딕" w:eastAsia="맑은 고딕" w:cs="맑은 고딕"/>
+                <w:b/>
+                <w:sz w:val="17"/>
+              </w:rPr>
+              <w:t>지표</w:t>
+            </w:r>
+          </w:p>
+        </w:tc>
+        <w:tc>
+          <w:tcPr>
+            <w:tcW w:type="dxa" w:w="2041"/>
+            <w:shd w:val="clear" w:color="auto" w:fill="D9E2F3"/>
+          </w:tcPr>
+          <w:p>
+            <w:pPr>
+              <w:keepNext/>
+              <w:spacing w:after="0" w:line="264" w:lineRule="auto"/>
+              <w:jc w:val="center"/>
+            </w:pPr>
+            <w:r>
+              <w:rPr>
+                <w:rFonts w:ascii="맑은 고딕" w:hAnsi="맑은 고딕" w:eastAsia="맑은 고딕" w:cs="맑은 고딕"/>
+                <w:b/>
+                <w:sz w:val="17"/>
+              </w:rPr>
+              <w:t>분모</w:t>
+            </w:r>
+          </w:p>
+        </w:tc>
+        <w:tc>
+          <w:tcPr>
+            <w:tcW w:type="dxa" w:w="5669"/>
+            <w:shd w:val="clear" w:color="auto" w:fill="D9E2F3"/>
+          </w:tcPr>
+          <w:p>
+            <w:pPr>
+              <w:keepNext/>
+              <w:spacing w:after="0" w:line="264" w:lineRule="auto"/>
+              <w:jc w:val="center"/>
+            </w:pPr>
+            <w:r>
+              <w:rPr>
+                <w:rFonts w:ascii="맑은 고딕" w:hAnsi="맑은 고딕" w:eastAsia="맑은 고딕" w:cs="맑은 고딕"/>
+                <w:b/>
+                <w:sz w:val="17"/>
+              </w:rPr>
+              <w:t>성공 기준 (평가 코드 eval/metrics.py 기준)</w:t>
+            </w:r>
+          </w:p>
+        </w:tc>
+      </w:tr>
+      <w:tr>
+        <w:trPr>
+          <w:cantSplit/>
+        </w:trPr>
+        <w:tc>
+          <w:tcPr>
+            <w:tcW w:type="dxa" w:w="1928"/>
+          </w:tcPr>
+          <w:p>
+            <w:pPr>
+              <w:spacing w:after="0" w:line="264" w:lineRule="auto"/>
+            </w:pPr>
+            <w:r>
+              <w:rPr>
+                <w:rFonts w:ascii="맑은 고딕" w:hAnsi="맑은 고딕" w:eastAsia="맑은 고딕" w:cs="맑은 고딕"/>
+                <w:b w:val="0"/>
+                <w:sz w:val="17"/>
+              </w:rPr>
+              <w:t>장면 1위 적중</w:t>
+            </w:r>
+          </w:p>
+        </w:tc>
+        <w:tc>
+          <w:tcPr>
+            <w:tcW w:type="dxa" w:w="2041"/>
+          </w:tcPr>
+          <w:p>
+            <w:pPr>
+              <w:spacing w:after="0" w:line="264" w:lineRule="auto"/>
+            </w:pPr>
+            <w:r>
+              <w:rPr>
+                <w:rFonts w:ascii="맑은 고딕" w:hAnsi="맑은 고딕" w:eastAsia="맑은 고딕" w:cs="맑은 고딕"/>
+                <w:b w:val="0"/>
+                <w:sz w:val="17"/>
+              </w:rPr>
+              <w:t>정답 장면이 있는 18문항(화자 질문 4개 포함)</w:t>
+            </w:r>
+          </w:p>
+        </w:tc>
+        <w:tc>
+          <w:tcPr>
+            <w:tcW w:type="dxa" w:w="5669"/>
+          </w:tcPr>
+          <w:p>
+            <w:pPr>
+              <w:spacing w:after="0" w:line="264" w:lineRule="auto"/>
+            </w:pPr>
+            <w:r>
+              <w:rPr>
+                <w:rFonts w:ascii="맑은 고딕" w:hAnsi="맑은 고딕" w:eastAsia="맑은 고딕" w:cs="맑은 고딕"/>
+                <w:b w:val="0"/>
+                <w:sz w:val="17"/>
+              </w:rPr>
+              <w:t xml:space="preserve">반환한 1위 결과의 영상이 정답이고, 링크 시각 floor(start_seconds) 한 점이 정답 구간 ±10초 안이다. 반환 구간이 길게 겹치는 것은 성공이 아니다. </w:t>
+            </w:r>
+            <w:r>
+              <w:rPr>
+                <w:rFonts w:ascii="맑은 고딕" w:hAnsi="맑은 고딕" w:eastAsia="맑은 고딕" w:cs="맑은 고딕"/>
+                <w:b/>
+                <w:sz w:val="17"/>
+              </w:rPr>
+              <w:t>Agent(C)는 결과 상태가 "찾음"(found)일 때만 성공으로 센다.</w:t>
+            </w:r>
+            <w:r>
+              <w:rPr>
+                <w:rFonts w:ascii="맑은 고딕" w:hAnsi="맑은 고딕" w:eastAsia="맑은 고딕" w:cs="맑은 고딕"/>
+                <w:b w:val="0"/>
+                <w:sz w:val="17"/>
+              </w:rPr>
+              <w:t xml:space="preserve"> "애매함"·"부분 결과"로 반환한 후보가 정답이어도 성공에는 넣지 않고 원시 후보 적중으로 따로 기록한다. A·B는 항상 후보 목록(상태 "부분 결과")이라 1위 후보로 판정한다.</w:t>
+            </w:r>
+          </w:p>
+        </w:tc>
+      </w:tr>
+      <w:tr>
+        <w:trPr>
+          <w:cantSplit/>
+        </w:trPr>
+        <w:tc>
+          <w:tcPr>
+            <w:tcW w:type="dxa" w:w="1928"/>
+          </w:tcPr>
+          <w:p>
+            <w:pPr>
+              <w:spacing w:after="0" w:line="264" w:lineRule="auto"/>
+            </w:pPr>
+            <w:r>
+              <w:rPr>
+                <w:rFonts w:ascii="맑은 고딕" w:hAnsi="맑은 고딕" w:eastAsia="맑은 고딕" w:cs="맑은 고딕"/>
+                <w:b w:val="0"/>
+                <w:sz w:val="17"/>
+              </w:rPr>
+              <w:t>상위 3개 적중</w:t>
+            </w:r>
+          </w:p>
+        </w:tc>
+        <w:tc>
+          <w:tcPr>
+            <w:tcW w:type="dxa" w:w="2041"/>
+          </w:tcPr>
+          <w:p>
+            <w:pPr>
+              <w:spacing w:after="0" w:line="264" w:lineRule="auto"/>
+            </w:pPr>
+            <w:r>
+              <w:rPr>
+                <w:rFonts w:ascii="맑은 고딕" w:hAnsi="맑은 고딕" w:eastAsia="맑은 고딕" w:cs="맑은 고딕"/>
+                <w:b w:val="0"/>
+                <w:sz w:val="17"/>
+              </w:rPr>
+              <w:t>위와 같음</w:t>
+            </w:r>
+          </w:p>
+        </w:tc>
+        <w:tc>
+          <w:tcPr>
+            <w:tcW w:type="dxa" w:w="5669"/>
+          </w:tcPr>
+          <w:p>
+            <w:pPr>
+              <w:spacing w:after="0" w:line="264" w:lineRule="auto"/>
+            </w:pPr>
+            <w:r>
+              <w:rPr>
+                <w:rFonts w:ascii="맑은 고딕" w:hAnsi="맑은 고딕" w:eastAsia="맑은 고딕" w:cs="맑은 고딕"/>
+                <w:b w:val="0"/>
+                <w:sz w:val="17"/>
+              </w:rPr>
+              <w:t>반환한 상위 3개 중 하나라도 위 기준을 만족한다. C는 위와 같이 "찾음"일 때만 센다.</w:t>
+            </w:r>
+          </w:p>
+        </w:tc>
+      </w:tr>
+      <w:tr>
+        <w:trPr>
+          <w:cantSplit/>
+        </w:trPr>
+        <w:tc>
+          <w:tcPr>
+            <w:tcW w:type="dxa" w:w="1928"/>
+          </w:tcPr>
+          <w:p>
+            <w:pPr>
+              <w:spacing w:after="0" w:line="264" w:lineRule="auto"/>
+            </w:pPr>
+            <w:r>
+              <w:rPr>
+                <w:rFonts w:ascii="맑은 고딕" w:hAnsi="맑은 고딕" w:eastAsia="맑은 고딕" w:cs="맑은 고딕"/>
+                <w:b w:val="0"/>
+                <w:sz w:val="17"/>
+              </w:rPr>
+              <w:t>"찾음" 응답 정밀도</w:t>
+            </w:r>
+          </w:p>
+        </w:tc>
+        <w:tc>
+          <w:tcPr>
+            <w:tcW w:type="dxa" w:w="2041"/>
+          </w:tcPr>
+          <w:p>
+            <w:pPr>
+              <w:spacing w:after="0" w:line="264" w:lineRule="auto"/>
+            </w:pPr>
+            <w:r>
+              <w:rPr>
+                <w:rFonts w:ascii="맑은 고딕" w:hAnsi="맑은 고딕" w:eastAsia="맑은 고딕" w:cs="맑은 고딕"/>
+                <w:b w:val="0"/>
+                <w:sz w:val="17"/>
+              </w:rPr>
+              <w:t>C가 "찾음"으로 응답한 문항</w:t>
+            </w:r>
+          </w:p>
+        </w:tc>
+        <w:tc>
+          <w:tcPr>
+            <w:tcW w:type="dxa" w:w="5669"/>
+          </w:tcPr>
+          <w:p>
+            <w:pPr>
+              <w:spacing w:after="0" w:line="264" w:lineRule="auto"/>
+            </w:pPr>
+            <w:r>
+              <w:rPr>
+                <w:rFonts w:ascii="맑은 고딕" w:hAnsi="맑은 고딕" w:eastAsia="맑은 고딕" w:cs="맑은 고딕"/>
+                <w:b w:val="0"/>
+                <w:sz w:val="17"/>
+              </w:rPr>
+              <w:t>그중 1위가 정답인 비율(분자 = 1위 적중, 분모 = "찾음" 응답 수, 둘의 차이 = 틀린 장면을 "찾음"으로 응답한 수).</w:t>
+            </w:r>
+          </w:p>
+        </w:tc>
+      </w:tr>
+      <w:tr>
+        <w:trPr>
+          <w:cantSplit/>
+        </w:trPr>
+        <w:tc>
+          <w:tcPr>
+            <w:tcW w:type="dxa" w:w="1928"/>
+          </w:tcPr>
+          <w:p>
+            <w:pPr>
+              <w:spacing w:after="0" w:line="264" w:lineRule="auto"/>
+            </w:pPr>
+            <w:r>
+              <w:rPr>
+                <w:rFonts w:ascii="맑은 고딕" w:hAnsi="맑은 고딕" w:eastAsia="맑은 고딕" w:cs="맑은 고딕"/>
+                <w:b w:val="0"/>
+                <w:sz w:val="17"/>
+              </w:rPr>
+              <w:t>화자 질문 처리 성공</w:t>
+            </w:r>
+          </w:p>
+        </w:tc>
+        <w:tc>
+          <w:tcPr>
+            <w:tcW w:type="dxa" w:w="2041"/>
+          </w:tcPr>
+          <w:p>
+            <w:pPr>
+              <w:spacing w:after="0" w:line="264" w:lineRule="auto"/>
+            </w:pPr>
+            <w:r>
+              <w:rPr>
+                <w:rFonts w:ascii="맑은 고딕" w:hAnsi="맑은 고딕" w:eastAsia="맑은 고딕" w:cs="맑은 고딕"/>
+                <w:b w:val="0"/>
+                <w:sz w:val="17"/>
+              </w:rPr>
+              <w:t>화자 질문 4문항</w:t>
+            </w:r>
+          </w:p>
+        </w:tc>
+        <w:tc>
+          <w:tcPr>
+            <w:tcW w:type="dxa" w:w="5669"/>
+          </w:tcPr>
+          <w:p>
+            <w:pPr>
+              <w:spacing w:after="0" w:line="264" w:lineRule="auto"/>
+            </w:pPr>
+            <w:r>
+              <w:rPr>
+                <w:rFonts w:ascii="맑은 고딕" w:hAnsi="맑은 고딕" w:eastAsia="맑은 고딕" w:cs="맑은 고딕"/>
+                <w:b w:val="0"/>
+                <w:sz w:val="17"/>
+              </w:rPr>
+              <w:t>Router가 화자 질문으로 분류하고, 관련 장면이 1위 적중이며, "자막만으로 화자를 확인할 수 없습니다" 안내가 있고, 화자 단정이 없으며 오류가 아니어야 한다. 네 조건을 모두 만족해야 성공이다.</w:t>
+            </w:r>
+          </w:p>
+        </w:tc>
+      </w:tr>
+      <w:tr>
+        <w:trPr>
+          <w:cantSplit/>
+        </w:trPr>
+        <w:tc>
+          <w:tcPr>
+            <w:tcW w:type="dxa" w:w="1928"/>
+          </w:tcPr>
+          <w:p>
+            <w:pPr>
+              <w:spacing w:after="0" w:line="264" w:lineRule="auto"/>
+            </w:pPr>
+            <w:r>
+              <w:rPr>
+                <w:rFonts w:ascii="맑은 고딕" w:hAnsi="맑은 고딕" w:eastAsia="맑은 고딕" w:cs="맑은 고딕"/>
+                <w:b w:val="0"/>
+                <w:sz w:val="17"/>
+              </w:rPr>
+              <w:t>지원 범위 밖 요청 거부</w:t>
+            </w:r>
+          </w:p>
+        </w:tc>
+        <w:tc>
+          <w:tcPr>
+            <w:tcW w:type="dxa" w:w="2041"/>
+          </w:tcPr>
+          <w:p>
+            <w:pPr>
+              <w:spacing w:after="0" w:line="264" w:lineRule="auto"/>
+            </w:pPr>
+            <w:r>
+              <w:rPr>
+                <w:rFonts w:ascii="맑은 고딕" w:hAnsi="맑은 고딕" w:eastAsia="맑은 고딕" w:cs="맑은 고딕"/>
+                <w:b w:val="0"/>
+                <w:sz w:val="17"/>
+              </w:rPr>
+              <w:t>시각·청각 전용 요청 2문항</w:t>
+            </w:r>
+          </w:p>
+        </w:tc>
+        <w:tc>
+          <w:tcPr>
+            <w:tcW w:type="dxa" w:w="5669"/>
+          </w:tcPr>
+          <w:p>
+            <w:pPr>
+              <w:spacing w:after="0" w:line="264" w:lineRule="auto"/>
+            </w:pPr>
+            <w:r>
+              <w:rPr>
+                <w:rFonts w:ascii="맑은 고딕" w:hAnsi="맑은 고딕" w:eastAsia="맑은 고딕" w:cs="맑은 고딕"/>
+                <w:b w:val="0"/>
+                <w:sz w:val="17"/>
+              </w:rPr>
+              <w:t>결과 상태가 "알 수 없는 요청"(unsupported)이고 결과가 없으며 Router도 같은 의도로 분류했다.</w:t>
+            </w:r>
+          </w:p>
+        </w:tc>
+      </w:tr>
+      <w:tr>
+        <w:trPr>
+          <w:cantSplit/>
+        </w:trPr>
+        <w:tc>
+          <w:tcPr>
+            <w:tcW w:type="dxa" w:w="1928"/>
+          </w:tcPr>
+          <w:p>
+            <w:pPr>
+              <w:spacing w:after="0" w:line="264" w:lineRule="auto"/>
+            </w:pPr>
+            <w:r>
+              <w:rPr>
+                <w:rFonts w:ascii="맑은 고딕" w:hAnsi="맑은 고딕" w:eastAsia="맑은 고딕" w:cs="맑은 고딕"/>
+                <w:b w:val="0"/>
+                <w:sz w:val="17"/>
+              </w:rPr>
+              <w:t>근거 없는 화자 단정</w:t>
+            </w:r>
+          </w:p>
+        </w:tc>
+        <w:tc>
+          <w:tcPr>
+            <w:tcW w:type="dxa" w:w="2041"/>
+          </w:tcPr>
+          <w:p>
+            <w:pPr>
+              <w:spacing w:after="0" w:line="264" w:lineRule="auto"/>
+            </w:pPr>
+            <w:r>
+              <w:rPr>
+                <w:rFonts w:ascii="맑은 고딕" w:hAnsi="맑은 고딕" w:eastAsia="맑은 고딕" w:cs="맑은 고딕"/>
+                <w:b w:val="0"/>
+                <w:sz w:val="17"/>
+              </w:rPr>
+              <w:t>전체 응답</w:t>
+            </w:r>
+          </w:p>
+        </w:tc>
+        <w:tc>
+          <w:tcPr>
+            <w:tcW w:type="dxa" w:w="5669"/>
+          </w:tcPr>
+          <w:p>
+            <w:pPr>
+              <w:spacing w:after="0" w:line="264" w:lineRule="auto"/>
+            </w:pPr>
+            <w:r>
+              <w:rPr>
+                <w:rFonts w:ascii="맑은 고딕" w:hAnsi="맑은 고딕" w:eastAsia="맑은 고딕" w:cs="맑은 고딕"/>
+                <w:b w:val="0"/>
+                <w:sz w:val="17"/>
+              </w:rPr>
+              <w:t>화자 필드가 채워졌거나 사용자에게 보이는 설명문이 발화자를 주장한 건수. 인용문 안의 호명과 화면 편집 설명은 세지 않는다.</w:t>
+            </w:r>
+          </w:p>
+        </w:tc>
+      </w:tr>
+    </w:tbl>
+    <w:p>
+      <w:pPr>
+        <w:spacing w:after="40"/>
+      </w:pPr>
+    </w:p>
+    <w:p>
+      <w:r>
+        <w:rPr>
+          <w:rFonts w:ascii="맑은 고딕" w:hAnsi="맑은 고딕" w:eastAsia="맑은 고딕" w:cs="맑은 고딕"/>
+          <w:b w:val="0"/>
+          <w:sz w:val="19"/>
+        </w:rPr>
+        <w:t>오류가 난 문항은 분모에 그대로 남기며, 정답이 없는 문항(못 찾음이 정답인 질문)은 확정된 것이 없어 이 정확도를 측정하지 못했다. v2에서는 화자 질문 1건이 "애매함"으로 끝났는데 그 후보의 1위는 정답이었다. 이 문항은 위 기준에 따라 v2의 1위 적중에 넣지 않았다(원시 후보 적중은 17/18).</w:t>
+      </w:r>
+    </w:p>
+    <w:p>
       <w:r>
         <w:rPr>
           <w:rFonts w:ascii="맑은 고딕" w:hAnsi="맑은 고딕" w:eastAsia="맑은 고딕" w:cs="맑은 고딕"/>
@@ -4254,7 +4881,7 @@
           <w:color w:val="3C3C3C"/>
           <w:sz w:val="18"/>
         </w:rPr>
-        <w:t>표 8. 첫 검색어 비교 조건 (재검색 검색어는 Agent만 새로 작성한다)</w:t>
+        <w:t>표 9. 첫 검색어 비교 조건 (재검색 검색어는 Agent만 새로 작성한다)</w:t>
       </w:r>
     </w:p>
     <w:tbl>
@@ -4493,7 +5120,7 @@
           <w:color w:val="3C3C3C"/>
           <w:sz w:val="18"/>
         </w:rPr>
-        <w:t>표 9. 개선 전/후 비교 (OpenAI, 같은 평가셋·같은 모델, 질문당 1회 실행)</w:t>
+        <w:t>표 10. 개선 전/후 비교 (OpenAI, 같은 평가셋·같은 모델, 질문당 1회 실행)</w:t>
       </w:r>
     </w:p>
     <w:tbl>
@@ -5081,7 +5708,87 @@
                 <w:b w:val="0"/>
                 <w:sz w:val="17"/>
               </w:rPr>
-              <w:t>+1 (비슷한 장면이 여럿인 질문)</w:t>
+              <w:t>+1 (정답이 아닌 비슷한 내용의 다른 장면)</w:t>
+            </w:r>
+          </w:p>
+        </w:tc>
+      </w:tr>
+      <w:tr>
+        <w:trPr>
+          <w:cantSplit/>
+        </w:trPr>
+        <w:tc>
+          <w:tcPr>
+            <w:tcW w:type="dxa" w:w="3175"/>
+          </w:tcPr>
+          <w:p>
+            <w:pPr>
+              <w:spacing w:after="0" w:line="264" w:lineRule="auto"/>
+            </w:pPr>
+            <w:r>
+              <w:rPr>
+                <w:rFonts w:ascii="맑은 고딕" w:hAnsi="맑은 고딕" w:eastAsia="맑은 고딕" w:cs="맑은 고딕"/>
+                <w:b w:val="0"/>
+                <w:sz w:val="17"/>
+              </w:rPr>
+              <w:t>"찾음" 응답 정밀도</w:t>
+            </w:r>
+          </w:p>
+        </w:tc>
+        <w:tc>
+          <w:tcPr>
+            <w:tcW w:type="dxa" w:w="2381"/>
+          </w:tcPr>
+          <w:p>
+            <w:pPr>
+              <w:spacing w:after="0" w:line="264" w:lineRule="auto"/>
+              <w:jc w:val="center"/>
+            </w:pPr>
+            <w:r>
+              <w:rPr>
+                <w:rFonts w:ascii="맑은 고딕" w:hAnsi="맑은 고딕" w:eastAsia="맑은 고딕" w:cs="맑은 고딕"/>
+                <w:b w:val="0"/>
+                <w:sz w:val="17"/>
+              </w:rPr>
+              <w:t>16/16 (100%)</w:t>
+            </w:r>
+          </w:p>
+        </w:tc>
+        <w:tc>
+          <w:tcPr>
+            <w:tcW w:type="dxa" w:w="2381"/>
+          </w:tcPr>
+          <w:p>
+            <w:pPr>
+              <w:spacing w:after="0" w:line="264" w:lineRule="auto"/>
+              <w:jc w:val="center"/>
+            </w:pPr>
+            <w:r>
+              <w:rPr>
+                <w:rFonts w:ascii="맑은 고딕" w:hAnsi="맑은 고딕" w:eastAsia="맑은 고딕" w:cs="맑은 고딕"/>
+                <w:b w:val="0"/>
+                <w:sz w:val="17"/>
+              </w:rPr>
+              <w:t>16/17 (94.1%)</w:t>
+            </w:r>
+          </w:p>
+        </w:tc>
+        <w:tc>
+          <w:tcPr>
+            <w:tcW w:type="dxa" w:w="1701"/>
+          </w:tcPr>
+          <w:p>
+            <w:pPr>
+              <w:spacing w:after="0" w:line="264" w:lineRule="auto"/>
+              <w:jc w:val="center"/>
+            </w:pPr>
+            <w:r>
+              <w:rPr>
+                <w:rFonts w:ascii="맑은 고딕" w:hAnsi="맑은 고딕" w:eastAsia="맑은 고딕" w:cs="맑은 고딕"/>
+                <w:b w:val="0"/>
+                <w:sz w:val="17"/>
+              </w:rPr>
+              <w:t>−5.9%p</w:t>
             </w:r>
           </w:p>
         </w:tc>
@@ -5621,7 +6328,7 @@
           <w:b w:val="0"/>
           <w:sz w:val="20"/>
         </w:rPr>
-        <w:t xml:space="preserve"> 한 문항을 얻고(화자 질문) 한 문항을 잃었다(같은 말을 하는 장면이 여럿인 질문에서 다른 비슷한 장면을 정답으로 냄). 확인된 이득은 화자 질문 처리, 재검색 효율, 키워드 검색(A/B)의 검색어 품질이다.</w:t>
+        <w:t xml:space="preserve"> 위 표의 상태·적중 수·오답 수가 모두 맞는 설명은 이렇다. 한 문항을 얻었다: v2에서 "애매함"(1위는 정답이었으나 성공으로 세지 않음)이던 화자 질문이 v3에서 "찾음"이 되어 성공이 됐다. 한 문항을 잃었다: v2에서 "찾음"으로 정답이던 문항이 v3에서는 같은 "찾음"이지만 정답이 아닌 비슷한 내용의 다른 장면(영상 초반 약 3분대)을 반환했다. 그래서 "찾음"이 16건에서 17건으로, 정답 16건은 그대로, 오답 "찾음"이 0건에서 1건이 됐다. 이 오답이 라벨의 한계(실제로도 질문에 부합하는 다른 장면)인지 검색·판정 실패인지는 구분하지 못했다. 확인된 이득은 화자 질문 처리와 재검색 효율이고, 손해는 입력 토큰과 "찾음" 응답 정밀도다.</w:t>
       </w:r>
     </w:p>
     <w:p>
@@ -5635,7 +6342,23 @@
           <w:b w:val="0"/>
           <w:sz w:val="20"/>
         </w:rPr>
-        <w:t>A의 1위 적중이 5에서 13으로 오른 것은 Router가 핵심 명사의 동의어를 함께 넣도록 프롬프트를 바꾼 효과이다(고친 점 ②). Agent의 재검색이나 판정과는 관계가 없다.</w:t>
+        <w:t xml:space="preserve">A·B의 조건 ② 수치(A 5 → 13, B 13 → 15)는 두 실행에서 Router가 만든 검색어를 그대로 재사용한 결과다. 같은 시점에 Router가 핵심 명사의 동의어를 함께 넣도록 프롬프트를 바꿨으므로(고친 점 ②) 이것이 유력한 요인이지만, 네 가지를 한꺼번에 바꿨고 Router 검색어가 같은 설정에서도 실행마다 달라지므로(3.4절) </w:t>
+      </w:r>
+      <w:r>
+        <w:rPr>
+          <w:rFonts w:ascii="맑은 고딕" w:hAnsi="맑은 고딕" w:eastAsia="맑은 고딕" w:cs="맑은 고딕"/>
+          <w:b/>
+          <w:sz w:val="20"/>
+        </w:rPr>
+        <w:t>특정 변경의 단독 효과로 분리하지는 못했다.</w:t>
+      </w:r>
+      <w:r>
+        <w:rPr>
+          <w:rFonts w:ascii="맑은 고딕" w:hAnsi="맑은 고딕" w:eastAsia="맑은 고딕" w:cs="맑은 고딕"/>
+          <w:b w:val="0"/>
+          <w:sz w:val="20"/>
+        </w:rPr>
+        <w:t xml:space="preserve"> A·B에는 판정과 재검색이 없어 Agent의 그 부분과는 관계가 없다.</w:t>
       </w:r>
     </w:p>
     <w:p>
@@ -5662,7 +6385,7 @@
           <w:color w:val="3C3C3C"/>
           <w:sz w:val="18"/>
         </w:rPr>
-        <w:t>표 10. 1위 적중 수 (장면 질문 18개 중, 괄호는 상위 3개 적중 수)</w:t>
+        <w:t>표 11. 1위 적중 수 (장면 질문 18개 중, 괄호는 상위 3개 적중 수)</w:t>
       </w:r>
     </w:p>
     <w:tbl>
@@ -5953,7 +6676,7 @@
           <w:color w:val="3C3C3C"/>
           <w:sz w:val="18"/>
         </w:rPr>
-        <w:t>표 11. 지연과 호출 수 비교 (v3 평가 실행 기준, OpenAI)</w:t>
+        <w:t>표 12. 지연과 호출 수 비교 (v3 평가 실행 기준, OpenAI)</w:t>
       </w:r>
     </w:p>
     <w:tbl>
@@ -5983,7 +6706,7 @@
         </w:trPr>
         <w:tc>
           <w:tcPr>
-            <w:tcW w:type="dxa" w:w="2041"/>
+            <w:tcW w:type="dxa" w:w="1814"/>
             <w:shd w:val="clear" w:color="auto" w:fill="D9E2F3"/>
           </w:tcPr>
           <w:p>
@@ -6004,7 +6727,7 @@
         </w:tc>
         <w:tc>
           <w:tcPr>
-            <w:tcW w:type="dxa" w:w="2041"/>
+            <w:tcW w:type="dxa" w:w="1814"/>
             <w:shd w:val="clear" w:color="auto" w:fill="D9E2F3"/>
           </w:tcPr>
           <w:p>
@@ -6025,7 +6748,7 @@
         </w:tc>
         <w:tc>
           <w:tcPr>
-            <w:tcW w:type="dxa" w:w="2268"/>
+            <w:tcW w:type="dxa" w:w="1928"/>
             <w:shd w:val="clear" w:color="auto" w:fill="D9E2F3"/>
           </w:tcPr>
           <w:p>
@@ -6046,7 +6769,7 @@
         </w:tc>
         <w:tc>
           <w:tcPr>
-            <w:tcW w:type="dxa" w:w="3288"/>
+            <w:tcW w:type="dxa" w:w="4082"/>
             <w:shd w:val="clear" w:color="auto" w:fill="D9E2F3"/>
           </w:tcPr>
           <w:p>
@@ -6072,7 +6795,7 @@
         </w:trPr>
         <w:tc>
           <w:tcPr>
-            <w:tcW w:type="dxa" w:w="2041"/>
+            <w:tcW w:type="dxa" w:w="1814"/>
           </w:tcPr>
           <w:p>
             <w:pPr>
@@ -6090,7 +6813,7 @@
         </w:tc>
         <w:tc>
           <w:tcPr>
-            <w:tcW w:type="dxa" w:w="2041"/>
+            <w:tcW w:type="dxa" w:w="1814"/>
           </w:tcPr>
           <w:p>
             <w:pPr>
@@ -6108,7 +6831,7 @@
         </w:tc>
         <w:tc>
           <w:tcPr>
-            <w:tcW w:type="dxa" w:w="2268"/>
+            <w:tcW w:type="dxa" w:w="1928"/>
           </w:tcPr>
           <w:p>
             <w:pPr>
@@ -6126,7 +6849,7 @@
         </w:tc>
         <w:tc>
           <w:tcPr>
-            <w:tcW w:type="dxa" w:w="3288"/>
+            <w:tcW w:type="dxa" w:w="4082"/>
           </w:tcPr>
           <w:p>
             <w:pPr>
@@ -6138,7 +6861,7 @@
                 <w:b w:val="0"/>
                 <w:sz w:val="17"/>
               </w:rPr>
-              <w:t>LLM 없음. 조건 ①은 Tool 1.0회, 조건 ②는 3.7회</w:t>
+              <w:t>검색·원문 검증 단계만 측정. 이 단계는 LLM을 쓰지 않는다. 조건 ②의 검색어는 C의 Router(LLM)가 만든 것이며 그 생성 시간·비용은 포함하지 않는다</w:t>
             </w:r>
           </w:p>
         </w:tc>
@@ -6149,7 +6872,7 @@
         </w:trPr>
         <w:tc>
           <w:tcPr>
-            <w:tcW w:type="dxa" w:w="2041"/>
+            <w:tcW w:type="dxa" w:w="1814"/>
           </w:tcPr>
           <w:p>
             <w:pPr>
@@ -6167,7 +6890,7 @@
         </w:tc>
         <w:tc>
           <w:tcPr>
-            <w:tcW w:type="dxa" w:w="2041"/>
+            <w:tcW w:type="dxa" w:w="1814"/>
           </w:tcPr>
           <w:p>
             <w:pPr>
@@ -6185,7 +6908,7 @@
         </w:tc>
         <w:tc>
           <w:tcPr>
-            <w:tcW w:type="dxa" w:w="2268"/>
+            <w:tcW w:type="dxa" w:w="1928"/>
           </w:tcPr>
           <w:p>
             <w:pPr>
@@ -6203,7 +6926,7 @@
         </w:tc>
         <w:tc>
           <w:tcPr>
-            <w:tcW w:type="dxa" w:w="3288"/>
+            <w:tcW w:type="dxa" w:w="4082"/>
           </w:tcPr>
           <w:p>
             <w:pPr>
@@ -6215,7 +6938,7 @@
                 <w:b w:val="0"/>
                 <w:sz w:val="17"/>
               </w:rPr>
-              <w:t>LLM 없음. 조건 ① 0.17초, 조건 ② 0.05초(캐시 영향 가능)</w:t>
+              <w:t>위와 같음. 조건 ① 0.17초, 조건 ② 0.05초(실행 순서에 따른 캐시 영향 가능)</w:t>
             </w:r>
           </w:p>
         </w:tc>
@@ -6226,7 +6949,7 @@
         </w:trPr>
         <w:tc>
           <w:tcPr>
-            <w:tcW w:type="dxa" w:w="2041"/>
+            <w:tcW w:type="dxa" w:w="1814"/>
           </w:tcPr>
           <w:p>
             <w:pPr>
@@ -6244,7 +6967,7 @@
         </w:tc>
         <w:tc>
           <w:tcPr>
-            <w:tcW w:type="dxa" w:w="2041"/>
+            <w:tcW w:type="dxa" w:w="1814"/>
           </w:tcPr>
           <w:p>
             <w:pPr>
@@ -6270,7 +6993,7 @@
         </w:tc>
         <w:tc>
           <w:tcPr>
-            <w:tcW w:type="dxa" w:w="2268"/>
+            <w:tcW w:type="dxa" w:w="1928"/>
           </w:tcPr>
           <w:p>
             <w:pPr>
@@ -6288,7 +7011,7 @@
         </w:tc>
         <w:tc>
           <w:tcPr>
-            <w:tcW w:type="dxa" w:w="3288"/>
+            <w:tcW w:type="dxa" w:w="4082"/>
           </w:tcPr>
           <w:p>
             <w:pPr>
@@ -6300,7 +7023,7 @@
                 <w:b w:val="0"/>
                 <w:sz w:val="17"/>
               </w:rPr>
-              <w:t>LLM 호출 42회, 입력 33,753·출력 1,717 토큰</w:t>
+              <w:t>요청 전체(분류·검색·원문 대조·판정 LLM 호출 포함). LLM 호출 42회, 입력 33,753·출력 1,717 토큰</w:t>
             </w:r>
           </w:p>
         </w:tc>
@@ -6315,18 +7038,10 @@
       <w:r>
         <w:rPr>
           <w:rFonts w:ascii="맑은 고딕" w:hAnsi="맑은 고딕" w:eastAsia="맑은 고딕" w:cs="맑은 고딕"/>
-          <w:b w:val="0"/>
-          <w:sz w:val="19"/>
-        </w:rPr>
-        <w:t xml:space="preserve">Agent(C)는 조건에 따라 B보다 1~5문항을 더 맞혔다. 정확도보다 확실한 차이는 </w:t>
-      </w:r>
-      <w:r>
-        <w:rPr>
-          <w:rFonts w:ascii="맑은 고딕" w:hAnsi="맑은 고딕" w:eastAsia="맑은 고딕" w:cs="맑은 고딕"/>
           <w:b/>
           <w:sz w:val="19"/>
         </w:rPr>
-        <w:t>안전성</w:t>
+        <w:t>비교의 한계.</w:t>
       </w:r>
       <w:r>
         <w:rPr>
@@ -6334,7 +7049,17 @@
           <w:b w:val="0"/>
           <w:sz w:val="19"/>
         </w:rPr>
-        <w:t>이다. 자막으로 알 수 없는 요청 2개를 모두 거부했고, 화자 질문에는 "확인 불가"를 안내했으며, 검증을 통과한 근거만 보여 주고, 근거 없이 화자를 단정한 경우는 0건이었다. 대신 지연과 LLM·Tool 호출이 늘어난다(4.2절).</w:t>
+        <w:t xml:space="preserve"> A·B의 지연은 검색·원문 검증 단계만 잰 값이라, C의 요청 전체 지연(분류·판정 LLM 호출 포함)과 직접 비교할 수 없다. 조건 ②에서는 A·B도 LLM이 만든 검색어를 쓰므로 "LLM 없이 동작한다"는 말은 검색 단계에만 해당한다. LLM의 도움 없는 A·B의 성능은 조건 ①(질문 원문)이다.</w:t>
+      </w:r>
+    </w:p>
+    <w:p>
+      <w:r>
+        <w:rPr>
+          <w:rFonts w:ascii="맑은 고딕" w:hAnsi="맑은 고딕" w:eastAsia="맑은 고딕" w:cs="맑은 고딕"/>
+          <w:b w:val="0"/>
+          <w:sz w:val="19"/>
+        </w:rPr>
+        <w:t>Agent(C)는 조건에 따라 B보다 1~5문항을 더 맞혔다. 이 평가셋에서 확인한 안전성은 다음 범위로 한정한다. 자막으로 알 수 없는 요청 2개를 모두 거부했고, 화자 질문 4개 중 3개에서 "확인 불가"를 안내하며 장면을 맞혔고, 근거 없이 화자를 단정한 경우는 0건이었다. 반면 "찾음" 응답 17건 중 1건은 틀린 장면이었다(정밀도 94.1%). 검증을 통과한 근거만 보여 주지만 그것이 장면이 맞다는 보장은 아니다(4.2절). 대신 지연과 LLM·Tool 호출이 늘어난다.</w:t>
       </w:r>
     </w:p>
     <w:p>
@@ -6413,7 +7138,7 @@
           <w:color w:val="3C3C3C"/>
           <w:sz w:val="18"/>
         </w:rPr>
-        <w:t>표 12. 이중 첫 검색 동작 확인 (평가셋이 아닌 직접 실행, 질문당 1회)</w:t>
+        <w:t>표 13. 이중 첫 검색 동작 확인 (평가셋이 아닌 직접 실행, 질문당 1회)</w:t>
       </w:r>
     </w:p>
     <w:tbl>
@@ -6729,7 +7454,7 @@
           <w:b w:val="0"/>
           <w:sz w:val="20"/>
         </w:rPr>
-        <w:t>: 검색이 두 번이라 질문당 약 1~2초 느려진다. 질문 원문 검색에서도 약한 질문에는 도움이 없고, 원문 검색 결과가 후보 자리를 일부 차지하므로 Router 결과의 3위 이하는 후보에서 빠진다. 판정 후보를 늘리면 해결되지만 토큰과 외부 전송량이 늘어서 택하지 않았다.</w:t>
+        <w:t>: 검색이 두 번이라 지연이 늘 것으로 예상했고, 위 직접 실행에서는 질문당 약 1~2초 느린 것으로 관찰했다(질문당 1회). 그러나 아래 평가셋 재측정의 평균 지연은 켠 쪽이 오히려 짧아서 지연 영향은 일관되게 확인하지 못했다. 질문 원문 검색에서도 약한 질문에는 도움이 없고, 원문 검색 결과가 후보 자리를 일부 차지하므로 Router 결과의 3위 이하는 후보에서 빠진다. 판정 후보를 늘리면 해결되지만 토큰과 외부 전송량이 늘어서 택하지 않았다.</w:t>
       </w:r>
     </w:p>
     <w:p>
@@ -6804,7 +7529,7 @@
           <w:color w:val="3C3C3C"/>
           <w:sz w:val="18"/>
         </w:rPr>
-        <w:t>표 13. 이중 첫 검색 끔 대 켬 (OpenAI, 같은 평가셋, 질문당 1회 실행)</w:t>
+        <w:t>표 14. 이중 첫 검색 끔 대 켬 (OpenAI, 같은 평가셋, 질문당 1회 실행)</w:t>
       </w:r>
     </w:p>
     <w:tbl>
@@ -7858,7 +8583,7 @@
           <w:b/>
           <w:sz w:val="20"/>
         </w:rPr>
-        <w:t>실행마다 달라지는 부분이 있다.</w:t>
+        <w:t>실행마다 달라지는 부분이 있고, 이 비교는 기능 하나만 통제한 것이 아니다.</w:t>
       </w:r>
       <w:r>
         <w:rPr>
@@ -7866,7 +8591,23 @@
           <w:b w:val="0"/>
           <w:sz w:val="20"/>
         </w:rPr>
-        <w:t xml:space="preserve"> temperature 0, seed 42로 같은 설정인데도 Router가 만든 영어 검색어가 5문항에서 두 실행 사이에 달랐다. 그래서 같은 검색어를 재사용하는 A·B의 조건 ② 수치가 A는 12 → 11, B는 상위 3개 16 → 15로 움직였다. 이중 첫 검색은 A·B에 적용되지 않으므로 이 차이는 기능의 효과가 아니라 Router 출력의 흔들림이다. Agent 결과가 바뀐 것은 반환 시점이 몇 초 달라진 2문항뿐이고 둘 다 정답 구간 안이었다.</w:t>
+        <w:t xml:space="preserve"> temperature 0, seed 42로 같은 설정인데도 Router가 만든 영어 검색어가 5문항에서 두 실행 사이에 달랐다. 두 실행이 Router를 각각 새로 호출했으므로 C의 첫 검색 입력이 켬/끔 사이에서 같지 않았다. 따라서 이 결과는 "이중 첫 검색을 켠 실행과 끈 실행의 비교"이며 기능 효과만 분리한 것은 아니다. 같은 검색어를 재사용하는 A·B의 조건 ② 수치도 A 12 → 11, B 상위 3개 16 → 15로 움직였는데, 이중 첫 검색은 A·B에 적용되지 않으므로 이 차이는 Router 출력의 흔들림이다. Agent 결과가 바뀐 것은 반환 시점이 몇 초 달라진 2문항뿐이고 둘 다 정답 구간 안이었다. </w:t>
+      </w:r>
+      <w:r>
+        <w:rPr>
+          <w:rFonts w:ascii="맑은 고딕" w:hAnsi="맑은 고딕" w:eastAsia="맑은 고딕" w:cs="맑은 고딕"/>
+          <w:b/>
+          <w:sz w:val="20"/>
+        </w:rPr>
+        <w:t>향후에는</w:t>
+      </w:r>
+      <w:r>
+        <w:rPr>
+          <w:rFonts w:ascii="맑은 고딕" w:hAnsi="맑은 고딕" w:eastAsia="맑은 고딕" w:cs="맑은 고딕"/>
+          <w:b w:val="0"/>
+          <w:sz w:val="20"/>
+        </w:rPr>
+        <w:t xml:space="preserve"> Router 검색어를 한 번 만들어 저장하고 두 실행이 그 검색어를 재사용하는 비교를 제안한다(이번에는 수행하지 않았다).</w:t>
       </w:r>
     </w:p>
     <w:p>
@@ -7928,7 +8669,7 @@
           <w:rFonts w:ascii="맑은 고딕" w:hAnsi="맑은 고딕" w:eastAsia="맑은 고딕" w:cs="맑은 고딕"/>
           <w:b/>
         </w:rPr>
-        <w:t>4.1 Multi-Agent(Supervisor)로 나누지 않은 이유와 설계안</w:t>
+        <w:t>4.1 Multi-Agent(Supervisor)로 나누지 않은 이유</w:t>
       </w:r>
     </w:p>
     <w:p>
@@ -7942,7 +8683,7 @@
           <w:b/>
           <w:sz w:val="20"/>
         </w:rPr>
-        <w:t>이유</w:t>
+        <w:t>설계 판단</w:t>
       </w:r>
       <w:r>
         <w:rPr>
@@ -7950,23 +8691,7 @@
           <w:b w:val="0"/>
           <w:sz w:val="20"/>
         </w:rPr>
-        <w:t xml:space="preserve">: 일이 순서대로 짧고(LLM 호출 2~6회) 병렬로 할 일이 없다. 도구가 3~4개뿐이고 호출 순서가 정해져 있어 LLM이 도구를 고를 필요도 없다. Supervisor를 두면 "누구에게 맡길지"를 정하는 LLM 호출이 추가되어 지연, 토큰, 실패 지점이 늘어난다. 또 실제 실패 원인을 열어 보니 구조가 아니라 </w:t>
-      </w:r>
-      <w:r>
-        <w:rPr>
-          <w:rFonts w:ascii="맑은 고딕" w:hAnsi="맑은 고딕" w:eastAsia="맑은 고딕" w:cs="맑은 고딕"/>
-          <w:b/>
-          <w:sz w:val="20"/>
-        </w:rPr>
-        <w:t>검색어의 단어 차이와 판정 기준</w:t>
-      </w:r>
-      <w:r>
-        <w:rPr>
-          <w:rFonts w:ascii="맑은 고딕" w:hAnsi="맑은 고딕" w:eastAsia="맑은 고딕" w:cs="맑은 고딕"/>
-          <w:b w:val="0"/>
-          <w:sz w:val="20"/>
-        </w:rPr>
-        <w:t>이었다.</w:t>
+        <w:t>: 이 과제의 흐름(분류 → 검색 → 원본 대조 → 판정 → 재검색)은 단계 순서와 종료 조건을 코드가 정하고, LLM의 판단이 필요한 곳은 분류·판정·검색어 재작성 세 군데뿐이다. 각 단계가 독립된 목표를 가지고 스스로 다음 행동을 고르는 역할이 아니어서, 역할을 Agent로 나누고 Supervisor가 조율하게 할 실익이 제한적이라고 보았다. 나누면 "누구에게 맡길지"를 정하는 LLM 호출이 늘어 지연, 토큰, 실패 지점이 늘어날 것으로 예상했다. 도구도 3~4개뿐이고 호출 순서가 정해져 있어 지금은 코드가 MCP 도구를 정해진 순서로 호출한다(LLM이 도구를 고르는 function calling이 아니다).</w:t>
       </w:r>
     </w:p>
     <w:p>
@@ -7980,7 +8705,7 @@
           <w:b/>
           <w:sz w:val="20"/>
         </w:rPr>
-        <w:t>나눴을 때의 설계안</w:t>
+        <w:t>비교는 하지 않았다</w:t>
       </w:r>
       <w:r>
         <w:rPr>
@@ -7988,7 +8713,7 @@
           <w:b w:val="0"/>
           <w:sz w:val="20"/>
         </w:rPr>
-        <w:t>: Supervisor가 다음에 부를 Agent를 고르고, Search Agent는 MCP 도구를 스스로 골라 호출하며, Verifier Agent는 판정만 한다. 단계 수 상한, 시간 제한, 재검색 상한, 잘못된 선택 시 종료 규칙을 두고, 인용과 시각 검증은 코드로 유지한다. 환경변수로 켜서 기존 경로를 보존하고 같은 평가셋으로 비교한다.</w:t>
+        <w:t>: 단일 워크플로와 Multi-Agent를 같은 평가셋으로 비교하지 않았다. 위 판단은 구조에 대한 설계상의 이유이며 측정으로 확인한 결과가 아니다. 실제 실패 원인을 열어 본 것은 일부 문항에서 검색어의 단어 차이와 판정 기준이었다(4.2절).</w:t>
       </w:r>
     </w:p>
     <w:p>
@@ -8002,7 +8727,7 @@
           <w:b/>
           <w:sz w:val="20"/>
         </w:rPr>
-        <w:t>도구 선택은 코드가 정한다</w:t>
+        <w:t>서비스가 더 복잡해지면 전환한다</w:t>
       </w:r>
       <w:r>
         <w:rPr>
@@ -8010,59 +8735,7 @@
           <w:b w:val="0"/>
           <w:sz w:val="20"/>
         </w:rPr>
-        <w:t>: 지금은 그래프 코드가 MCP 도구를 정해진 순서로 호출하고, LLM이 도구를 고르는 방식(function calling)이 아니다. MCP를 "자료에 안전하게 접근하는 표준 통로"로 쓰는 것이며, Search Agent가 도구를 스스로 고르게 하는 것은 위 설계안의 한 부분이다.</w:t>
-      </w:r>
-    </w:p>
-    <w:p>
-      <w:pPr>
-        <w:pStyle w:val="ListBullet"/>
-        <w:spacing w:after="40"/>
-      </w:pPr>
-      <w:r>
-        <w:rPr>
-          <w:rFonts w:ascii="맑은 고딕" w:hAnsi="맑은 고딕" w:eastAsia="맑은 고딕" w:cs="맑은 고딕"/>
-          <w:b/>
-          <w:sz w:val="20"/>
-        </w:rPr>
-        <w:t>서비스가 더 복잡해지면 전환한다.</w:t>
-      </w:r>
-      <w:r>
-        <w:rPr>
-          <w:rFonts w:ascii="맑은 고딕" w:hAnsi="맑은 고딕" w:eastAsia="맑은 고딕" w:cs="맑은 고딕"/>
-          <w:b w:val="0"/>
-          <w:sz w:val="20"/>
-        </w:rPr>
-        <w:t xml:space="preserve"> 지금은 "공식 영상 자막에서 장면 하나를 찾는" 단순한 흐름이라 나누지 않았다. 다음처럼 일이 늘어나면 역할을 나눌 이유가 생긴다. ① 여러 콘텐츠 유형을 함께 탐색: 공식 영상과 라이브 아카이브처럼 데이터와 검색 방식이 다르면 콘텐츠별 Agent가 각각 검색하고 Supervisor가 결과를 합치고 중복을 없앤다(라이브 자막 데이터를 확보해야 가능한 확장). ② 여러 장면을 연결해 조사: "마니또로 자기 자신을 뽑은 뒤 결국 누구 선물을 준비했어? 장면 순서대로 정리해 줘"처럼 한 구간으로 답할 수 없으면 Search Agent가 장면을 찾고, Timeline Agent가 시간 순서와 사건 관계를 정리하고, Verification Agent가 장면 간 연결이 실제 자막으로 뒷받침되는지 검증하며, Supervisor가 부족한 정보를 추가 조사하게 한다. 이때는 하나의 장면을 찾는 서비스에서 여러 장면을 조사하고 연결하는 서비스로 바뀐다. 두 시나리오는 이번 제출에서 구현하거나 측정하지 않았다.</w:t>
-      </w:r>
-    </w:p>
-    <w:p>
-      <w:pPr>
-        <w:pStyle w:val="ListBullet"/>
-        <w:spacing w:after="40"/>
-      </w:pPr>
-      <w:r>
-        <w:rPr>
-          <w:rFonts w:ascii="맑은 고딕" w:hAnsi="맑은 고딕" w:eastAsia="맑은 고딕" w:cs="맑은 고딕"/>
-          <w:b/>
-          <w:sz w:val="20"/>
-        </w:rPr>
-        <w:t>예상되는 단점(실험으로 확인하지 못한 가설)</w:t>
-      </w:r>
-      <w:r>
-        <w:rPr>
-          <w:rFonts w:ascii="맑은 고딕" w:hAnsi="맑은 고딕" w:eastAsia="맑은 고딕" w:cs="맑은 고딕"/>
-          <w:b w:val="0"/>
-          <w:sz w:val="20"/>
-        </w:rPr>
-        <w:t xml:space="preserve">: LLM 호출과 지연 증가, Supervisor가 잘못 판단하는 새로운 실패, 순환 구조에서의 무한 반복 가능성. 자율 검색이 더 많이 찾을 수 있다는 것도 가설이다. </w:t>
-      </w:r>
-      <w:r>
-        <w:rPr>
-          <w:rFonts w:ascii="맑은 고딕" w:hAnsi="맑은 고딕" w:eastAsia="맑은 고딕" w:cs="맑은 고딕"/>
-          <w:b/>
-          <w:sz w:val="20"/>
-        </w:rPr>
-        <w:t>이번 제출에서는 구현하지도 측정하지도 않았다.</w:t>
+        <w:t>: 공식 영상과 라이브 아카이브처럼 데이터와 검색 방식이 다른 콘텐츠를 함께 탐색하거나(라이브 자막을 확보해야 가능), "마니또로 자기 자신을 뽑은 뒤 누구 선물을 준비했는지 장면 순서대로 정리해 줘"처럼 여러 장면을 연결해 조사하는 서비스에서는 Search, Timeline, Verification Agent와 Supervisor로 역할을 나눌 이유가 생긴다. 구현하거나 측정하지 않았고, 도입한다면 같은 평가셋으로 정확도·지연·호출 수를 비교한다.</w:t>
       </w:r>
     </w:p>
     <w:p>
@@ -8162,7 +8835,23 @@
           <w:b w:val="0"/>
           <w:sz w:val="20"/>
         </w:rPr>
-        <w:t>: 의미 검증은 근거를 꾸며내는 것은 막지만 장면이 맞는지까지는 보장하지 못한다. 같은 말을 하는 장면이 여럿인 질문에서 비슷한 다른 장면을 정답으로 낸 사례가 있다. 평가셋이 장면마다 정답을 하나만 두어서 이런 경우는 오답으로 집계된다.</w:t>
+        <w:t xml:space="preserve">: 코드의 원본 대조는 cue가 실제로 있고 영상·시각·인용이 서로 맞는지만 확인한다. 그 장면이 사용자가 말한 장면인지는 확인하지 않는다. 그 판단은 LLM 의미 판정이 맡는데, 이 판정은 후보와 질문의 관련성을 보고 원본에 실제로 있는 </w:t>
+      </w:r>
+      <w:r>
+        <w:rPr>
+          <w:rFonts w:ascii="맑은 고딕" w:hAnsi="맑은 고딕" w:eastAsia="맑은 고딕" w:cs="맑은 고딕"/>
+          <w:b/>
+          <w:sz w:val="20"/>
+        </w:rPr>
+        <w:t>다른 비슷한 장면도 정답으로 확정할 수 있다.</w:t>
+      </w:r>
+      <w:r>
+        <w:rPr>
+          <w:rFonts w:ascii="맑은 고딕" w:hAnsi="맑은 고딕" w:eastAsia="맑은 고딕" w:cs="맑은 고딕"/>
+          <w:b w:val="0"/>
+          <w:sz w:val="20"/>
+        </w:rPr>
+        <w:t xml:space="preserve"> v3에서 이런 사례가 1건 있었다("찾음" 17건 중 1건, 아래 실패 유형 점검 참고). 정답 구간 밖이면 오답으로 집계하며, 반환된 장면이 실제로 질문에 부합하는 라벨 한계 가능성은 확인하지 못했다.</w:t>
       </w:r>
     </w:p>
     <w:p>
@@ -8333,14 +9022,441 @@
     </w:p>
     <w:p>
       <w:pPr>
-        <w:pStyle w:val="Heading2"/>
+        <w:pStyle w:val="Heading3"/>
       </w:pPr>
       <w:r>
         <w:rPr>
           <w:rFonts w:ascii="맑은 고딕" w:hAnsi="맑은 고딕" w:eastAsia="맑은 고딕" w:cs="맑은 고딕"/>
           <w:b/>
         </w:rPr>
-        <w:t>4.3 데이터·환경·운영 한계</w:t>
+        <w:t>실패 유형 점검 (2026-10-22)</w:t>
+      </w:r>
+    </w:p>
+    <w:p>
+      <w:r>
+        <w:rPr>
+          <w:rFonts w:ascii="맑은 고딕" w:hAnsi="맑은 고딕" w:eastAsia="맑은 고딕" w:cs="맑은 고딕"/>
+          <w:b w:val="0"/>
+          <w:sz w:val="19"/>
+        </w:rPr>
+        <w:t>못 찾거나 틀린 원인을 "후보 검색 실패", "대표 시점 선택 실패", "의미 판정 실패"로 나누어 보기 위해, 평가셋 장면 질문 18개를 LLM 없이 로컬 검색으로 다시 실행했다(첫 라운드 단일 검색, 후보 3개). 정답 구간 ±10초와 겹치는 청크의 순위와, 그 청크가 상위 3개일 때 고른 대표 cue가 정답 ±10초 안인지를 확인했다. 질문당 1회 실행했다.</w:t>
+      </w:r>
+    </w:p>
+    <w:p>
+      <w:pPr>
+        <w:keepNext/>
+        <w:spacing w:after="40"/>
+      </w:pPr>
+      <w:r>
+        <w:rPr>
+          <w:rFonts w:ascii="맑은 고딕" w:hAnsi="맑은 고딕" w:eastAsia="맑은 고딕" w:cs="맑은 고딕"/>
+          <w:b/>
+          <w:color w:val="3C3C3C"/>
+          <w:sz w:val="18"/>
+        </w:rPr>
+        <w:t>표 15. 첫 검색 기준 실패 유형 (장면 질문 18개, 문항 수)</w:t>
+      </w:r>
+    </w:p>
+    <w:tbl>
+      <w:tblPr>
+        <w:tblStyle w:val="TableGrid"/>
+        <w:tblW w:type="auto" w:w="0"/>
+        <w:jc w:val="center"/>
+        <w:tblLayout w:type="fixed"/>
+        <w:tblLook w:firstColumn="1" w:firstRow="1" w:lastColumn="0" w:lastRow="0" w:noHBand="0" w:noVBand="1" w:val="04A0"/>
+        <w:tblCellMar>
+          <w:top w:w="50" w:type="dxa"/>
+          <w:left w:w="90" w:type="dxa"/>
+          <w:bottom w:w="50" w:type="dxa"/>
+          <w:right w:w="90" w:type="dxa"/>
+        </w:tblCellMar>
+      </w:tblPr>
+      <w:tblGrid>
+        <w:gridCol w:w="1928"/>
+        <w:gridCol w:w="1928"/>
+        <w:gridCol w:w="1928"/>
+        <w:gridCol w:w="1928"/>
+        <w:gridCol w:w="1928"/>
+      </w:tblGrid>
+      <w:tr>
+        <w:trPr>
+          <w:cantSplit/>
+          <w:tblHeader/>
+        </w:trPr>
+        <w:tc>
+          <w:tcPr>
+            <w:tcW w:type="dxa" w:w="3402"/>
+            <w:shd w:val="clear" w:color="auto" w:fill="D9E2F3"/>
+          </w:tcPr>
+          <w:p>
+            <w:pPr>
+              <w:keepNext/>
+              <w:spacing w:after="0" w:line="264" w:lineRule="auto"/>
+              <w:jc w:val="center"/>
+            </w:pPr>
+            <w:r>
+              <w:rPr>
+                <w:rFonts w:ascii="맑은 고딕" w:hAnsi="맑은 고딕" w:eastAsia="맑은 고딕" w:cs="맑은 고딕"/>
+                <w:b/>
+                <w:sz w:val="17"/>
+              </w:rPr>
+              <w:t>첫 검색어</w:t>
+            </w:r>
+          </w:p>
+        </w:tc>
+        <w:tc>
+          <w:tcPr>
+            <w:tcW w:type="dxa" w:w="1701"/>
+            <w:shd w:val="clear" w:color="auto" w:fill="D9E2F3"/>
+          </w:tcPr>
+          <w:p>
+            <w:pPr>
+              <w:keepNext/>
+              <w:spacing w:after="0" w:line="264" w:lineRule="auto"/>
+              <w:jc w:val="center"/>
+            </w:pPr>
+            <w:r>
+              <w:rPr>
+                <w:rFonts w:ascii="맑은 고딕" w:hAnsi="맑은 고딕" w:eastAsia="맑은 고딕" w:cs="맑은 고딕"/>
+                <w:b/>
+                <w:sz w:val="17"/>
+              </w:rPr>
+              <w:t>정답 청크가 상위 3개 안</w:t>
+            </w:r>
+          </w:p>
+        </w:tc>
+        <w:tc>
+          <w:tcPr>
+            <w:tcW w:type="dxa" w:w="1134"/>
+            <w:shd w:val="clear" w:color="auto" w:fill="D9E2F3"/>
+          </w:tcPr>
+          <w:p>
+            <w:pPr>
+              <w:keepNext/>
+              <w:spacing w:after="0" w:line="264" w:lineRule="auto"/>
+              <w:jc w:val="center"/>
+            </w:pPr>
+            <w:r>
+              <w:rPr>
+                <w:rFonts w:ascii="맑은 고딕" w:hAnsi="맑은 고딕" w:eastAsia="맑은 고딕" w:cs="맑은 고딕"/>
+                <w:b/>
+                <w:sz w:val="17"/>
+              </w:rPr>
+              <w:t>4~20위</w:t>
+            </w:r>
+          </w:p>
+        </w:tc>
+        <w:tc>
+          <w:tcPr>
+            <w:tcW w:type="dxa" w:w="1361"/>
+            <w:shd w:val="clear" w:color="auto" w:fill="D9E2F3"/>
+          </w:tcPr>
+          <w:p>
+            <w:pPr>
+              <w:keepNext/>
+              <w:spacing w:after="0" w:line="264" w:lineRule="auto"/>
+              <w:jc w:val="center"/>
+            </w:pPr>
+            <w:r>
+              <w:rPr>
+                <w:rFonts w:ascii="맑은 고딕" w:hAnsi="맑은 고딕" w:eastAsia="맑은 고딕" w:cs="맑은 고딕"/>
+                <w:b/>
+                <w:sz w:val="17"/>
+              </w:rPr>
+              <w:t>상위 20개 밖</w:t>
+            </w:r>
+          </w:p>
+        </w:tc>
+        <w:tc>
+          <w:tcPr>
+            <w:tcW w:type="dxa" w:w="2041"/>
+            <w:shd w:val="clear" w:color="auto" w:fill="D9E2F3"/>
+          </w:tcPr>
+          <w:p>
+            <w:pPr>
+              <w:keepNext/>
+              <w:spacing w:after="0" w:line="264" w:lineRule="auto"/>
+              <w:jc w:val="center"/>
+            </w:pPr>
+            <w:r>
+              <w:rPr>
+                <w:rFonts w:ascii="맑은 고딕" w:hAnsi="맑은 고딕" w:eastAsia="맑은 고딕" w:cs="맑은 고딕"/>
+                <w:b/>
+                <w:sz w:val="17"/>
+              </w:rPr>
+              <w:t>상위 3개 안인데 대표 cue가 정답 밖</w:t>
+            </w:r>
+          </w:p>
+        </w:tc>
+      </w:tr>
+      <w:tr>
+        <w:trPr>
+          <w:cantSplit/>
+        </w:trPr>
+        <w:tc>
+          <w:tcPr>
+            <w:tcW w:type="dxa" w:w="3402"/>
+          </w:tcPr>
+          <w:p>
+            <w:pPr>
+              <w:spacing w:after="0" w:line="264" w:lineRule="auto"/>
+            </w:pPr>
+            <w:r>
+              <w:rPr>
+                <w:rFonts w:ascii="맑은 고딕" w:hAnsi="맑은 고딕" w:eastAsia="맑은 고딕" w:cs="맑은 고딕"/>
+                <w:b w:val="0"/>
+                <w:sz w:val="17"/>
+              </w:rPr>
+              <w:t>질문 원문(B, 조건 ①)</w:t>
+            </w:r>
+          </w:p>
+        </w:tc>
+        <w:tc>
+          <w:tcPr>
+            <w:tcW w:type="dxa" w:w="1701"/>
+          </w:tcPr>
+          <w:p>
+            <w:pPr>
+              <w:spacing w:after="0" w:line="264" w:lineRule="auto"/>
+              <w:jc w:val="center"/>
+            </w:pPr>
+            <w:r>
+              <w:rPr>
+                <w:rFonts w:ascii="맑은 고딕" w:hAnsi="맑은 고딕" w:eastAsia="맑은 고딕" w:cs="맑은 고딕"/>
+                <w:b w:val="0"/>
+                <w:sz w:val="17"/>
+              </w:rPr>
+              <w:t>13</w:t>
+            </w:r>
+          </w:p>
+        </w:tc>
+        <w:tc>
+          <w:tcPr>
+            <w:tcW w:type="dxa" w:w="1134"/>
+          </w:tcPr>
+          <w:p>
+            <w:pPr>
+              <w:spacing w:after="0" w:line="264" w:lineRule="auto"/>
+              <w:jc w:val="center"/>
+            </w:pPr>
+            <w:r>
+              <w:rPr>
+                <w:rFonts w:ascii="맑은 고딕" w:hAnsi="맑은 고딕" w:eastAsia="맑은 고딕" w:cs="맑은 고딕"/>
+                <w:b w:val="0"/>
+                <w:sz w:val="17"/>
+              </w:rPr>
+              <w:t>4</w:t>
+            </w:r>
+          </w:p>
+        </w:tc>
+        <w:tc>
+          <w:tcPr>
+            <w:tcW w:type="dxa" w:w="1361"/>
+          </w:tcPr>
+          <w:p>
+            <w:pPr>
+              <w:spacing w:after="0" w:line="264" w:lineRule="auto"/>
+              <w:jc w:val="center"/>
+            </w:pPr>
+            <w:r>
+              <w:rPr>
+                <w:rFonts w:ascii="맑은 고딕" w:hAnsi="맑은 고딕" w:eastAsia="맑은 고딕" w:cs="맑은 고딕"/>
+                <w:b w:val="0"/>
+                <w:sz w:val="17"/>
+              </w:rPr>
+              <w:t>1</w:t>
+            </w:r>
+          </w:p>
+        </w:tc>
+        <w:tc>
+          <w:tcPr>
+            <w:tcW w:type="dxa" w:w="2041"/>
+          </w:tcPr>
+          <w:p>
+            <w:pPr>
+              <w:spacing w:after="0" w:line="264" w:lineRule="auto"/>
+              <w:jc w:val="center"/>
+            </w:pPr>
+            <w:r>
+              <w:rPr>
+                <w:rFonts w:ascii="맑은 고딕" w:hAnsi="맑은 고딕" w:eastAsia="맑은 고딕" w:cs="맑은 고딕"/>
+                <w:b w:val="0"/>
+                <w:sz w:val="17"/>
+              </w:rPr>
+              <w:t>0</w:t>
+            </w:r>
+          </w:p>
+        </w:tc>
+      </w:tr>
+      <w:tr>
+        <w:trPr>
+          <w:cantSplit/>
+        </w:trPr>
+        <w:tc>
+          <w:tcPr>
+            <w:tcW w:type="dxa" w:w="3402"/>
+          </w:tcPr>
+          <w:p>
+            <w:pPr>
+              <w:spacing w:after="0" w:line="264" w:lineRule="auto"/>
+            </w:pPr>
+            <w:r>
+              <w:rPr>
+                <w:rFonts w:ascii="맑은 고딕" w:hAnsi="맑은 고딕" w:eastAsia="맑은 고딕" w:cs="맑은 고딕"/>
+                <w:b w:val="0"/>
+                <w:sz w:val="17"/>
+              </w:rPr>
+              <w:t>Router 영어 검색어(조건 ②, 끔 실행의 첫 검색어)</w:t>
+            </w:r>
+          </w:p>
+        </w:tc>
+        <w:tc>
+          <w:tcPr>
+            <w:tcW w:type="dxa" w:w="1701"/>
+          </w:tcPr>
+          <w:p>
+            <w:pPr>
+              <w:spacing w:after="0" w:line="264" w:lineRule="auto"/>
+              <w:jc w:val="center"/>
+            </w:pPr>
+            <w:r>
+              <w:rPr>
+                <w:rFonts w:ascii="맑은 고딕" w:hAnsi="맑은 고딕" w:eastAsia="맑은 고딕" w:cs="맑은 고딕"/>
+                <w:b w:val="0"/>
+                <w:sz w:val="17"/>
+              </w:rPr>
+              <w:t>16</w:t>
+            </w:r>
+          </w:p>
+        </w:tc>
+        <w:tc>
+          <w:tcPr>
+            <w:tcW w:type="dxa" w:w="1134"/>
+          </w:tcPr>
+          <w:p>
+            <w:pPr>
+              <w:spacing w:after="0" w:line="264" w:lineRule="auto"/>
+              <w:jc w:val="center"/>
+            </w:pPr>
+            <w:r>
+              <w:rPr>
+                <w:rFonts w:ascii="맑은 고딕" w:hAnsi="맑은 고딕" w:eastAsia="맑은 고딕" w:cs="맑은 고딕"/>
+                <w:b w:val="0"/>
+                <w:sz w:val="17"/>
+              </w:rPr>
+              <w:t>2</w:t>
+            </w:r>
+          </w:p>
+        </w:tc>
+        <w:tc>
+          <w:tcPr>
+            <w:tcW w:type="dxa" w:w="1361"/>
+          </w:tcPr>
+          <w:p>
+            <w:pPr>
+              <w:spacing w:after="0" w:line="264" w:lineRule="auto"/>
+              <w:jc w:val="center"/>
+            </w:pPr>
+            <w:r>
+              <w:rPr>
+                <w:rFonts w:ascii="맑은 고딕" w:hAnsi="맑은 고딕" w:eastAsia="맑은 고딕" w:cs="맑은 고딕"/>
+                <w:b w:val="0"/>
+                <w:sz w:val="17"/>
+              </w:rPr>
+              <w:t>0</w:t>
+            </w:r>
+          </w:p>
+        </w:tc>
+        <w:tc>
+          <w:tcPr>
+            <w:tcW w:type="dxa" w:w="2041"/>
+          </w:tcPr>
+          <w:p>
+            <w:pPr>
+              <w:spacing w:after="0" w:line="264" w:lineRule="auto"/>
+              <w:jc w:val="center"/>
+            </w:pPr>
+            <w:r>
+              <w:rPr>
+                <w:rFonts w:ascii="맑은 고딕" w:hAnsi="맑은 고딕" w:eastAsia="맑은 고딕" w:cs="맑은 고딕"/>
+                <w:b w:val="0"/>
+                <w:sz w:val="17"/>
+              </w:rPr>
+              <w:t>0</w:t>
+            </w:r>
+          </w:p>
+        </w:tc>
+      </w:tr>
+    </w:tbl>
+    <w:p>
+      <w:pPr>
+        <w:spacing w:after="40"/>
+      </w:pPr>
+    </w:p>
+    <w:p>
+      <w:pPr>
+        <w:pStyle w:val="ListBullet"/>
+        <w:spacing w:after="40"/>
+      </w:pPr>
+      <w:r>
+        <w:rPr>
+          <w:rFonts w:ascii="맑은 고딕" w:hAnsi="맑은 고딕" w:eastAsia="맑은 고딕" w:cs="맑은 고딕"/>
+          <w:b/>
+          <w:sz w:val="20"/>
+        </w:rPr>
+        <w:t>후보 검색(순위) 실패가 관찰된 유일한 유형이다.</w:t>
+      </w:r>
+      <w:r>
+        <w:rPr>
+          <w:rFonts w:ascii="맑은 고딕" w:hAnsi="맑은 고딕" w:eastAsia="맑은 고딕" w:cs="맑은 고딕"/>
+          <w:b w:val="0"/>
+          <w:sz w:val="20"/>
+        </w:rPr>
+        <w:t xml:space="preserve"> 정답 청크가 상위 3개 밖이면 판정 LLM이 정답을 볼 수 없다. Agent(C)가 놓친 두 문항(틀린 장면을 "찾음"으로 응답한 1건, 못 찾은 화자 질문 1건)은 첫 검색 기준으로 정답 청크가 각각 10위, 18위였다. 후보를 3개로 제한한 설계가 이 두 문항에서는 판정 이전 단계의 한계로 작용했다. 상위 20개까지 넓히면 정답 청크가 포함되는 문항이 원문 17/18, Router 검색어 18/18이다.</w:t>
+      </w:r>
+    </w:p>
+    <w:p>
+      <w:pPr>
+        <w:pStyle w:val="ListBullet"/>
+        <w:spacing w:after="40"/>
+      </w:pPr>
+      <w:r>
+        <w:rPr>
+          <w:rFonts w:ascii="맑은 고딕" w:hAnsi="맑은 고딕" w:eastAsia="맑은 고딕" w:cs="맑은 고딕"/>
+          <w:b/>
+          <w:sz w:val="20"/>
+        </w:rPr>
+        <w:t>대표 시점 선택 실패는 이 점검에서 0건</w:t>
+      </w:r>
+      <w:r>
+        <w:rPr>
+          <w:rFonts w:ascii="맑은 고딕" w:hAnsi="맑은 고딕" w:eastAsia="맑은 고딕" w:cs="맑은 고딕"/>
+          <w:b w:val="0"/>
+          <w:sz w:val="20"/>
+        </w:rPr>
+        <w:t>이었다. 정답 청크가 상위 3개 안일 때 고른 cue는 모두 정답 ±10초 안이었다. 다만 ±10초 허용 범위가 넓은 편이고 18문항이라, 선택 정확도가 높다고 일반화할 수는 없다.</w:t>
+      </w:r>
+    </w:p>
+    <w:p>
+      <w:pPr>
+        <w:pStyle w:val="ListBullet"/>
+        <w:spacing w:after="40"/>
+      </w:pPr>
+      <w:r>
+        <w:rPr>
+          <w:rFonts w:ascii="맑은 고딕" w:hAnsi="맑은 고딕" w:eastAsia="맑은 고딕" w:cs="맑은 고딕"/>
+          <w:b/>
+          <w:sz w:val="20"/>
+        </w:rPr>
+        <w:t>의미 판정 실패는 별도로 측정하지 못했다.</w:t>
+      </w:r>
+      <w:r>
+        <w:rPr>
+          <w:rFonts w:ascii="맑은 고딕" w:hAnsi="맑은 고딕" w:eastAsia="맑은 고딕" w:cs="맑은 고딕"/>
+          <w:b w:val="0"/>
+          <w:sz w:val="20"/>
+        </w:rPr>
+        <w:t xml:space="preserve"> 정답 후보가 최종 3개 안에 있는데 판정이 놓친 사례는 평가셋에서 없었다(C의 상위 3개 적중과 1위 적중이 모두 16). 틀린 장면을 "찾음"으로 응답한 1건은 정답 후보가 첫 라운드 후보에 없던 상태에서 비슷한 다른 후보를 승인한 경우이므로, 후보 검색 실패와 의미 판정의 승인이 함께 작용했다고 본다. 어느 쪽이 결정적인지는 이 점검으로 가를 수 없다. 재검색 라운드에서 후보가 바뀔 수 있다는 점도 이 점검에는 반영되지 않았다.</w:t>
       </w:r>
     </w:p>
     <w:p>
@@ -8354,7 +9470,45 @@
           <w:b w:val="0"/>
           <w:sz w:val="20"/>
         </w:rPr>
-        <w:t>영상과 음성은 분석하지 않는다. 입력은 영어 번역 자막과 일부 영상 정보뿐이고 화자는 알 수 없다. 정답 시각은 영상마다 3곳을 표본 확인한 것이며 전수 검증이 아니다.</w:t>
+        <w:t>영상과 음성은 분석하지 않는다. 입력은 영어 번역 자막과 일부 영상 정보뿐이고 화자는 알 수 없다.</w:t>
+      </w:r>
+    </w:p>
+    <w:p>
+      <w:pPr>
+        <w:pStyle w:val="ListBullet"/>
+        <w:spacing w:after="40"/>
+      </w:pPr>
+      <w:r>
+        <w:rPr>
+          <w:rFonts w:ascii="맑은 고딕" w:hAnsi="맑은 고딕" w:eastAsia="맑은 고딕" w:cs="맑은 고딕"/>
+          <w:b/>
+          <w:sz w:val="20"/>
+        </w:rPr>
+        <w:t>정답 라벨의 근거와 확인 범위</w:t>
+      </w:r>
+      <w:r>
+        <w:rPr>
+          <w:rFonts w:ascii="맑은 고딕" w:hAnsi="맑은 고딕" w:eastAsia="맑은 고딕" w:cs="맑은 고딕"/>
+          <w:b w:val="0"/>
+          <w:sz w:val="20"/>
+        </w:rPr>
+        <w:t xml:space="preserve">: gold의 정답 구간은 어시스턴트가 원본 cue를 검토해 제안했고 사용자가 20문항을 승인한 것이다(영상 화면을 문항마다 직접 확인한 것이 아니다). 영상 화면과의 대조는 </w:t>
+      </w:r>
+      <w:r>
+        <w:rPr>
+          <w:rFonts w:ascii="맑은 고딕" w:hAnsi="맑은 고딕" w:eastAsia="맑은 고딕" w:cs="맑은 고딕"/>
+          <w:b/>
+          <w:sz w:val="20"/>
+        </w:rPr>
+        <w:t>영상마다 3곳, 모두 9곳</w:t>
+      </w:r>
+      <w:r>
+        <w:rPr>
+          <w:rFonts w:ascii="맑은 고딕" w:hAnsi="맑은 고딕" w:eastAsia="맑은 고딕" w:cs="맑은 고딕"/>
+          <w:b w:val="0"/>
+          <w:sz w:val="20"/>
+        </w:rPr>
+        <w:t>의 표본 확인으로, 자막 시각이 영상과 어긋나지 않는지 보는 시각 동기화 점검이다. 정답 구간 전수 검증이 아니다.</w:t>
       </w:r>
     </w:p>
     <w:p>
@@ -8571,7 +9725,7 @@
           <w:color w:val="3C3C3C"/>
           <w:sz w:val="18"/>
         </w:rPr>
-        <w:t>표 14. 이후 개선 포인트</w:t>
+        <w:t>표 16. 이후 개선 포인트</w:t>
       </w:r>
     </w:p>
     <w:tbl>
@@ -8993,7 +10147,7 @@
                 <w:b w:val="0"/>
                 <w:sz w:val="17"/>
               </w:rPr>
-              <w:t>LangSmith에 MCP 도구 호출도 기록한다. 화면용 조회(앞뒤 자막, 영상 정보)를 MCP 도구에서 API로 옮겨 도구 구성을 정리한다.</w:t>
+              <w:t>LangSmith에 MCP 도구 호출도 기록한다. 화면용 조회(앞뒤 자막, 영상 정보)를 Agent용 도구와 분리하는 방안을 검토한다. 현재는 "자막 데이터는 MCP 서버만 읽는다"는 단일 소유자 원칙 때문에 API 서버도 MCP를 거치므로, 조회를 API로 옮기려면 API가 자막을 읽을 수 있는 별도의 읽기 전용 조회 계층이 필요하고 이 원칙을 바꿀지 먼저 정해야 한다.</w:t>
             </w:r>
           </w:p>
         </w:tc>
@@ -9629,7 +10783,7 @@
           <w:color w:val="3C3C3C"/>
           <w:sz w:val="18"/>
         </w:rPr>
-        <w:t>표 15. 실행·재현</w:t>
+        <w:t>표 17. 실행·재현</w:t>
       </w:r>
     </w:p>
     <w:tbl>
@@ -9940,6 +11094,392 @@
                 <w:sz w:val="17"/>
               </w:rPr>
               <w:t>원본 자막, 정답 평가셋, 질문별 결과, 검색 인덱스, .env는 Git에 올리지 않는다(eval/private/, data/raw/). 제삼자는 같은 자막 결과를 재현할 수 없고, 합성 자막 기반 테스트로 경로와 지표를 확인한다.</w:t>
+            </w:r>
+          </w:p>
+        </w:tc>
+      </w:tr>
+    </w:tbl>
+    <w:p>
+      <w:pPr>
+        <w:spacing w:after="40"/>
+      </w:pPr>
+    </w:p>
+    <w:p>
+      <w:pPr>
+        <w:pStyle w:val="Heading3"/>
+      </w:pPr>
+      <w:r>
+        <w:rPr>
+          <w:rFonts w:ascii="맑은 고딕" w:hAnsi="맑은 고딕" w:eastAsia="맑은 고딕" w:cs="맑은 고딕"/>
+          <w:b/>
+        </w:rPr>
+        <w:t>측정 환경과 재현 정보</w:t>
+      </w:r>
+    </w:p>
+    <w:p>
+      <w:pPr>
+        <w:keepNext/>
+        <w:spacing w:after="40"/>
+      </w:pPr>
+      <w:r>
+        <w:rPr>
+          <w:rFonts w:ascii="맑은 고딕" w:hAnsi="맑은 고딕" w:eastAsia="맑은 고딕" w:cs="맑은 고딕"/>
+          <w:b/>
+          <w:color w:val="3C3C3C"/>
+          <w:sz w:val="18"/>
+        </w:rPr>
+        <w:t>표 18. 측정 환경과 재현 정보</w:t>
+      </w:r>
+    </w:p>
+    <w:tbl>
+      <w:tblPr>
+        <w:tblStyle w:val="TableGrid"/>
+        <w:tblW w:type="auto" w:w="0"/>
+        <w:jc w:val="center"/>
+        <w:tblLayout w:type="fixed"/>
+        <w:tblLook w:firstColumn="1" w:firstRow="1" w:lastColumn="0" w:lastRow="0" w:noHBand="0" w:noVBand="1" w:val="04A0"/>
+        <w:tblCellMar>
+          <w:top w:w="50" w:type="dxa"/>
+          <w:left w:w="90" w:type="dxa"/>
+          <w:bottom w:w="50" w:type="dxa"/>
+          <w:right w:w="90" w:type="dxa"/>
+        </w:tblCellMar>
+      </w:tblPr>
+      <w:tblGrid>
+        <w:gridCol w:w="4819"/>
+        <w:gridCol w:w="4819"/>
+      </w:tblGrid>
+      <w:tr>
+        <w:trPr>
+          <w:cantSplit/>
+          <w:tblHeader/>
+        </w:trPr>
+        <w:tc>
+          <w:tcPr>
+            <w:tcW w:type="dxa" w:w="1814"/>
+            <w:shd w:val="clear" w:color="auto" w:fill="D9E2F3"/>
+          </w:tcPr>
+          <w:p>
+            <w:pPr>
+              <w:keepNext/>
+              <w:spacing w:after="0" w:line="264" w:lineRule="auto"/>
+              <w:jc w:val="center"/>
+            </w:pPr>
+            <w:r>
+              <w:rPr>
+                <w:rFonts w:ascii="맑은 고딕" w:hAnsi="맑은 고딕" w:eastAsia="맑은 고딕" w:cs="맑은 고딕"/>
+                <w:b/>
+                <w:sz w:val="17"/>
+              </w:rPr>
+              <w:t>항목</w:t>
+            </w:r>
+          </w:p>
+        </w:tc>
+        <w:tc>
+          <w:tcPr>
+            <w:tcW w:type="dxa" w:w="7824"/>
+            <w:shd w:val="clear" w:color="auto" w:fill="D9E2F3"/>
+          </w:tcPr>
+          <w:p>
+            <w:pPr>
+              <w:keepNext/>
+              <w:spacing w:after="0" w:line="264" w:lineRule="auto"/>
+              <w:jc w:val="center"/>
+            </w:pPr>
+            <w:r>
+              <w:rPr>
+                <w:rFonts w:ascii="맑은 고딕" w:hAnsi="맑은 고딕" w:eastAsia="맑은 고딕" w:cs="맑은 고딕"/>
+                <w:b/>
+                <w:sz w:val="17"/>
+              </w:rPr>
+              <w:t>내용</w:t>
+            </w:r>
+          </w:p>
+        </w:tc>
+      </w:tr>
+      <w:tr>
+        <w:trPr>
+          <w:cantSplit/>
+        </w:trPr>
+        <w:tc>
+          <w:tcPr>
+            <w:tcW w:type="dxa" w:w="1814"/>
+          </w:tcPr>
+          <w:p>
+            <w:pPr>
+              <w:spacing w:after="0" w:line="264" w:lineRule="auto"/>
+            </w:pPr>
+            <w:r>
+              <w:rPr>
+                <w:rFonts w:ascii="맑은 고딕" w:hAnsi="맑은 고딕" w:eastAsia="맑은 고딕" w:cs="맑은 고딕"/>
+                <w:b w:val="0"/>
+                <w:sz w:val="17"/>
+              </w:rPr>
+              <w:t>측정 코드</w:t>
+            </w:r>
+          </w:p>
+        </w:tc>
+        <w:tc>
+          <w:tcPr>
+            <w:tcW w:type="dxa" w:w="7824"/>
+          </w:tcPr>
+          <w:p>
+            <w:pPr>
+              <w:spacing w:after="0" w:line="264" w:lineRule="auto"/>
+            </w:pPr>
+            <w:r>
+              <w:rPr>
+                <w:rFonts w:ascii="맑은 고딕" w:hAnsi="맑은 고딕" w:eastAsia="맑은 고딕" w:cs="맑은 고딕"/>
+                <w:b w:val="0"/>
+                <w:sz w:val="17"/>
+              </w:rPr>
+              <w:t>2026-10-22 재측정(3.4절 재측정, 부록 D·E): main 커밋 a9a8169. v2·v3 실행(3.2·3.3절)은 결과 파일의 생성 시각(2026-10-21 15:13, 16:19 KST)만 있고 실행 당시 커밋은 기록하지 않았다.</w:t>
+            </w:r>
+          </w:p>
+        </w:tc>
+      </w:tr>
+      <w:tr>
+        <w:trPr>
+          <w:cantSplit/>
+        </w:trPr>
+        <w:tc>
+          <w:tcPr>
+            <w:tcW w:type="dxa" w:w="1814"/>
+          </w:tcPr>
+          <w:p>
+            <w:pPr>
+              <w:spacing w:after="0" w:line="264" w:lineRule="auto"/>
+            </w:pPr>
+            <w:r>
+              <w:rPr>
+                <w:rFonts w:ascii="맑은 고딕" w:hAnsi="맑은 고딕" w:eastAsia="맑은 고딕" w:cs="맑은 고딕"/>
+                <w:b w:val="0"/>
+                <w:sz w:val="17"/>
+              </w:rPr>
+              <w:t>실행 장비</w:t>
+            </w:r>
+          </w:p>
+        </w:tc>
+        <w:tc>
+          <w:tcPr>
+            <w:tcW w:type="dxa" w:w="7824"/>
+          </w:tcPr>
+          <w:p>
+            <w:pPr>
+              <w:spacing w:after="0" w:line="264" w:lineRule="auto"/>
+            </w:pPr>
+            <w:r>
+              <w:rPr>
+                <w:rFonts w:ascii="맑은 고딕" w:hAnsi="맑은 고딕" w:eastAsia="맑은 고딕" w:cs="맑은 고딕"/>
+                <w:b w:val="0"/>
+                <w:sz w:val="17"/>
+              </w:rPr>
+              <w:t>재측정: Apple M5, 메모리 16GB, macOS 26.6.2, Python 3.11.15, CPU 추론(GPU 미사용). v2·v3 실행 장비는 결과 파일에 기록이 없다.</w:t>
+            </w:r>
+          </w:p>
+        </w:tc>
+      </w:tr>
+      <w:tr>
+        <w:trPr>
+          <w:cantSplit/>
+        </w:trPr>
+        <w:tc>
+          <w:tcPr>
+            <w:tcW w:type="dxa" w:w="1814"/>
+          </w:tcPr>
+          <w:p>
+            <w:pPr>
+              <w:spacing w:after="0" w:line="264" w:lineRule="auto"/>
+            </w:pPr>
+            <w:r>
+              <w:rPr>
+                <w:rFonts w:ascii="맑은 고딕" w:hAnsi="맑은 고딕" w:eastAsia="맑은 고딕" w:cs="맑은 고딕"/>
+                <w:b w:val="0"/>
+                <w:sz w:val="17"/>
+              </w:rPr>
+              <w:t>모델·라이브러리</w:t>
+            </w:r>
+          </w:p>
+        </w:tc>
+        <w:tc>
+          <w:tcPr>
+            <w:tcW w:type="dxa" w:w="7824"/>
+          </w:tcPr>
+          <w:p>
+            <w:pPr>
+              <w:spacing w:after="0" w:line="264" w:lineRule="auto"/>
+            </w:pPr>
+            <w:r>
+              <w:rPr>
+                <w:rFonts w:ascii="맑은 고딕" w:hAnsi="맑은 고딕" w:eastAsia="맑은 고딕" w:cs="맑은 고딕"/>
+                <w:b w:val="0"/>
+                <w:sz w:val="17"/>
+              </w:rPr>
+              <w:t>LLM: gpt-4o-mini(분류·검색어 재작성), gpt-4o(판정), temperature 0, seed 42. 임베딩: BAAI/bge-m3(로컬 캐시만 사용, 다운로드 차단), 정규화 임베딩 간 내적(코사인 유사도)으로 유사도 계산, 배치 8. BM25: rank-bm25 0.2.2의 BM25Plus. sentence-transformers 6.1.0, LangGraph 1.2.16, MCP SDK 2.3.0, FastAPI 0.150.0.</w:t>
+            </w:r>
+          </w:p>
+        </w:tc>
+      </w:tr>
+      <w:tr>
+        <w:trPr>
+          <w:cantSplit/>
+        </w:trPr>
+        <w:tc>
+          <w:tcPr>
+            <w:tcW w:type="dxa" w:w="1814"/>
+          </w:tcPr>
+          <w:p>
+            <w:pPr>
+              <w:spacing w:after="0" w:line="264" w:lineRule="auto"/>
+            </w:pPr>
+            <w:r>
+              <w:rPr>
+                <w:rFonts w:ascii="맑은 고딕" w:hAnsi="맑은 고딕" w:eastAsia="맑은 고딕" w:cs="맑은 고딕"/>
+                <w:b w:val="0"/>
+                <w:sz w:val="17"/>
+              </w:rPr>
+              <w:t>시간 제한·재시도</w:t>
+            </w:r>
+          </w:p>
+        </w:tc>
+        <w:tc>
+          <w:tcPr>
+            <w:tcW w:type="dxa" w:w="7824"/>
+          </w:tcPr>
+          <w:p>
+            <w:pPr>
+              <w:spacing w:after="0" w:line="264" w:lineRule="auto"/>
+            </w:pPr>
+            <w:r>
+              <w:rPr>
+                <w:rFonts w:ascii="맑은 고딕" w:hAnsi="맑은 고딕" w:eastAsia="맑은 고딕" w:cs="맑은 고딕"/>
+                <w:b w:val="0"/>
+                <w:sz w:val="17"/>
+              </w:rPr>
+              <w:t>요청 전체 60초, LLM 호출 1회 20초(초과 시 model_timeout), 재검색은 남은 시간이 25초 이상일 때만, 재검색 최대 2회. 모델·도구 호출의 자동 재시도는 없고 오류는 안전한 오류 코드나 부분 결과로 처리한다. 검색은 동시에 1건만 실행한다.</w:t>
+            </w:r>
+          </w:p>
+        </w:tc>
+      </w:tr>
+      <w:tr>
+        <w:trPr>
+          <w:cantSplit/>
+        </w:trPr>
+        <w:tc>
+          <w:tcPr>
+            <w:tcW w:type="dxa" w:w="1814"/>
+          </w:tcPr>
+          <w:p>
+            <w:pPr>
+              <w:spacing w:after="0" w:line="264" w:lineRule="auto"/>
+            </w:pPr>
+            <w:r>
+              <w:rPr>
+                <w:rFonts w:ascii="맑은 고딕" w:hAnsi="맑은 고딕" w:eastAsia="맑은 고딕" w:cs="맑은 고딕"/>
+                <w:b w:val="0"/>
+                <w:sz w:val="17"/>
+              </w:rPr>
+              <w:t>인덱스</w:t>
+            </w:r>
+          </w:p>
+        </w:tc>
+        <w:tc>
+          <w:tcPr>
+            <w:tcW w:type="dxa" w:w="7824"/>
+          </w:tcPr>
+          <w:p>
+            <w:pPr>
+              <w:spacing w:after="0" w:line="264" w:lineRule="auto"/>
+            </w:pPr>
+            <w:r>
+              <w:rPr>
+                <w:rFonts w:ascii="맑은 고딕" w:hAnsi="맑은 고딕" w:eastAsia="맑은 고딕" w:cs="맑은 고딕"/>
+                <w:b w:val="0"/>
+                <w:sz w:val="17"/>
+              </w:rPr>
+              <w:t>청크별 임베딩을 미리 계산해 data/index/에 저장해 두고(처음 만들 때 CPU에서 약 200초) 서버 시작 때 불러온다. 청크 설정이 바뀌면 새로 만든다.</w:t>
+            </w:r>
+          </w:p>
+        </w:tc>
+      </w:tr>
+      <w:tr>
+        <w:trPr>
+          <w:cantSplit/>
+        </w:trPr>
+        <w:tc>
+          <w:tcPr>
+            <w:tcW w:type="dxa" w:w="1814"/>
+          </w:tcPr>
+          <w:p>
+            <w:pPr>
+              <w:spacing w:after="0" w:line="264" w:lineRule="auto"/>
+            </w:pPr>
+            <w:r>
+              <w:rPr>
+                <w:rFonts w:ascii="맑은 고딕" w:hAnsi="맑은 고딕" w:eastAsia="맑은 고딕" w:cs="맑은 고딕"/>
+                <w:b w:val="0"/>
+                <w:sz w:val="17"/>
+              </w:rPr>
+              <w:t>자막 데이터</w:t>
+            </w:r>
+          </w:p>
+        </w:tc>
+        <w:tc>
+          <w:tcPr>
+            <w:tcW w:type="dxa" w:w="7824"/>
+          </w:tcPr>
+          <w:p>
+            <w:pPr>
+              <w:spacing w:after="0" w:line="264" w:lineRule="auto"/>
+            </w:pPr>
+            <w:r>
+              <w:rPr>
+                <w:rFonts w:ascii="맑은 고딕" w:hAnsi="맑은 고딕" w:eastAsia="맑은 고딕" w:cs="맑은 고딕"/>
+                <w:b w:val="0"/>
+                <w:sz w:val="17"/>
+              </w:rPr>
+              <w:t>NCT WISH 영상 3편, 영어 SRT, 모두 3,750 cue. 자막 마지막 cue 종료 시각 기준 길이와 cue 수: 캠핑 편 49분 25초·1,558 cue, 홋카이도 편 1시간 1분 23초·1,534 cue, 하우스 편 35분 23초·658 cue(영상 실제 길이와는 다를 수 있다). 사용자가 Wave YouTube Transcript 도구에 영상 URL을 입력해 SRT를 추출했다. 원본은 공개하지 않는다.</w:t>
+            </w:r>
+          </w:p>
+        </w:tc>
+      </w:tr>
+      <w:tr>
+        <w:trPr>
+          <w:cantSplit/>
+        </w:trPr>
+        <w:tc>
+          <w:tcPr>
+            <w:tcW w:type="dxa" w:w="1814"/>
+          </w:tcPr>
+          <w:p>
+            <w:pPr>
+              <w:spacing w:after="0" w:line="264" w:lineRule="auto"/>
+            </w:pPr>
+            <w:r>
+              <w:rPr>
+                <w:rFonts w:ascii="맑은 고딕" w:hAnsi="맑은 고딕" w:eastAsia="맑은 고딕" w:cs="맑은 고딕"/>
+                <w:b w:val="0"/>
+                <w:sz w:val="17"/>
+              </w:rPr>
+              <w:t>결과표와 실행 연결</w:t>
+            </w:r>
+          </w:p>
+        </w:tc>
+        <w:tc>
+          <w:tcPr>
+            <w:tcW w:type="dxa" w:w="7824"/>
+          </w:tcPr>
+          <w:p>
+            <w:pPr>
+              <w:spacing w:after="0" w:line="264" w:lineRule="auto"/>
+            </w:pPr>
+            <w:r>
+              <w:rPr>
+                <w:rFonts w:ascii="맑은 고딕" w:hAnsi="맑은 고딕" w:eastAsia="맑은 고딕" w:cs="맑은 고딕"/>
+                <w:b w:val="0"/>
+                <w:sz w:val="17"/>
+              </w:rPr>
+              <w:t>3.2절 v2: day2-abc-gold-openai-v2.json, v3: day2-abc-gold-openai-v3.json. 3.3절 표: v3 실행. 3.4절 재측정과 부록 D: day3-dual-off.json, day3-dual-on.json. 4.2절 실패 유형 점검: 로컬 검색 점검(별도 결과 파일 없음). 부록 E: chunk-10-5.json, chunk-20-10.json, chunk-30-15.json, chunk-40-20.json. 모든 결과 파일은 비공개(eval/private/)이며, gold는 gold_sha256 d9819d48…로 승인 확인을 거친다.</w:t>
             </w:r>
           </w:p>
         </w:tc>
@@ -9974,7 +11514,7 @@
           <w:color w:val="3C3C3C"/>
           <w:sz w:val="18"/>
         </w:rPr>
-        <w:t>표 16. ADR 목록 (docs/adr/)</w:t>
+        <w:t>표 19. ADR 목록 (docs/adr/)</w:t>
       </w:r>
     </w:p>
     <w:tbl>
@@ -10519,7 +12059,7 @@
           <w:b w:val="0"/>
           <w:sz w:val="19"/>
         </w:rPr>
-        <w:t>평가에 쓴 정답 평가셋 20문항의 구성은 3.1절과 같다(장면 질문 18: 일반 13, 같은 말을 하는 장면이 여러 개인 질문 1, 화자 질문 4 / 자막으로 알 수 없는 요청 2). 질문과 정답 시점은 평가셋 노출을 피하려고 공개 저장소와 이 보고서에 싣지 않고, 아래에는 문항별 결과만 적었다.</w:t>
+        <w:t>평가에 쓴 정답 평가셋 20문항의 구성은 3.1절과 같다(장면 질문 18: 일반 13, 같은 말을 하는 장면이 여러 개인 질문 1, 화자 질문 4 / 자막으로 알 수 없는 요청 2). 질문과 정답 시점은 평가셋을 공개하지 않기 위해 싣지 않았다.</w:t>
       </w:r>
     </w:p>
     <w:p>
@@ -10534,7 +12074,7 @@
           <w:color w:val="3C3C3C"/>
           <w:sz w:val="18"/>
         </w:rPr>
-        <w:t>표 17. 정답 평가셋 문항별 결과 (OpenAI, 질문당 1회 실행, 질문 원문과 정답 시점은 싣지 않음)</w:t>
+        <w:t>표 20. 정답 평가셋 문항별 결과 (OpenAI, 질문당 1회 실행)</w:t>
       </w:r>
     </w:p>
     <w:tbl>
@@ -12642,7 +14182,7 @@
           <w:b w:val="0"/>
           <w:sz w:val="18"/>
         </w:rPr>
-        <w:t>표는 2026-10-22에 같은 평가셋으로 이중 첫 검색을 끈 실행과 켠 실행의 문항별 결과이며, 두 실행의 C 결과는 문항별로 모두 같았다. B는 질문 원문을 그대로 검색한 값이고, 화자 질문 행의 "적중"은 관련 장면을 1위로 냈다는 뜻일 뿐 화자를 확인했다는 뜻이 아니다.</w:t>
+        <w:t>C는 이중 첫 검색을 끈 실행과 켠 실행의 결과가 문항별로 모두 같았다. B는 질문 원문을 그대로 검색한 값이다. 화자 질문 행의 "적중"은 관련 장면을 1위로 냈다는 뜻일 뿐 화자를 확인했다는 뜻이 아니다.</w:t>
       </w:r>
     </w:p>
     <w:p>
@@ -12684,7 +14224,7 @@
           <w:color w:val="3C3C3C"/>
           <w:sz w:val="18"/>
         </w:rPr>
-        <w:t>표 18. 청크 길이별 B(Hybrid) 비교 (OpenAI 없음, 질문당 1회, 한국어 원문 조건)</w:t>
+        <w:t>표 21. 청크 길이별 B(Hybrid) 비교 (OpenAI 없음, 질문당 1회, 한국어 원문 조건)</w:t>
       </w:r>
     </w:p>
     <w:tbl>

</xml_diff>